<commit_message>
Shared re-report decision, Rubric sample check, presentation notes, final report
- D50: re-report (origin family) decided once per document from title+URL, shared by all perspectives;
  conservative merge; LLM rubric scores matched by key/Korean name
- docs/RUBRIC_CHECK.md (scripts/rubric_check.py): 12/12 sampled criteria match C.6; human check left as TODO
- docs/PRESENTATION_NOTES.md: 10-minute flow
- regenerated caches, report (.md/.docx/.pdf) and state snapshot
</commit_message>
<xml_diff>
--- a/outputs/RAG-Output_판교_9반_김정인+김지수+김진수+전진만+정원준.docx
+++ b/outputs/RAG-Output_판교_9반_김정인+김지수+김진수+전진만+정원준.docx
@@ -995,7 +995,7 @@
                 <w:b w:val="0"/>
                 <w:sz w:val="17"/>
               </w:rPr>
-              <w:t>5.1 관점 간 일치·상충 표 (10) · 5.2 주요 상충 지점 (10) · 5.3 가설 판정 (10) · 5.4 조건별 시사점(추천 아님) (10) · 5.5 기준값 민감도 점검 (11)</w:t>
+              <w:t>5.1 관점 간 일치·상충 표 (11) · 5.2 주요 상충 지점 (11) · 5.3 가설 판정 (11) · 5.4 조건별 시사점(추천 아님) (11) · 5.5 기준값 민감도 점검 (12)</w:t>
             </w:r>
           </w:p>
         </w:tc>
@@ -1020,7 +1020,7 @@
                 <w:b w:val="0"/>
                 <w:sz w:val="17"/>
               </w:rPr>
-              <w:t>10</w:t>
+              <w:t>11</w:t>
             </w:r>
           </w:p>
         </w:tc>
@@ -1076,7 +1076,7 @@
                 <w:b w:val="0"/>
                 <w:sz w:val="17"/>
               </w:rPr>
-              <w:t>6.1 공개 정보 기반 추정의 한계 (12) · 6.2 확증편향 방지 조치와 실행 결과 (12) · 6.3 분석 방법의 한계 (12)</w:t>
+              <w:t>6.1 공개 정보 기반 추정의 한계 (13) · 6.2 확증편향 방지 조치와 실행 결과 (13) · 6.3 분석 방법의 한계 (13)</w:t>
             </w:r>
           </w:p>
         </w:tc>
@@ -1101,7 +1101,7 @@
                 <w:b w:val="0"/>
                 <w:sz w:val="17"/>
               </w:rPr>
-              <w:t>12</w:t>
+              <w:t>13</w:t>
             </w:r>
           </w:p>
         </w:tc>
@@ -1171,7 +1171,7 @@
                 <w:b w:val="0"/>
                 <w:sz w:val="17"/>
               </w:rPr>
-              <w:t>14</w:t>
+              <w:t>15</w:t>
             </w:r>
           </w:p>
         </w:tc>
@@ -1223,7 +1223,7 @@
           <w:b w:val="0"/>
           <w:sz w:val="20"/>
         </w:rPr>
-        <w:t>TurboQuant: TRL 5–7(추정, 신뢰도 높음), 시장성 판단 보류, 이해관계자 5.00, 도메인 적합성 4.60 [3; 4]</w:t>
+        <w:t>TurboQuant: TRL 5–7(추정, 신뢰도 높음), 시장성 판단 보류, 이해관계자 5.00, 도메인 적합성 4.75 [1, p.15; 3]</w:t>
       </w:r>
     </w:p>
     <w:p>
@@ -1246,7 +1246,7 @@
           <w:b w:val="0"/>
           <w:sz w:val="20"/>
         </w:rPr>
-        <w:t>ITME: TRL 5–6(추정, 신뢰도 보통), 시장성 판단 보류, 이해관계자 3.50, 도메인 적합성 판단 보류 [1, p.8; 5]</w:t>
+        <w:t>ITME: TRL 5–6(추정, 신뢰도 높음), 시장성 5.00, 이해관계자 4.33, 도메인 적합성 판단 보류 [2, p.8; 4]</w:t>
       </w:r>
     </w:p>
     <w:p>
@@ -1269,7 +1269,7 @@
           <w:b w:val="0"/>
           <w:sz w:val="20"/>
         </w:rPr>
-        <w:t>가설 판정: H1 판단 보류, H2 판단 보류, H3 지지, H4 판단 보류 [1, p.8·10; 6]</w:t>
+        <w:t>가설 판정: H1 부분 지지, H2 지지, H3 판단 보류, H4 판단 보류 [2, p.8·10; 1, p.15]</w:t>
       </w:r>
     </w:p>
     <w:p>
@@ -1292,7 +1292,7 @@
           <w:b w:val="0"/>
           <w:sz w:val="20"/>
         </w:rPr>
-        <w:t>TurboQuant은 TRL 5에서 7 사이로 추정되며, GPU 환경에서 프로덕션 수준 구현과 공식 발표 사례가 존재한다[2, p.15·19; 3; 7; 8; 9; 4].</w:t>
+        <w:t>TurboQuant은 TRL 5에서 7 사이로 실험실 검증부터 시제품 시연 단계까지 근거가 보고되었다[1, p.15·16·19; 5; 6; 3].</w:t>
       </w:r>
     </w:p>
     <w:p>
@@ -1315,7 +1315,7 @@
           <w:b w:val="0"/>
           <w:sz w:val="20"/>
         </w:rPr>
-        <w:t>ITME는 실제 서버와 FPGA 프로토타입을 활용해 TRL 5에서 6 사이로 평가되며, SK hynix의 시스템 시연 근거가 있다[1, p.8·10; 5; 10].</w:t>
+        <w:t>ITME는 TRL 5에서 6 사이로 실제 서버 환경과 FPGA 프로토타입 검증, 시제품 시연 가능성 근거가 존재한다[2, p.8·10; 7; 4].</w:t>
       </w:r>
     </w:p>
     <w:p>
@@ -1387,7 +1387,7 @@
           <w:b w:val="0"/>
           <w:sz w:val="20"/>
         </w:rPr>
-        <w:t>LLM은 토큰을 생성하면서 앞에서 계산한 Key·Value를 KV cache에 저장해 다시 쓰고, 그 크기는 문맥 길이와 동시 요청 수에 비례해 커진다. 두 기술의 원 논문도 이 메모리 병목을 출발점으로 삼는다 [2, p.1; 1, p.1]. Llama-3.1-8B(레이어 32, KV 헤드 8, 헤드 차원 128, FP16) 기준으로 토큰 하나에 128 KiB, 128K 토큰 요청 한 건에 16 GiB가 필요하다(조 계산, 설계서 A.1).</w:t>
+        <w:t>LLM은 토큰을 생성하면서 앞에서 계산한 Key·Value를 KV cache에 저장해 다시 쓰고, 그 크기는 문맥 길이와 동시 요청 수에 비례해 커진다. 두 기술의 원 논문도 이 메모리 병목을 출발점으로 삼는다 [1, p.1; 2, p.1]. Llama-3.1-8B(레이어 32, KV 헤드 8, 헤드 차원 128, FP16) 기준으로 토큰 하나에 128 KiB, 128K 토큰 요청 한 건에 16 GiB가 필요하다(조 계산, 설계서 A.1).</w:t>
       </w:r>
     </w:p>
     <w:p>
@@ -1415,7 +1415,7 @@
           <w:b w:val="0"/>
           <w:sz w:val="20"/>
         </w:rPr>
-        <w:t>SW 진영은 KV를 작게 만들고 HW 진영은 KV를 둘 공간을 넓힌다. TurboQuant는 데이터 표현(비트 수)을 바꾸고 [2, p.1], ITME는 저장 위치(메모리 계층)를 바꾼다 [1, p.1·2]. 두 방식은 계층이 달라 함께 쓰일 수 있으며, 이 가능성은 가설 H4로 검증한다.</w:t>
+        <w:t>SW 진영은 KV를 작게 만들고 HW 진영은 KV를 둘 공간을 넓힌다. TurboQuant는 데이터 표현(비트 수)을 바꾸고 [1, p.1], ITME는 저장 위치(메모리 계층)를 바꾼다 [2, p.1·2]. 두 방식은 계층이 달라 함께 쓰일 수 있으며, 이 가능성은 가설 H4로 검증한다.</w:t>
       </w:r>
     </w:p>
     <w:p>
@@ -3352,7 +3352,7 @@
           <w:b w:val="0"/>
           <w:sz w:val="20"/>
         </w:rPr>
-        <w:t xml:space="preserve"> (Google, SW): 후보 6개 가중합 SW 최고점(4.35). 재학습 없이 서빙 단계에서 KV를 양자화한다 [2, p.1]</w:t>
+        <w:t xml:space="preserve"> (Google, SW): 후보 6개 가중합 SW 최고점(4.35). 재학습 없이 서빙 단계에서 KV를 양자화한다 [1, p.1]</w:t>
       </w:r>
     </w:p>
     <w:p>
@@ -3384,7 +3384,7 @@
           <w:b w:val="0"/>
           <w:sz w:val="20"/>
         </w:rPr>
-        <w:t xml:space="preserve"> (SK hynix, HW): 후보 6개 가중합 HW 최고점(4.50). vLLM 위의 서빙 계층 기술로 모델을 바꾸지 않고 KV 공간을 CXL-hybrid 메모리로 넓힌다 [1, p.1]</w:t>
+        <w:t xml:space="preserve"> (SK hynix, HW): 후보 6개 가중합 HW 최고점(4.50). vLLM 위의 서빙 계층 기술로 모델을 바꾸지 않고 KV 공간을 CXL-hybrid 메모리로 넓힌다 [2, p.1]</w:t>
       </w:r>
     </w:p>
     <w:p>
@@ -3641,7 +3641,7 @@
                 <w:b w:val="0"/>
                 <w:sz w:val="17"/>
               </w:rPr>
-              <w:t>TurboQuant은 KV cache 압축을 위한 양자화 기법으로, LongBench 데이터셋에서 KV cache 용량 문제를 직접 다루고 있음을 명확히 밝히고 있다 [2, p.18].</w:t>
+              <w:t>TurboQuant은 KV cache 압축을 위한 양자화 기법으로, LongBench 데이터셋에서 KV cache 용량 문제를 직접 다루고 있음을 명확히 밝히고 있다 [1, p.18].</w:t>
             </w:r>
           </w:p>
         </w:tc>
@@ -3746,7 +3746,7 @@
                 <w:b w:val="0"/>
                 <w:sz w:val="17"/>
               </w:rPr>
-              <w:t>TurboQuant은 재학습 없이 서빙 단계에서 KV cache를 양자화하여 적용하는 방법임을 명시하고 있으며, 기존 생성 토큰도 양자화하는 실시간 생성 과정에 적용된다 [2, p.18].</w:t>
+              <w:t>TurboQuant은 재학습 없이 서빙 단계에서 KV cache를 양자화하여 적용하는 방법임을 명시하고 있으며, 기존 생성 토큰도 양자화하는 실시간 생성 과정에 적용된다 [1, p.18].</w:t>
             </w:r>
           </w:p>
         </w:tc>
@@ -3851,7 +3851,7 @@
                 <w:b w:val="0"/>
                 <w:sz w:val="17"/>
               </w:rPr>
-              <w:t>LongBench 데이터셋을 포함한 다양한 벤치마크에서 Llama-3.1-8B-Instruct 및 Ministral-7B-Instruct 모델을 대상으로 성능 비교 실험 결과와 수치가 공개되어 TurboQuant의 효과를 검증할 수 있다 [2, p.18].</w:t>
+              <w:t>LongBench 데이터셋을 포함한 다양한 벤치마크에서 Llama-3.1-8B-Instruct 및 Ministral-7B-Instruct 모델을 대상으로 성능 비교 실험 결과와 수치가 공개되어 TurboQuant의 효과를 검증할 수 있다 [1, p.18].</w:t>
             </w:r>
           </w:p>
         </w:tc>
@@ -3956,7 +3956,7 @@
                 <w:b w:val="0"/>
                 <w:sz w:val="17"/>
               </w:rPr>
-              <w:t>ITME는 LLM 추론에서 KV cache 용량 문제를 직접 다루며, CXL-hybrid 메모리를 활용해 KV cache 공간을 확장한다 [1, p.2·11].</w:t>
+              <w:t>ITME는 LLM 추론에서 KV cache 용량 문제를 직접 다루며, CXL-hybrid 메모리를 활용해 KV cache 공간을 확장한다 [2, p.2·11].</w:t>
             </w:r>
           </w:p>
         </w:tc>
@@ -4061,7 +4061,7 @@
                 <w:b w:val="0"/>
                 <w:sz w:val="17"/>
               </w:rPr>
-              <w:t>ITME는 모델 학습 후 추론·서빙 단계에서 KV cache 관리를 위한 메모리 확장 및 프리페칭 기술로, 재학습 없이 적용 가능하다 [1, p.6·11].</w:t>
+              <w:t>ITME는 모델 학습 후 추론·서빙 단계에서 KV cache 관리를 위한 메모리 확장 및 프리페칭 기술로, 재학습 없이 적용 가능하다 [2, p.6·11].</w:t>
             </w:r>
           </w:p>
         </w:tc>
@@ -4162,7 +4162,7 @@
                 <w:b w:val="0"/>
                 <w:sz w:val="17"/>
               </w:rPr>
-              <w:t>ITME는 ShareGPT 데이터셋과 Llama-3.1 모델을 사용해 성능을 평가했으며, 실험 환경과 성능 수치가 논문에 공개되어 있다 [1, p.9·11].</w:t>
+              <w:t>ITME는 ShareGPT 데이터셋과 Llama-3.1 모델을 사용해 성능을 평가했으며, 실험 환경과 성능 수치가 논문에 공개되어 있다 [2, p.9·11].</w:t>
             </w:r>
           </w:p>
         </w:tc>
@@ -4193,7 +4193,7 @@
           <w:b w:val="0"/>
           <w:sz w:val="20"/>
         </w:rPr>
-        <w:t>TurboQuant 약점: TurboQuant의 성능 검증이 LongBench와 일부 데이터셋에 한정되어 있어, 다른 도메인이나 더 다양한 모델에 대한 일반화 가능성은 추가 검증이 필요하다 [2, p.18·19].</w:t>
+        <w:t>TurboQuant 약점: TurboQuant의 성능 검증이 LongBench와 일부 데이터셋에 한정되어 있어, 다른 도메인이나 더 다양한 모델에 대한 일반화 가능성은 추가 검증이 필요하다 [1, p.18·19].</w:t>
       </w:r>
     </w:p>
     <w:p>
@@ -4216,7 +4216,7 @@
           <w:b w:val="0"/>
           <w:sz w:val="20"/>
         </w:rPr>
-        <w:t>TurboQuant 약점: 논문에서 KV cache 양자화 시 발생할 수 있는 잠재적 왜곡이나 지연에 대한 상세 분석이 부족하다 [2, p.18].</w:t>
+        <w:t>TurboQuant 약점: 논문에서 KV cache 양자화 시 발생할 수 있는 잠재적 왜곡이나 지연에 대한 상세 분석이 부족하다 [1, p.18].</w:t>
       </w:r>
     </w:p>
     <w:p>
@@ -4239,7 +4239,7 @@
           <w:b w:val="0"/>
           <w:sz w:val="20"/>
         </w:rPr>
-        <w:t>ITME 약점: 실험은 특정 데이터셋(ShareGPT)과 모델(Llama-3.1)에 한정되어 있어 일반화 가능성에 대한 검증이 부족하다 [1, p.9].</w:t>
+        <w:t>ITME 약점: 실험은 특정 데이터셋(ShareGPT)과 모델(Llama-3.1)에 한정되어 있어 일반화 가능성에 대한 검증이 부족하다 [2, p.9].</w:t>
       </w:r>
     </w:p>
     <w:p>
@@ -4262,7 +4262,7 @@
           <w:b w:val="0"/>
           <w:sz w:val="20"/>
         </w:rPr>
-        <w:t>ITME 약점: NVMe SSD 내부 아키텍처에 따른 I/O 병목 현상 등 하드웨어 의존적 제약이 존재하며, 이로 인한 성능 저하 가능성이 있다 [1, p.6].</w:t>
+        <w:t>ITME 약점: NVMe SSD 내부 아키텍처에 따른 I/O 병목 현상 등 하드웨어 의존적 제약이 존재하며, 이로 인한 성능 저하 가능성이 있다 [2, p.6].</w:t>
       </w:r>
     </w:p>
     <w:p>
@@ -4348,7 +4348,7 @@
           <w:b w:val="0"/>
           <w:sz w:val="20"/>
         </w:rPr>
-        <w:t>: TurboQuant은 고차원 유클리드 벡터를 왜곡률을 최소화하며 양자화하는 벡터 양자화 문제를 다룬다. 입력 벡터를 무작위로 회전시켜 각 좌표가 베타 분포를 따르도록 유도하고, 고차원에서 좌표 간 독립성에 기반해 각 좌표별로 최적의 스칼라 양자화를 적용한다. 또한, MSE 최적 양자화 후 잔차에 1비트 양자화를 적용하는 2단계 과정을 통해 내적 왜곡을 줄이고 편향 없는 추정기를 만든다 [2, p.1·2].</w:t>
+        <w:t>: TurboQuant은 고차원 유클리드 벡터를 왜곡률을 최소화하며 양자화하는 벡터 양자화 문제를 다룬다. 입력 벡터를 무작위로 회전시켜 각 좌표가 베타 분포를 따르도록 유도하고, 고차원에서 좌표 간 독립성에 기반해 각 좌표별로 최적의 스칼라 양자화를 적용한다. 또한, MSE 최적 양자화 후 잔차에 1비트 양자화를 적용하는 2단계 과정을 통해 내적 왜곡을 줄이고 편향 없는 추정기를 만든다 [1, p.1·2].</w:t>
       </w:r>
     </w:p>
     <w:p>
@@ -4380,7 +4380,7 @@
           <w:b w:val="0"/>
           <w:sz w:val="20"/>
         </w:rPr>
-        <w:t>: TurboQuant은 온라인 적용이 가능하며, 특히 키-값 캐시 양자화와 같은 실시간 AI 워크로드에 적합하다. 고차원 벡터의 MSE 및 내적 왜곡률을 모두 최적화하는 데 초점을 맞추며, 대규모 AI 모델 훈련, 배포, 벡터 데이터베이스 검색/검색 시스템 등 다양한 컴퓨팅 도메인에 적용 가능하다 [2, p.1·2].</w:t>
+        <w:t>: TurboQuant은 온라인 적용이 가능하며, 특히 키-값 캐시 양자화와 같은 실시간 AI 워크로드에 적합하다. 고차원 벡터의 MSE 및 내적 왜곡률을 모두 최적화하는 데 초점을 맞추며, 대규모 AI 모델 훈련, 배포, 벡터 데이터베이스 검색/검색 시스템 등 다양한 컴퓨팅 도메인에 적용 가능하다 [1, p.1·2].</w:t>
       </w:r>
     </w:p>
     <w:p>
@@ -4412,7 +4412,7 @@
           <w:b w:val="0"/>
           <w:sz w:val="20"/>
         </w:rPr>
-        <w:t>: 실험은 1536차원 및 3072차원 OpenAI 임베딩, GloVe 임베딩 데이터셋을 사용하였으며, 100,000개 데이터 포인트를 훈련 및 평가에 활용했다. 비교 대상은 Product Quantization(PQ)과 RabitQ이며, PQ는 AVX2 인-레지스터 룩업 테이블(LUT)을 사용해 구현되었고, RabitQ는 GPU 가속이 불가능해 CPU에서 느리게 동작한다. 비트 할당은 다른 방법들과 맞추어 조정되었다 [2, p.19·20].</w:t>
+        <w:t>: 실험은 1536차원 및 3072차원 OpenAI 임베딩, GloVe 임베딩 데이터셋을 사용하였으며, 100,000개 데이터 포인트를 훈련 및 평가에 활용했다. 비교 대상은 Product Quantization(PQ)과 RabitQ이며, PQ는 AVX2 인-레지스터 룩업 테이블(LUT)을 사용해 구현되었고, RabitQ는 GPU 가속이 불가능해 CPU에서 느리게 동작한다. 비트 할당은 다른 방법들과 맞추어 조정되었다 [1, p.19·20].</w:t>
       </w:r>
     </w:p>
     <w:p>
@@ -4444,7 +4444,7 @@
           <w:b w:val="0"/>
           <w:sz w:val="20"/>
         </w:rPr>
-        <w:t>: TurboQuant은 LongBench 데이터셋에서 Llama-3.1-8B-Instruct 및 Ministral-7B-Instruct 모델에 대해 기존 방법들보다 높은 평균 점수를 기록했다. 또한, Needle-In-A-Haystack 테스트에서 TurboQuantprod는 내적 오차 분산이 평균 내적값에 관계없이 일정한 반면, TurboQuantmse는 평균 내적값이 증가함에 따라 오차 분산이 증가하는 특성을 보였다. 근접 이웃 검색 실험에서는 PQ와 RabitQ 대비 경쟁력 있는 성능을 보였다 [2, p.16·18·19].</w:t>
+        <w:t>: TurboQuant은 LongBench 데이터셋에서 Llama-3.1-8B-Instruct 및 Ministral-7B-Instruct 모델에 대해 기존 방법들보다 높은 평균 점수를 기록했다. 또한, Needle-In-A-Haystack 테스트에서 TurboQuantprod는 내적 오차 분산이 평균 내적값에 관계없이 일정한 반면, TurboQuantmse는 평균 내적값이 증가함에 따라 오차 분산이 증가하는 특성을 보였다. 근접 이웃 검색 실험에서는 PQ와 RabitQ 대비 경쟁력 있는 성능을 보였다 [1, p.16·18·19].</w:t>
       </w:r>
     </w:p>
     <w:p>
@@ -4476,7 +4476,7 @@
           <w:b w:val="0"/>
           <w:sz w:val="20"/>
         </w:rPr>
-        <w:t>: TurboQuant은 PQ 대비 일부 설정에서 품질 저하가 관찰되었으며, RabitQ는 GPU 가속이 불가능해 속도 면에서 불리하다. 또한, 논문에서는 비트 폭이 4 이상일 때 Panter-Dite 공식을 적용해 왜곡률을 추정하지만, 고비트 폭에서의 실제 성능과 효율성에 대한 상세한 분석은 부족하다. 일부 실험은 동일 데이터셋을 훈련과 평가에 사용해 PQ가 유리한 조건일 수 있다 [2, p.11·20].</w:t>
+        <w:t>: TurboQuant은 PQ 대비 일부 설정에서 품질 저하가 관찰되었으며, RabitQ는 GPU 가속이 불가능해 속도 면에서 불리하다. 또한, 논문에서는 비트 폭이 4 이상일 때 Panter-Dite 공식을 적용해 왜곡률을 추정하지만, 고비트 폭에서의 실제 성능과 효율성에 대한 상세한 분석은 부족하다. 일부 실험은 동일 데이터셋을 훈련과 평가에 사용해 PQ가 유리한 조건일 수 있다 [1, p.11·20].</w:t>
       </w:r>
     </w:p>
     <w:p>
@@ -4523,7 +4523,7 @@
           <w:b w:val="0"/>
           <w:sz w:val="20"/>
         </w:rPr>
-        <w:t>: ITME는 대규모 언어 모델(LLM) 추론에서 모델 가중치와 키-값(KV) 캐시 데이터를 다계층 메모리 구조를 통해 효율적으로 관리한다. GPU 메모리, 호스트 메모리, NVMe SSD, 클러스터 공유 저장소 등 다양한 메모리 계층을 활용하며, GPU 연산과 원격 CXL-하이브리드 메모리 간 데이터 이동을 비동기적으로 처리하여 GPU 활용도를 극대화한다. 또한, 메타데이터 컨트롤러의 하드웨어 수준 잠금 메커니즘과 읽기 우선 I/O 스케줄링, 사전 페칭 기법을 통해 KV 캐시의 이동과 접근을 최적화한다 [1, p.1·2·4·6].</w:t>
+        <w:t>: ITME는 대규모 언어 모델(LLM) 추론에서 모델 가중치와 키-값(KV) 캐시 데이터를 다계층 메모리 구조를 통해 효율적으로 관리한다. GPU 메모리, 호스트 메모리, NVMe SSD, 클러스터 공유 저장소 등 다양한 메모리 계층을 활용하며, GPU 연산과 원격 CXL-하이브리드 메모리 간 데이터 이동을 비동기적으로 처리하여 GPU 활용도를 극대화한다. 또한, 메타데이터 컨트롤러의 하드웨어 수준 잠금 메커니즘과 읽기 우선 I/O 스케줄링, 사전 페칭 기법을 통해 KV 캐시의 이동과 접근을 최적화한다 [2, p.1·2·4·6].</w:t>
       </w:r>
     </w:p>
     <w:p>
@@ -4555,7 +4555,7 @@
           <w:b w:val="0"/>
           <w:sz w:val="20"/>
         </w:rPr>
-        <w:t>: ITME는 대규모 LLM 추론 시스템에서 모델 가중치와 장기 컨텍스트 KV 캐시 등 대용량, 예측 가능 데이터의 메모리 확장 문제를 해결하기 위해 설계되었다. 특히, agentic AI 워크플로우와 다중 턴 세션에서 지속되는 KV 캐시 관리에 초점을 맞추며, GPU 메모리 한계를 극복하고 다중 계층 메모리 간 데이터 이동을 조율하는 시점에 적용된다 [1, p.1·2].</w:t>
+        <w:t>: ITME는 대규모 LLM 추론 시스템에서 모델 가중치와 장기 컨텍스트 KV 캐시 등 대용량, 예측 가능 데이터의 메모리 확장 문제를 해결하기 위해 설계되었다. 특히, agentic AI 워크플로우와 다중 턴 세션에서 지속되는 KV 캐시 관리에 초점을 맞추며, GPU 메모리 한계를 극복하고 다중 계층 메모리 간 데이터 이동을 조율하는 시점에 적용된다 [2, p.1·2].</w:t>
       </w:r>
     </w:p>
     <w:p>
@@ -4587,7 +4587,7 @@
           <w:b w:val="0"/>
           <w:sz w:val="20"/>
         </w:rPr>
-        <w:t>: ITME는 vLLM 프레임워크 위에 구현되었으며, Llama-3.1 8B 및 70B 모델을 대상으로 ShareGPT 데이터셋에서 128개의 동시 대화, 각 대화당 최소 2000 토큰, 최대 5턴 환경에서 평가되었다. 하드웨어는 PCIe Gen5 인터페이스를 갖춘 CXL-하이브리드 메모리와 FPGA 기반 프로토타입을 포함하며, DRAM 캐시 32GB, SSD 1TB 구성을 사용하였다. 성능 비교는 GPU 메모리(T1) 기반 재계산 기법과 CPU 오프로딩(128GB) 대비 이루어졌다 [1, p.4·6·9·10].</w:t>
+        <w:t>: ITME는 vLLM 프레임워크 위에 구현되었으며, Llama-3.1 8B 및 70B 모델을 대상으로 ShareGPT 데이터셋에서 128개의 동시 대화, 각 대화당 최소 2000 토큰, 최대 5턴 환경에서 평가되었다. 하드웨어는 PCIe Gen5 인터페이스를 갖춘 CXL-하이브리드 메모리와 FPGA 기반 프로토타입을 포함하며, DRAM 캐시 32GB, SSD 1TB 구성을 사용하였다. 성능 비교는 GPU 메모리(T1) 기반 재계산 기법과 CPU 오프로딩(128GB) 대비 이루어졌다 [2, p.4·6·9·10].</w:t>
       </w:r>
     </w:p>
     <w:p>
@@ -4619,7 +4619,7 @@
           <w:b w:val="0"/>
           <w:sz w:val="20"/>
         </w:rPr>
-        <w:t>: ITME는 Llama-3.1 8B 및 70B 모델에서 GPU 메모리 기반 재계산 대비 토큰 생성 첫 시간(TTFT)에서 최대 약 2.5배의 속도 향상을 보였다. CPU 오프로딩 대비해서도 성능 차이를 나타냈으며, FPGA 프로토타입은 DRAM 캐시 적중 시 읽기 18GB/s, 쓰기 12GB/s 대역폭을 달성하여 CMM 기반 평가 대비 20~25% 성능 차이를 보였다. 이는 하드웨어 제약에 기인한다 [1, p.9·10].</w:t>
+        <w:t>: ITME는 Llama-3.1 8B 및 70B 모델에서 GPU 메모리 기반 재계산 대비 토큰 생성 첫 시간(TTFT)에서 최대 약 2.5배의 속도 향상을 보였다. CPU 오프로딩 대비해서도 성능 차이를 나타냈으며, FPGA 프로토타입은 DRAM 캐시 적중 시 읽기 18GB/s, 쓰기 12GB/s 대역폭을 달성하여 CMM 기반 평가 대비 20~25% 성능 차이를 보였다. 이는 하드웨어 제약에 기인한다 [2, p.9·10].</w:t>
       </w:r>
     </w:p>
     <w:p>
@@ -4651,7 +4651,7 @@
           <w:b w:val="0"/>
           <w:sz w:val="20"/>
         </w:rPr>
-        <w:t>: ITME는 NVMe SSD의 내부 아키텍처로 인해 대용량 비동기 쓰기 작업이 읽기 작업과 경쟁하여 I/O 병목 현상을 유발할 수 있다. 또한, 메타데이터 업데이트가 3단계 원자적 연산으로 처리되어 메타데이터 처리량이 제한될 수 있으며, FPGA 프로토타입은 CMM 기반 구현 대비 성능 저하가 관찰되었다. 상용 CXL 하드웨어의 제한적 가용성으로 인해 일부 연구는 시뮬레이션에 의존하는 점도 한계로 지적된다 [1, p.4·6·10·11].</w:t>
+        <w:t>: ITME는 NVMe SSD의 내부 아키텍처로 인해 대용량 비동기 쓰기 작업이 읽기 작업과 경쟁하여 I/O 병목 현상을 유발할 수 있다. 또한, 메타데이터 업데이트가 3단계 원자적 연산으로 처리되어 메타데이터 처리량이 제한될 수 있으며, FPGA 프로토타입은 CMM 기반 구현 대비 성능 저하가 관찰되었다. 상용 CXL 하드웨어의 제한적 가용성으로 인해 일부 연구는 시뮬레이션에 의존하는 점도 한계로 지적된다 [2, p.4·6·10·11].</w:t>
       </w:r>
     </w:p>
     <w:p>
@@ -5067,7 +5067,7 @@
                 <w:b w:val="0"/>
                 <w:sz w:val="17"/>
               </w:rPr>
-              <w:t>[2, p.1]</w:t>
+              <w:t>[1, p.1]</w:t>
             </w:r>
           </w:p>
         </w:tc>
@@ -5091,7 +5091,7 @@
                 <w:b w:val="0"/>
                 <w:sz w:val="17"/>
               </w:rPr>
-              <w:t>[1, p.1·2]</w:t>
+              <w:t>[2, p.1·2]</w:t>
             </w:r>
           </w:p>
         </w:tc>
@@ -5434,7 +5434,7 @@
                 <w:b w:val="0"/>
                 <w:sz w:val="17"/>
               </w:rPr>
-              <w:t>[3; 11; 8; 7]</w:t>
+              <w:t>[1, p.15·16·19; 5]</w:t>
             </w:r>
           </w:p>
         </w:tc>
@@ -5459,7 +5459,7 @@
                 <w:b w:val="0"/>
                 <w:sz w:val="17"/>
               </w:rPr>
-              <w:t>[4; 8; 9]</w:t>
+              <w:t>[3; 5; 6]</w:t>
             </w:r>
           </w:p>
         </w:tc>
@@ -5536,7 +5536,7 @@
                 <w:b w:val="0"/>
                 <w:sz w:val="17"/>
               </w:rPr>
-              <w:t>보통</w:t>
+              <w:t>높음</w:t>
             </w:r>
           </w:p>
         </w:tc>
@@ -5560,7 +5560,7 @@
                 <w:b w:val="0"/>
                 <w:sz w:val="17"/>
               </w:rPr>
-              <w:t>[1, p.8·10]</w:t>
+              <w:t>[2, p.8·10; 7]</w:t>
             </w:r>
           </w:p>
         </w:tc>
@@ -5584,7 +5584,7 @@
                 <w:b w:val="0"/>
                 <w:sz w:val="17"/>
               </w:rPr>
-              <w:t>[5; 10]</w:t>
+              <w:t>[4]</w:t>
             </w:r>
           </w:p>
         </w:tc>
@@ -5605,7 +5605,7 @@
           <w:b w:val="0"/>
           <w:sz w:val="20"/>
         </w:rPr>
-        <w:t>TRL은 공개 정보로 추정한 범위이다. 하한은 공개 근거로 확인된 가장 높은 단계, 상한은 발표·계획 같은 부분 신호로 보이는 단계이며, 양쪽 모두 개발사 외 독립 근거가 있으면 신뢰도 높음, 한쪽만 있으면 보통, 개발사 자료뿐이면 낮음이다(설계서 C.4). TurboQuant은 NVIDIA A100 GPU와 공개 데이터셋을 활용한 실험적 검증과 vLLM 통합 요청, 독립 구현체 존재, AMD GPU 프로덕션 구현 사례로 TRL 5에서 7 사이로 추정된다[2, p.15·19; 3; 7; 8; 9; 4]. 다만 실제 양산 제품 출시 및 고객사 시범 적용에 대한 공개 정보는 부족하다. ITME는 Dell PowerEdge R770 서버, Intel Xeon CPU, NVIDIA A100 GPU, Mellanox NIC를 포함한 실제 하드웨어 환경과 FPGA 프로토타입을 활용해 기능 검증과 성능 평가를 완료하여 TRL 5 단계에 해당하며, SK hynix의 예측 및 프리페칭 기능 시연과 vLLM 기반 동적 재계산 구현으로 TRL 6 가능성도 보인다[1, p.8·10; 5; 10]. 다만 FPGA 프로토타입과 평가 환경이 상용 시스템과 완전히 동일하지 않아 TRL 5~6 사이로 추정된다.</w:t>
+        <w:t>TRL은 공개 정보로 추정한 범위이다. 하한은 공개 근거로 확인된 가장 높은 단계, 상한은 발표·계획 같은 부분 신호로 보이는 단계이며, 양쪽 모두 개발사 외 독립 근거가 있으면 신뢰도 높음, 한쪽만 있으면 보통, 개발사 자료뿐이면 낮음이다(설계서 C.4). TurboQuant은 NVIDIA A100 GPU에서 KV 캐시 양자화 실험과 여러 데이터셋 검증을 통해 TRL 4 단계 실험실 환경 검증을 충족하며, vLLM 엔진에서 AMD GPU용 생산 준비 구현으로 TRL 5 단계 유사 환경 통합 검증 근거가 있다[1, p.15·16·19; 5]. 또한, 생산 서빙 프레임워크 통합 계획과 공식 출시 발표로 TRL 7 단계 시제품 시연 가능성도 보고되었다[6; 3]. 다만 실제 고객사 시범 적용이나 장기간 실서비스 시험에 대한 공개 정보는 아직 없다. ITME는 실제 서버와 GPU를 포함한 하드웨어 환경에서 기능과 성능을 검증하고 FPGA 프로토타입으로 하드웨어 구현 가능성을 입증했으며, vLLM 프레임워크와 통합하여 유사 환경에서 검증된 점이 확인된다[2, p.8·10; 7]. SK hynix의 NAND 제품 개발 보도는 시제품 시연 단계 가능성을 시사하나 구체적 시연 결과는 공개되지 않았다[4].</w:t>
       </w:r>
     </w:p>
     <w:p>
@@ -5808,7 +5808,7 @@
                 <w:b w:val="0"/>
                 <w:sz w:val="17"/>
               </w:rPr>
-              <w:t>5.00 [1, p.2; 12]</w:t>
+              <w:t>5.00 [8; 4]</w:t>
             </w:r>
           </w:p>
         </w:tc>
@@ -5863,7 +5863,7 @@
                 <w:b w:val="0"/>
                 <w:sz w:val="17"/>
               </w:rPr>
-              <w:t>2.00 [13; 14; 15]</w:t>
+              <w:t>5.00 [9; 10]</w:t>
             </w:r>
           </w:p>
         </w:tc>
@@ -5888,7 +5888,7 @@
                 <w:b w:val="0"/>
                 <w:sz w:val="17"/>
               </w:rPr>
-              <w:t>판단 보류 [1, p.9]</w:t>
+              <w:t>판단 보류 [2, p.9]</w:t>
             </w:r>
           </w:p>
         </w:tc>
@@ -5968,7 +5968,7 @@
                 <w:b w:val="0"/>
                 <w:sz w:val="17"/>
               </w:rPr>
-              <w:t>판단 보류 [16; 10]</w:t>
+              <w:t>5.00 [11; 12]</w:t>
             </w:r>
           </w:p>
         </w:tc>
@@ -6023,7 +6023,7 @@
                 <w:b w:val="0"/>
                 <w:sz w:val="17"/>
               </w:rPr>
-              <w:t>5.00 [14; 17]</w:t>
+              <w:t>판단 보류 [13]</w:t>
             </w:r>
           </w:p>
         </w:tc>
@@ -6128,7 +6128,7 @@
                 <w:color w:val="161A58"/>
                 <w:sz w:val="17"/>
               </w:rPr>
-              <w:t>판단 보류</w:t>
+              <w:t>5.00</w:t>
             </w:r>
           </w:p>
         </w:tc>
@@ -6149,7 +6149,7 @@
           <w:b w:val="0"/>
           <w:sz w:val="20"/>
         </w:rPr>
-        <w:t>TurboQuant은 KV 캐시 압축을 통한 메모리 사용량 감소와 비용 절감 효과에 대해 긍정적 평가가 보고되었으나, 시장 규모와 생태계 지원에 대한 구체적 근거는 부족하며 일부에서는 연구 단계라는 지적도 존재한다[14; 17; 18; 13; 15; 19]. ITME는 대규모 LLM 추론 시장 성장과 수요에 부합하는 기술로 평가받으며, 일부 생태계 지원 근거가 있으나 도입 비용 구조와 상용화 단계에 대한 구체적 정보는 부족하다[1, p.2; 12; 20; 16; 10].</w:t>
+        <w:t>TurboQuant는 KV 캐시 메모리 사용량을 크게 줄이고 속도 향상을 달성하는 기술로 실험적 평가가 보고되었으며, 메모리 절감과 정확도 손실 간 상충관계를 극복하는 도입 비용 구조를 갖추고 있다[10; 9; 13]. 다만 시장 규모·성장과 생태계 지원에 대한 구체적 근거는 부족하여 시장성 평가가 보류되었다. ITME는 LLM 추론 시장 성장과 수요에 부합하는 NAND 기반 KV 캐시 확장 기술을 개발하고 있으며, 실제 Llama-3.1 모델에서 성능 향상을 입증하고 AiMX 카드와 같은 하드웨어 최적화 사례도 존재한다[2, p.9; 11]. 또한 CXL 하이브리드 메모리와 PCIe Gen5 인터페이스를 활용한 다계층 메모리 관리 및 생태계 통합 측면에서 구체적인 구현과 전략이 보고되었다[11; 12; 7]. 다만 도입 비용 구조에 관한 근거는 부족하다.</w:t>
       </w:r>
     </w:p>
     <w:p>
@@ -6327,7 +6327,7 @@
                 <w:b w:val="0"/>
                 <w:sz w:val="17"/>
               </w:rPr>
-              <w:t>지지(5) [14; 21; 22]</w:t>
+              <w:t>지지(5) [14; 15; 10]</w:t>
             </w:r>
           </w:p>
         </w:tc>
@@ -6352,7 +6352,7 @@
                 <w:b w:val="0"/>
                 <w:sz w:val="17"/>
               </w:rPr>
-              <w:t>지지(5) [6; 23; 24]</w:t>
+              <w:t>지지(5) [16; 17; 18]</w:t>
             </w:r>
           </w:p>
         </w:tc>
@@ -6432,7 +6432,7 @@
                 <w:b w:val="0"/>
                 <w:sz w:val="17"/>
               </w:rPr>
-              <w:t>우려(1) [25; 26]</w:t>
+              <w:t>지지(5) [19; 20]</w:t>
             </w:r>
           </w:p>
         </w:tc>
@@ -6487,7 +6487,7 @@
                 <w:b w:val="0"/>
                 <w:sz w:val="17"/>
               </w:rPr>
-              <w:t>지지(5) [27; 28; 18]</w:t>
+              <w:t>지지(5) [21; 22; 23]</w:t>
             </w:r>
           </w:p>
         </w:tc>
@@ -6512,7 +6512,7 @@
                 <w:b w:val="0"/>
                 <w:sz w:val="17"/>
               </w:rPr>
-              <w:t>지지(5) [29]</w:t>
+              <w:t>판단 보류</w:t>
             </w:r>
           </w:p>
         </w:tc>
@@ -6567,7 +6567,7 @@
                 <w:b w:val="0"/>
                 <w:sz w:val="17"/>
               </w:rPr>
-              <w:t>지지(5) [30; 31; 32]</w:t>
+              <w:t>지지(5) [24; 25; 26]</w:t>
             </w:r>
           </w:p>
         </w:tc>
@@ -6592,7 +6592,7 @@
                 <w:b w:val="0"/>
                 <w:sz w:val="17"/>
               </w:rPr>
-              <w:t>중립·혼재(3) [33; 34; 35]</w:t>
+              <w:t>중립·혼재(3) [27; 28; 29]</w:t>
             </w:r>
           </w:p>
         </w:tc>
@@ -6672,7 +6672,7 @@
                 <w:color w:val="161A58"/>
                 <w:sz w:val="17"/>
               </w:rPr>
-              <w:t>3.50</w:t>
+              <w:t>4.33</w:t>
             </w:r>
           </w:p>
         </w:tc>
@@ -6693,7 +6693,7 @@
           <w:b w:val="0"/>
           <w:sz w:val="20"/>
         </w:rPr>
-        <w:t>개발사(TurboQuant는 Google, ITME는 SK hynix)의 발언과 보도자료는 점수에서 제외하고 참고로만 인용했다. TurboQuant은 여러 이해관계자 집단에서 KV 캐시 메모리 사용량 감소와 정확도 유지, 추론 비용 절감 가능성에 대해 긍정적 평가가 보고되었으나, 일부 개발자 커뮤니티와 투자·분석 집단에서는 변동성 증가와 채택 사례 부족에 대한 우려가 존재한다[14; 22; 27; 31; 18; 36]. ITME는 클라우드·데이터센터 사업자와 투자·분석·언론 집단에서 긍정적 평가가 다수 보고되었으나, GPU·메모리 벤더 집단에서는 메모리 수요 성장 둔화 우려가 제기되었고 개발자 커뮤니티 근거는 부족하다[6; 23; 10; 25; 26; 29].</w:t>
+        <w:t>개발사(TurboQuant는 Google, ITME는 SK hynix)의 발언과 보도자료는 점수에서 제외하고 참고로만 인용했다. TurboQuant는 클라우드·데이터센터 사업자 집단에서 KV 캐시 압축과 메모리 사용량 감소, 속도 향상, 정확도 유지 측면에서 긍정적 평가가 다수 보고되었으며[14; 15; 10], 개발자 커뮤니티와 투자·분석·언론 집단에서는 긍정적 평가가 우세하나 일부 우려와 중립 의견도 존재한다[21; 30; 31]. GPU·메모리 벤더 집단에서는 근거가 부족하여 평가가 어렵다. ITME는 클라우드·데이터센터 사업자와 GPU·메모리 벤더 집단에서 KV 캐시 최적화와 대규모 AI 추론 서비스 지원에 긍정적 평가를 받고 있으나[16; 19], 투자·분석·언론 집단에서는 긍정과 우려가 혼재되어 시장 수요에 대한 불확실성이 존재한다[28; 27]. 개발자 커뮤니티의 의견은 근거 부족으로 평가가 어렵다.</w:t>
       </w:r>
     </w:p>
     <w:p>
@@ -6929,7 +6929,7 @@
                 <w:b w:val="0"/>
                 <w:sz w:val="17"/>
               </w:rPr>
-              <w:t>5.00 [15; 37]</w:t>
+              <w:t>5.00 [14; 9]</w:t>
             </w:r>
           </w:p>
         </w:tc>
@@ -6954,7 +6954,7 @@
                 <w:b w:val="0"/>
                 <w:sz w:val="17"/>
               </w:rPr>
-              <w:t>5.00 [15; 37]</w:t>
+              <w:t>5.00 [14; 9]</w:t>
             </w:r>
           </w:p>
         </w:tc>
@@ -6979,7 +6979,7 @@
                 <w:b w:val="0"/>
                 <w:sz w:val="17"/>
               </w:rPr>
-              <w:t>판단 보류 [1, p.2; 20]</w:t>
+              <w:t>판단 보류 [2, p.2]</w:t>
             </w:r>
           </w:p>
         </w:tc>
@@ -7004,7 +7004,7 @@
                 <w:b w:val="0"/>
                 <w:sz w:val="17"/>
               </w:rPr>
-              <w:t>판단 보류 [1, p.2; 20]</w:t>
+              <w:t>판단 보류 [2, p.2]</w:t>
             </w:r>
           </w:p>
         </w:tc>
@@ -7059,7 +7059,7 @@
                 <w:b w:val="0"/>
                 <w:sz w:val="17"/>
               </w:rPr>
-              <w:t>5.00 [15; 37]</w:t>
+              <w:t>4.00 [9; 32]</w:t>
             </w:r>
           </w:p>
         </w:tc>
@@ -7084,7 +7084,7 @@
                 <w:b w:val="0"/>
                 <w:sz w:val="17"/>
               </w:rPr>
-              <w:t>4.00 [15; 37]</w:t>
+              <w:t>4.00 [9; 32]</w:t>
             </w:r>
           </w:p>
         </w:tc>
@@ -7109,7 +7109,7 @@
                 <w:b w:val="0"/>
                 <w:sz w:val="17"/>
               </w:rPr>
-              <w:t>판단 보류 [1, p.2]</w:t>
+              <w:t>판단 보류 [2, p.2]</w:t>
             </w:r>
           </w:p>
         </w:tc>
@@ -7134,7 +7134,7 @@
                 <w:b w:val="0"/>
                 <w:sz w:val="17"/>
               </w:rPr>
-              <w:t>판단 보류 [1, p.2]</w:t>
+              <w:t>판단 보류 [2, p.2]</w:t>
             </w:r>
           </w:p>
         </w:tc>
@@ -7189,7 +7189,7 @@
                 <w:b w:val="0"/>
                 <w:sz w:val="17"/>
               </w:rPr>
-              <w:t>5.00 [4; 38]</w:t>
+              <w:t>5.00 [32; 33]</w:t>
             </w:r>
           </w:p>
         </w:tc>
@@ -7214,7 +7214,7 @@
                 <w:b w:val="0"/>
                 <w:sz w:val="17"/>
               </w:rPr>
-              <w:t>4.00 [3; 11]</w:t>
+              <w:t>5.00 [32; 33]</w:t>
             </w:r>
           </w:p>
         </w:tc>
@@ -7239,7 +7239,7 @@
                 <w:b w:val="0"/>
                 <w:sz w:val="17"/>
               </w:rPr>
-              <w:t>판단 보류 [10]</w:t>
+              <w:t>판단 보류 [7]</w:t>
             </w:r>
           </w:p>
         </w:tc>
@@ -7264,7 +7264,7 @@
                 <w:b w:val="0"/>
                 <w:sz w:val="17"/>
               </w:rPr>
-              <w:t>판단 보류 [10]</w:t>
+              <w:t>판단 보류 [7]</w:t>
             </w:r>
           </w:p>
         </w:tc>
@@ -7319,7 +7319,7 @@
                 <w:b w:val="0"/>
                 <w:sz w:val="17"/>
               </w:rPr>
-              <w:t>5.00 [2, p.18; 15]</w:t>
+              <w:t>5.00 [1, p.18; 14]</w:t>
             </w:r>
           </w:p>
         </w:tc>
@@ -7344,7 +7344,7 @@
                 <w:b w:val="0"/>
                 <w:sz w:val="17"/>
               </w:rPr>
-              <w:t>5.00 [15; 37]</w:t>
+              <w:t>5.00 [1, p.18; 14]</w:t>
             </w:r>
           </w:p>
         </w:tc>
@@ -7449,7 +7449,7 @@
                 <w:b w:val="0"/>
                 <w:sz w:val="17"/>
               </w:rPr>
-              <w:t>4.00 [39; 32]</w:t>
+              <w:t>판단 보류</w:t>
             </w:r>
           </w:p>
         </w:tc>
@@ -7474,7 +7474,7 @@
                 <w:b w:val="0"/>
                 <w:sz w:val="17"/>
               </w:rPr>
-              <w:t>4.00 [39; 32]</w:t>
+              <w:t>판단 보류</w:t>
             </w:r>
           </w:p>
         </w:tc>
@@ -7579,7 +7579,7 @@
                 <w:color w:val="161A58"/>
                 <w:sz w:val="17"/>
               </w:rPr>
-              <w:t>4.60</w:t>
+              <w:t>4.75</w:t>
             </w:r>
           </w:p>
         </w:tc>
@@ -7657,7 +7657,7 @@
           <w:b w:val="0"/>
           <w:sz w:val="20"/>
         </w:rPr>
-        <w:t>워크로드별 평균: TurboQuant W1 4.80, W2 4.40; ITME W1 판단 보류, W2 판단 보류. 가중 평균 행은 기술별 W1·W2 합산값이다(W1 열에 표기). TurboQuant은 KV 캐시를 3비트로 압축하여 메모리 사용량을 약 6배 줄이고 정확도 손실 없이 지연 시간과 처리량 측면에서 개선된 결과가 다수 보고되었다[15; 37; 32; 9]. 다만, 통합 난이도와 일부 조건에서 지연 및 처리량 증가 우려가 존재한다[40; 11]. ITME는 다계층 메모리 구조를 활용해 GPU 메모리 용량 한계를 극복하고 처리량과 지연 측면에서 개선된 결과가 있으나, 정확도 영향과 통합 난이도에 대한 근거는 부족하여 평가가 어렵다[1, p.2; 10].</w:t>
+        <w:t>워크로드별 평균: TurboQuant W1 4.75, W2 4.75; ITME W1 판단 보류, W2 판단 보류. 가중 평균 행은 기술별 W1·W2 합산값이다(W1 열에 표기). TurboQuant는 KV 캐시를 3비트까지 압축하면서 6배 이상의 메모리 절감과 비용 절감을 보고했으며, 정확도 손실이 없다는 근거가 다수 존재한다[14; 9; 32]. 단일 요청 지연이 약간 증가하는 부정적 근거가 있으나, 전반적으로 지연 유지 및 처리량 향상 근거가 더 많다[9; 34; 32]. 통합 난이도에 관한 근거는 부족하다. ITME는 다계층 메모리 구조를 활용하여 GPU 메모리와 호스트 메모리의 역할 분담으로 비용과 지연 측면에서 용량 문제를 해결하는 결과가 보고되었으며, NVMe-oF 대비 처리량이 1.8배 이상 향상된 점도 확인되었다[2, p.2; 7]. 다만 정확도 영향과 통합 난이도에 대한 근거가 부족하여 평가가 제한적이다.</w:t>
       </w:r>
     </w:p>
     <w:p>
@@ -7989,7 +7989,7 @@
                 <w:b w:val="0"/>
                 <w:sz w:val="17"/>
               </w:rPr>
-              <w:t>4.60</w:t>
+              <w:t>4.75</w:t>
             </w:r>
           </w:p>
         </w:tc>
@@ -8066,7 +8066,7 @@
                 <w:b w:val="0"/>
                 <w:sz w:val="17"/>
               </w:rPr>
-              <w:t>판단 보류</w:t>
+              <w:t>5.00</w:t>
             </w:r>
           </w:p>
         </w:tc>
@@ -8090,7 +8090,7 @@
                 <w:b w:val="0"/>
                 <w:sz w:val="17"/>
               </w:rPr>
-              <w:t>3.50</w:t>
+              <w:t>4.33</w:t>
             </w:r>
           </w:p>
         </w:tc>
@@ -8281,6 +8281,7 @@
           </w:tcPr>
           <w:p>
             <w:pPr>
+              <w:keepNext/>
               <w:spacing w:after="0" w:line="276" w:lineRule="auto"/>
             </w:pPr>
             <w:r>
@@ -8305,6 +8306,7 @@
           </w:tcPr>
           <w:p>
             <w:pPr>
+              <w:keepNext/>
               <w:spacing w:after="0" w:line="276" w:lineRule="auto"/>
             </w:pPr>
             <w:r>
@@ -8329,15 +8331,118 @@
           </w:tcPr>
           <w:p>
             <w:pPr>
-              <w:spacing w:after="0" w:line="276" w:lineRule="auto"/>
-            </w:pPr>
-            <w:r>
-              <w:rPr>
-                <w:rFonts w:ascii="맑은 고딕" w:hAnsi="맑은 고딕" w:eastAsia="맑은 고딕" w:cs="맑은 고딕"/>
-                <w:b w:val="0"/>
-                <w:sz w:val="17"/>
-              </w:rPr>
-              <w:t>0.40</w:t>
+              <w:keepNext/>
+              <w:spacing w:after="0" w:line="276" w:lineRule="auto"/>
+            </w:pPr>
+            <w:r>
+              <w:rPr>
+                <w:rFonts w:ascii="맑은 고딕" w:hAnsi="맑은 고딕" w:eastAsia="맑은 고딕" w:cs="맑은 고딕"/>
+                <w:b w:val="0"/>
+                <w:sz w:val="17"/>
+              </w:rPr>
+              <w:t>0.25</w:t>
+            </w:r>
+          </w:p>
+        </w:tc>
+        <w:tc>
+          <w:tcPr>
+            <w:tcW w:type="dxa" w:w="2551"/>
+            <w:tcMar>
+              <w:top w:w="70" w:type="dxa"/>
+              <w:left w:w="90" w:type="dxa"/>
+              <w:bottom w:w="70" w:type="dxa"/>
+              <w:right w:w="90" w:type="dxa"/>
+            </w:tcMar>
+          </w:tcPr>
+          <w:p>
+            <w:pPr>
+              <w:keepNext/>
+              <w:spacing w:after="0" w:line="276" w:lineRule="auto"/>
+            </w:pPr>
+            <w:r>
+              <w:rPr>
+                <w:rFonts w:ascii="맑은 고딕" w:hAnsi="맑은 고딕" w:eastAsia="맑은 고딕" w:cs="맑은 고딕"/>
+                <w:b w:val="0"/>
+                <w:sz w:val="17"/>
+              </w:rPr>
+              <w:t>일치</w:t>
+            </w:r>
+          </w:p>
+        </w:tc>
+      </w:tr>
+      <w:tr>
+        <w:trPr>
+          <w:cantSplit/>
+        </w:trPr>
+        <w:tc>
+          <w:tcPr>
+            <w:tcW w:type="dxa" w:w="1701"/>
+            <w:tcMar>
+              <w:top w:w="70" w:type="dxa"/>
+              <w:left w:w="90" w:type="dxa"/>
+              <w:bottom w:w="70" w:type="dxa"/>
+              <w:right w:w="90" w:type="dxa"/>
+            </w:tcMar>
+          </w:tcPr>
+          <w:p>
+            <w:pPr>
+              <w:spacing w:after="0" w:line="276" w:lineRule="auto"/>
+            </w:pPr>
+            <w:r>
+              <w:rPr>
+                <w:rFonts w:ascii="맑은 고딕" w:hAnsi="맑은 고딕" w:eastAsia="맑은 고딕" w:cs="맑은 고딕"/>
+                <w:b w:val="0"/>
+                <w:sz w:val="17"/>
+              </w:rPr>
+              <w:t>ITME</w:t>
+            </w:r>
+          </w:p>
+        </w:tc>
+        <w:tc>
+          <w:tcPr>
+            <w:tcW w:type="dxa" w:w="3402"/>
+            <w:tcMar>
+              <w:top w:w="70" w:type="dxa"/>
+              <w:left w:w="90" w:type="dxa"/>
+              <w:bottom w:w="70" w:type="dxa"/>
+              <w:right w:w="90" w:type="dxa"/>
+            </w:tcMar>
+          </w:tcPr>
+          <w:p>
+            <w:pPr>
+              <w:spacing w:after="0" w:line="276" w:lineRule="auto"/>
+            </w:pPr>
+            <w:r>
+              <w:rPr>
+                <w:rFonts w:ascii="맑은 고딕" w:hAnsi="맑은 고딕" w:eastAsia="맑은 고딕" w:cs="맑은 고딕"/>
+                <w:b w:val="0"/>
+                <w:sz w:val="17"/>
+              </w:rPr>
+              <w:t>시장성 – 이해관계자</w:t>
+            </w:r>
+          </w:p>
+        </w:tc>
+        <w:tc>
+          <w:tcPr>
+            <w:tcW w:type="dxa" w:w="1417"/>
+            <w:tcMar>
+              <w:top w:w="70" w:type="dxa"/>
+              <w:left w:w="90" w:type="dxa"/>
+              <w:bottom w:w="70" w:type="dxa"/>
+              <w:right w:w="90" w:type="dxa"/>
+            </w:tcMar>
+          </w:tcPr>
+          <w:p>
+            <w:pPr>
+              <w:spacing w:after="0" w:line="276" w:lineRule="auto"/>
+            </w:pPr>
+            <w:r>
+              <w:rPr>
+                <w:rFonts w:ascii="맑은 고딕" w:hAnsi="맑은 고딕" w:eastAsia="맑은 고딕" w:cs="맑은 고딕"/>
+                <w:b w:val="0"/>
+                <w:sz w:val="17"/>
+              </w:rPr>
+              <w:t>0.67</w:t>
             </w:r>
           </w:p>
         </w:tc>
@@ -8598,7 +8703,7 @@
                 <w:b w:val="0"/>
                 <w:sz w:val="17"/>
               </w:rPr>
-              <w:t>판단 보류</w:t>
+              <w:t>부분 지지</w:t>
             </w:r>
           </w:p>
         </w:tc>
@@ -8623,7 +8728,7 @@
                 <w:b w:val="0"/>
                 <w:sz w:val="17"/>
               </w:rPr>
-              <w:t>TurboQuant: TRL 5–7 (신뢰도 높음), 시장성 판단 보류 → 판단 보류; ITME: TRL 5–6 (신뢰도 보통), 시장성 판단 보류 → 판단 보류 (C.5 격자, 코드 계산) [1, p.8·10; 3; 11]</w:t>
+              <w:t>TurboQuant: TRL 5–7 (신뢰도 높음), 시장성 판단 보류 → 판단 보류; ITME: TRL 5–6 (신뢰도 높음), 시장성 5.0 → 부분 괴리 (기대 선행) (C.5 격자, 코드 계산) [2, p.8·10; 1, p.15·16]</w:t>
             </w:r>
           </w:p>
         </w:tc>
@@ -8678,7 +8783,7 @@
                 <w:b w:val="0"/>
                 <w:sz w:val="17"/>
               </w:rPr>
-              <w:t>판단 보류</w:t>
+              <w:t>지지</w:t>
             </w:r>
           </w:p>
         </w:tc>
@@ -8703,7 +8808,7 @@
                 <w:b w:val="0"/>
                 <w:sz w:val="17"/>
               </w:rPr>
-              <w:t>TurboQuant은 기술 자체 언급이 10회, 생태계 언급이 6회로 기술 중심의 근거가 다소 우세하나, ITME는 기술 언급 3회에 비해 생태계 언급이 9회로 생태계·전략 측면 근거가 더 많아 두 기술 간 이해관계자 근거의 비중 차이가 명확하다. 그러나 두 기술 모두 이해관계자 평가가 긍정적이나 일부 우려도 공존하여 명확한 지지나 기각 판단은 어렵다. [14; 6; 10]</w:t>
+              <w:t>TurboQuant는 기술 자체에 대한 언급이 15건으로 많고 생태계 언급은 5건에 불과한 반면, ITME는 기술 언급이 5건, 생태계 언급이 9건으로 생태계·전략 측면의 언급이 더 많아 두 기술의 이해관계자 근거 비중이 다르다.</w:t>
             </w:r>
           </w:p>
         </w:tc>
@@ -8758,7 +8863,7 @@
                 <w:b w:val="0"/>
                 <w:sz w:val="17"/>
               </w:rPr>
-              <w:t>지지</w:t>
+              <w:t>판단 보류</w:t>
             </w:r>
           </w:p>
         </w:tc>
@@ -8783,7 +8888,7 @@
                 <w:b w:val="0"/>
                 <w:sz w:val="17"/>
               </w:rPr>
-              <w:t>ITME는 도메인 평가 점수가 부재하여 비교가 불가하나, TurboQuant의 점수 분포는 W1과 W2 간 큰 차이가 없고 모두 높은 수준임을 보여준다. [15; 10; 40]</w:t>
+              <w:t>TurboQuant의 도메인 평가 점수는 W1과 W2 모두 4.75점으로 동일하며, ITME는 도메인 점수가 부재하여 W1과 W2 점수 차이에 따른 판정 기준 적용이 어렵다.</w:t>
             </w:r>
           </w:p>
         </w:tc>
@@ -8860,7 +8965,7 @@
                 <w:b w:val="0"/>
                 <w:sz w:val="17"/>
               </w:rPr>
-              <w:t>두 기술 모두 KV 캐시 메모리 최적화라는 공통 목표를 가지며, TurboQuant는 압축 중심, ITME는 다계층 메모리 및 CXL 하이브리드 메모리 통합 중심으로 접근한다. 그러나 두 방식을 함께 쓰는 사례나 도입 주체 차이를 명확히 보여주는 근거는 발견되지 않아 판단 보류한다. [6; 41; 40]</w:t>
+              <w:t>근거 문장이 Judge 검사를 통과하지 못함</w:t>
             </w:r>
           </w:p>
         </w:tc>
@@ -8881,7 +8986,7 @@
           <w:b w:val="0"/>
           <w:sz w:val="20"/>
         </w:rPr>
-        <w:t>H1은 TRL 범위의 가운데 값과 시장성 점수로 설계서 C.5의 3×3 격자에서 코드로 판정했다: TurboQuant 판단 보류; ITME 판단 보류.</w:t>
+        <w:t>H1은 TRL 범위의 가운데 값과 시장성 점수로 설계서 C.5의 3×3 격자에서 코드로 판정했다: TurboQuant 판단 보류; ITME 부분 괴리 (기대 선행).</w:t>
       </w:r>
     </w:p>
     <w:p>
@@ -8919,7 +9024,7 @@
           <w:b w:val="0"/>
           <w:sz w:val="20"/>
         </w:rPr>
-        <w:t>대규모 장문맥 LLM 추론 워크로드에서는 TurboQuant의 3비트 KV 캐시 압축과 메모리 절감 효과가 관련 근거로 작용한다[15; 37; 32].</w:t>
+        <w:t>GPU 메모리 용량 한계가 중요한 워크로드에서는 ITME의 다계층 메모리 구조와 NAND 기반 확장 기술 근거가 관련된다[2, p.2; 4].</w:t>
       </w:r>
     </w:p>
     <w:p>
@@ -8942,7 +9047,7 @@
           <w:b w:val="0"/>
           <w:sz w:val="20"/>
         </w:rPr>
-        <w:t>기존 GPU 보유 여부가 중요한 도입 주체에서는 TurboQuant의 GPU 기반 프로덕션 구현과 vLLM 통합 사례가 참고될 수 있다[3; 7; 8].</w:t>
+        <w:t>기존에 NVIDIA A100 GPU를 보유한 환경에서는 TurboQuant의 KV 캐시 3비트 압축과 실험실 검증 근거가 적용될 수 있다[1, p.15·16].</w:t>
       </w:r>
     </w:p>
     <w:p>
@@ -8965,7 +9070,7 @@
           <w:b w:val="0"/>
           <w:sz w:val="20"/>
         </w:rPr>
-        <w:t>클라우드 및 데이터센터 사업자 도입 시 ITME의 다계층 메모리 구조와 CXL 하이브리드 메모리 활용 근거가 관련된다[1, p.8; 5; 10].</w:t>
+        <w:t>클라우드·데이터센터 사업자가 도입 주체일 경우 TurboQuant와 ITME 모두에서 긍정적 평가 근거가 다수 보고되어 관련 근거가 참고된다[14; 16].</w:t>
       </w:r>
     </w:p>
     <w:p>
@@ -8988,7 +9093,7 @@
           <w:b w:val="0"/>
           <w:sz w:val="20"/>
         </w:rPr>
-        <w:t>투자 및 분석 집단에서는 TurboQuant의 비용 절감 효과와 ITME의 메모리 수요 성장 둔화 우려가 평가에 영향을 미칠 수 있다[14; 17; 25; 26].</w:t>
+        <w:t>투자·분석·언론 집단의 시장 수요 판단에서는 TurboQuant가 긍정과 우려가 혼재된 반면, ITME는 긍정과 부정 근거가 혼재되어 불확실성 근거가 관련된다[28; 31].</w:t>
       </w:r>
     </w:p>
     <w:p>
@@ -9137,7 +9242,7 @@
                 <w:b w:val="0"/>
                 <w:sz w:val="17"/>
               </w:rPr>
-              <w:t>0 / 1칸</w:t>
+              <w:t>0 / 2칸</w:t>
             </w:r>
           </w:p>
         </w:tc>
@@ -9192,7 +9297,7 @@
                 <w:b w:val="0"/>
                 <w:sz w:val="17"/>
               </w:rPr>
-              <w:t>0 / 1칸</w:t>
+              <w:t>0 / 2칸</w:t>
             </w:r>
           </w:p>
         </w:tc>
@@ -9247,7 +9352,7 @@
                 <w:b w:val="0"/>
                 <w:sz w:val="17"/>
               </w:rPr>
-              <w:t>0 / 1칸</w:t>
+              <w:t>0 / 2칸</w:t>
             </w:r>
           </w:p>
         </w:tc>
@@ -9300,7 +9405,7 @@
                 <w:b w:val="0"/>
                 <w:sz w:val="17"/>
               </w:rPr>
-              <w:t>0 / 1칸</w:t>
+              <w:t>1 / 2칸</w:t>
             </w:r>
           </w:p>
         </w:tc>
@@ -9353,7 +9458,7 @@
                 <w:b w:val="0"/>
                 <w:sz w:val="17"/>
               </w:rPr>
-              <w:t>0 / 2칸 (H1 판정: 판단 보류)</w:t>
+              <w:t>0 / 2칸 (H1 판정: 부분 지지)</w:t>
             </w:r>
           </w:p>
         </w:tc>
@@ -9406,7 +9511,7 @@
                 <w:b w:val="0"/>
                 <w:sz w:val="17"/>
               </w:rPr>
-              <w:t>0 / 2칸 (H1 판정: 판단 보류)</w:t>
+              <w:t>0 / 2칸 (H1 판정: 부분 지지)</w:t>
             </w:r>
           </w:p>
         </w:tc>
@@ -9459,7 +9564,7 @@
                 <w:b w:val="0"/>
                 <w:sz w:val="17"/>
               </w:rPr>
-              <w:t>0 / 2칸 (H1 판정: 판단 보류)</w:t>
+              <w:t>0 / 2칸 (H1 판정: 부분 지지)</w:t>
             </w:r>
           </w:p>
         </w:tc>
@@ -9512,7 +9617,7 @@
                 <w:b w:val="0"/>
                 <w:sz w:val="17"/>
               </w:rPr>
-              <w:t>0 / 2칸 (H1 판정: 판단 보류)</w:t>
+              <w:t>0 / 2칸 (H1 판정: 부분 지지)</w:t>
             </w:r>
           </w:p>
         </w:tc>
@@ -9565,7 +9670,7 @@
                 <w:b w:val="0"/>
                 <w:sz w:val="17"/>
               </w:rPr>
-              <w:t>0 / 2칸 (H1 판정: 판단 보류)</w:t>
+              <w:t>0 / 2칸 (H1 판정: 부분 지지)</w:t>
             </w:r>
           </w:p>
         </w:tc>
@@ -9618,7 +9723,7 @@
                 <w:b w:val="0"/>
                 <w:sz w:val="17"/>
               </w:rPr>
-              <w:t>0 / 2칸 (H1 판정: 판단 보류)</w:t>
+              <w:t>0 / 2칸 (H1 판정: 부분 지지)</w:t>
             </w:r>
           </w:p>
         </w:tc>
@@ -9671,7 +9776,7 @@
                 <w:b w:val="0"/>
                 <w:sz w:val="17"/>
               </w:rPr>
-              <w:t>0 / 2칸 (H1 판정: 판단 보류)</w:t>
+              <w:t>0 / 2칸 (H1 판정: 부분 지지)</w:t>
             </w:r>
           </w:p>
         </w:tc>
@@ -9724,7 +9829,7 @@
                 <w:b w:val="0"/>
                 <w:sz w:val="17"/>
               </w:rPr>
-              <w:t>0 / 2칸 (H1 판정: 판단 보류)</w:t>
+              <w:t>0 / 2칸 (H1 판정: 부분 지지)</w:t>
             </w:r>
           </w:p>
         </w:tc>
@@ -10194,7 +10299,7 @@
                 <w:b w:val="0"/>
                 <w:sz w:val="17"/>
               </w:rPr>
-              <w:t>TurboQuant 하·상한 3, ITME 하·상한 1</w:t>
+              <w:t>TurboQuant 하·상한 2, ITME 하·상한 1</w:t>
             </w:r>
           </w:p>
         </w:tc>
@@ -10244,7 +10349,7 @@
                 <w:b w:val="0"/>
                 <w:sz w:val="17"/>
               </w:rPr>
-              <w:t>2</w:t>
+              <w:t>0</w:t>
             </w:r>
           </w:p>
         </w:tc>
@@ -10324,7 +10429,7 @@
                 <w:b w:val="0"/>
                 <w:sz w:val="17"/>
               </w:rPr>
-              <w:t>4/4/3/4</w:t>
+              <w:t>4/4/4/4</w:t>
             </w:r>
           </w:p>
         </w:tc>
@@ -10349,7 +10454,7 @@
                 <w:b w:val="0"/>
                 <w:sz w:val="17"/>
               </w:rPr>
-              <w:t>50%</w:t>
+              <w:t>40%</w:t>
             </w:r>
           </w:p>
         </w:tc>
@@ -10374,7 +10479,7 @@
                 <w:b w:val="0"/>
                 <w:sz w:val="17"/>
               </w:rPr>
-              <w:t>TurboQuant 찬3/반3, ITME 찬3/반0</w:t>
+              <w:t>TurboQuant 찬3/반0, ITME 찬4/반0</w:t>
             </w:r>
           </w:p>
         </w:tc>
@@ -10504,7 +10609,7 @@
                 <w:b w:val="0"/>
                 <w:sz w:val="17"/>
               </w:rPr>
-              <w:t>4/4/4/4</w:t>
+              <w:t>5/4/5/4</w:t>
             </w:r>
           </w:p>
         </w:tc>
@@ -10529,7 +10634,7 @@
                 <w:b w:val="0"/>
                 <w:sz w:val="17"/>
               </w:rPr>
-              <w:t>17%</w:t>
+              <w:t>14%</w:t>
             </w:r>
           </w:p>
         </w:tc>
@@ -10554,7 +10659,7 @@
                 <w:b w:val="0"/>
                 <w:sz w:val="17"/>
               </w:rPr>
-              <w:t>TurboQuant 찬11/반2, ITME 찬7/반2</w:t>
+              <w:t>TurboQuant 찬14/반2, ITME 찬9/반2</w:t>
             </w:r>
           </w:p>
         </w:tc>
@@ -10604,7 +10709,7 @@
                 <w:b w:val="0"/>
                 <w:sz w:val="17"/>
               </w:rPr>
-              <w:t>0</w:t>
+              <w:t>2</w:t>
             </w:r>
           </w:p>
         </w:tc>
@@ -10706,7 +10811,7 @@
                 <w:b w:val="0"/>
                 <w:sz w:val="17"/>
               </w:rPr>
-              <w:t>50%</w:t>
+              <w:t>100%</w:t>
             </w:r>
           </w:p>
         </w:tc>
@@ -10730,7 +10835,7 @@
                 <w:b w:val="0"/>
                 <w:sz w:val="17"/>
               </w:rPr>
-              <w:t>TurboQuant 찬10/반2, ITME 찬2/반0</w:t>
+              <w:t>TurboQuant 찬6/반1, ITME 찬2/반0</w:t>
             </w:r>
           </w:p>
         </w:tc>
@@ -10833,7 +10938,7 @@
           <w:b w:val="0"/>
           <w:sz w:val="20"/>
         </w:rPr>
-        <w:t>본문 인용 근거의 출처 구분: 벤더 26건, 제3자 30건, 학술 4건. 관점마다 지지·반대 질의를 짝지어 검색했고, 한 원 출처 계열이 웹 근거의 50%를 넘지 않게 했으며, 개발사 발언은 이해관계자 점수에서 뺐다.</w:t>
+        <w:t>본문 인용 근거의 출처 구분: 벤더 26건, 제3자 24건, 학술 3건. 관점마다 지지·반대 질의를 짝지어 검색했고, 한 원 출처 계열이 웹 근거의 50%를 넘지 않게 했으며, 개발사 발언은 이해관계자 점수에서 뺐다.</w:t>
       </w:r>
     </w:p>
     <w:p>
@@ -11114,7 +11219,7 @@
           <w:b w:val="0"/>
           <w:sz w:val="20"/>
         </w:rPr>
-        <w:t>[1] Jang, H., Min, Y., Kim, S., Ahn, T., Kim, H., Joo, Y., Kim, H., &amp; Kim, J.(2026). ITME: Inference Tiered Memory Expansion with Disaggregated CXL-Hybrid Memories. arXiv, 2606.12556.</w:t>
+        <w:t>[1] Zandieh, A., Daliri, M., Hadian, M., &amp; Mirrokni, V.(2025). TurboQuant: Online Vector Quantization with Near-optimal Distortion Rate. arXiv, 2504.19874.</w:t>
       </w:r>
     </w:p>
     <w:p>
@@ -11137,7 +11242,7 @@
           <w:b w:val="0"/>
           <w:sz w:val="20"/>
         </w:rPr>
-        <w:t>[2] Zandieh, A., Daliri, M., Hadian, M., &amp; Mirrokni, V.(2025). TurboQuant: Online Vector Quantization with Near-optimal Distortion Rate. arXiv, 2504.19874.</w:t>
+        <w:t>[2] Jang, H., Min, Y., Kim, S., Ahn, T., Kim, H., Joo, Y., Kim, H., &amp; Kim, J.(2026). ITME: Inference Tiered Memory Expansion with Disaggregated CXL-Hybrid Memories. arXiv, 2606.12556.</w:t>
       </w:r>
     </w:p>
     <w:p>
@@ -11175,7 +11280,7 @@
           <w:b w:val="0"/>
           <w:sz w:val="20"/>
         </w:rPr>
-        <w:t>[3] deepinfra.com(2026-09-22 접속). What Is Google TurboQuant and What Does It Mean .... deepinfra.com, https://deepinfra.com/blog/google-turboquant</w:t>
+        <w:t>[3] tradingkey.com(2026-09-22 접속). What Is Google TurboQuant Compression Algorithm? How Does It Affect the AI Memory Chip Industry?. tradingkey.com, https://tradingkey.com/analysis/stocks/us-stocks/261728257-what-is-google-turboquant-compression-algorithm-how-impact-ai-memory-chip-industry-tradingkey</w:t>
       </w:r>
     </w:p>
     <w:p>
@@ -11198,7 +11303,7 @@
           <w:b w:val="0"/>
           <w:sz w:val="20"/>
         </w:rPr>
-        <w:t>[4] tradingkey.com(2026-09-22 접속). What Is Google TurboQuant Compression Algorithm? How Does It Affect the AI Memory Chip Industry?. tradingkey.com, https://tradingkey.com/analysis/stocks/us-stocks/261728257-what-is-google-turboquant-compression-algorithm-how-impact-ai-memory-chip-industry-tradingkey</w:t>
+        <w:t>[4] sedaily.com(2026-09-22 접속). SK hynix Developing New NAND Products for KV Cache Demands - Seoul Economic Daily. en.sedaily.com, https://en.sedaily.com/finance/2026/07/29/sk-hynix-developing-new-nand-products-for-kv-cache-demands</w:t>
       </w:r>
     </w:p>
     <w:p>
@@ -11221,7 +11326,7 @@
           <w:b w:val="0"/>
           <w:sz w:val="20"/>
         </w:rPr>
-        <w:t>[5] SK hynix(2026-09-22 접속). The Next-Generation Memory Architecture in the AI Era? .... news.skhynix.com, https://news.skhynix.com/en/fms-2026</w:t>
+        <w:t>[5] AMD(2026-09-22 접속). Productionizing TurboQuant on AMD GPUs for KV-Cache-Bound .... rocm.blogs.amd.com, https://rocm.blogs.amd.com/artificial-intelligence/turboquant-vllm-agentic/README.html</w:t>
       </w:r>
     </w:p>
     <w:p>
@@ -11244,7 +11349,7 @@
           <w:b w:val="0"/>
           <w:sz w:val="20"/>
         </w:rPr>
-        <w:t>[6] semiwiki.com(2026-09-22 접속). SK Hynix proposes HBM and HBF hybrid for LLM inference. semiwiki.com, https://semiwiki.com/forum/threads/sk-hynix-proposes-hbm-and-hbf-hybrid-for-llm-inference.24754</w:t>
+        <w:t>[6] medium.com(2026-09-22 접속). TurboQuant Changes the Economics of Local AI Inference - Medium. medium.com, https://medium.com/@michael.hannecke/googles-turboquant-changes-the-economics-of-local-ai-inference-acce5839014d</w:t>
       </w:r>
     </w:p>
     <w:p>
@@ -11267,7 +11372,7 @@
           <w:b w:val="0"/>
           <w:sz w:val="20"/>
         </w:rPr>
-        <w:t>[7] medium.com(2026-09-22 접속). TurboQuant Changes the Economics of Local AI Inference - Medium. medium.com, https://medium.com/@michael.hannecke/googles-turboquant-changes-the-economics-of-local-ai-inference-acce5839014d</w:t>
+        <w:t>[7] arxiv.org(2026-09-22 접속). ITME: Inference Tiered Memory Expansion with .... arxiv.org, https://arxiv.org/html/2606.12556v2</w:t>
       </w:r>
     </w:p>
     <w:p>
@@ -11290,7 +11395,7 @@
           <w:b w:val="0"/>
           <w:sz w:val="20"/>
         </w:rPr>
-        <w:t>[8] AMD(2026-09-22 접속). Productionizing TurboQuant on AMD GPUs for KV-Cache-Bound .... rocm.blogs.amd.com, https://rocm.blogs.amd.com/artificial-intelligence/turboquant-vllm-agentic/README.html</w:t>
+        <w:t>[8] neurips.cc(2026-09-22 접속). HiFC: High-efficiency Flash-based KV Cache Swapping for .... papers.neurips.cc, https://papers.neurips.cc/paper_files/paper/2025/file/4431224d3762aa655f0aee4eaf04ff16-Paper-Conference.pdf</w:t>
       </w:r>
     </w:p>
     <w:p>
@@ -11313,7 +11418,7 @@
           <w:b w:val="0"/>
           <w:sz w:val="20"/>
         </w:rPr>
-        <w:t>[9] regolo.ai(2026-09-22 접속). Why TurboQuant matters for real-world LLM inference. regolo.ai, https://regolo.ai/why-turboquant-matters-for-real-world-llm-inference</w:t>
+        <w:t>[9] Google(2026-09-22 접속). TurboQuant: Redefining AI efficiency with extreme .... research.google, https://research.google/blog/turboquant-redefining-ai-efficiency-with-extreme-compression</w:t>
       </w:r>
     </w:p>
     <w:p>
@@ -11336,7 +11441,7 @@
           <w:b w:val="0"/>
           <w:sz w:val="20"/>
         </w:rPr>
-        <w:t>[10] arxiv.org(2026-09-22 접속). ITME: Inference Tiered Memory Expansion with .... arxiv.org, https://arxiv.org/html/2606.12556v2</w:t>
+        <w:t>[10] youtube.com(2026-09-22 접속). Google's TurboQuant Memory Reduction Claim vs Reality. youtube.com, https://www.youtube.com/watch?v=haoAI2lIZ74</w:t>
       </w:r>
     </w:p>
     <w:p>
@@ -11359,7 +11464,7 @@
           <w:b w:val="0"/>
           <w:sz w:val="20"/>
         </w:rPr>
-        <w:t>[11] vllm.ai(2026-09-22 접속). A First Comprehensive Study of TurboQuant: Accuracy and ... - vLLM. vllm.ai, https://vllm.ai/blog/2026-05-11-turboquant</w:t>
+        <w:t>[11] SK hynix(2026-09-22 접속). SK hynix Showcases Full-Stack AI Memory Portfolio at .... news.skhynix.com, https://news.skhynix.com/en/sk-hynix-showcases-full-stack-ai-memory-portfolio-at-2025-ocp-global-summit</w:t>
       </w:r>
     </w:p>
     <w:p>
@@ -11382,7 +11487,7 @@
           <w:b w:val="0"/>
           <w:sz w:val="20"/>
         </w:rPr>
-        <w:t>[12] neurips.cc(2026-09-22 접속). HiFC: High-efficiency Flash-based KV Cache Swapping for .... papers.neurips.cc, https://papers.neurips.cc/paper_files/paper/2025/file/4431224d3762aa655f0aee4eaf04ff16-Paper-Conference.pdf</w:t>
+        <w:t>[12] arxiv.org(2026-09-22 접속). [2606.12556] ITME: Inference Tiered Memory Expansion with Disaggregated CXL-Hybrid Memories. ar5iv.labs.arxiv.org, https://ar5iv.labs.arxiv.org/html/2606.12556</w:t>
       </w:r>
     </w:p>
     <w:p>
@@ -11405,7 +11510,7 @@
           <w:b w:val="0"/>
           <w:sz w:val="20"/>
         </w:rPr>
-        <w:t>[13] youtube.com(2026-09-22 접속). Google's TurboQuant Memory Reduction Claim vs Reality. youtube.com, https://www.youtube.com/watch?v=haoAI2lIZ74</w:t>
+        <w:t>[13] towardsai.net(2026-09-22 접속). Google's TurboQuant Explained: How They Cut LLM .... pub.towardsai.net, https://pub.towardsai.net/googles-turboquant-how-they-cut-llm-memory-by-6x-without-losing-accuracy-971313c9aa7e</w:t>
       </w:r>
     </w:p>
     <w:p>
@@ -11451,7 +11556,7 @@
           <w:b w:val="0"/>
           <w:sz w:val="20"/>
         </w:rPr>
-        <w:t>[15] Google(2026-09-22 접속). TurboQuant: Redefining AI efficiency with extreme .... research.google, https://research.google/blog/turboquant-redefining-ai-efficiency-with-extreme-compression</w:t>
+        <w:t>[15] hpe.com(2026-09-22 접속). How Google TurboQuant Stirred the AI Industry. community.hpe.com, https://community.hpe.com/t5/software-general/how-google-turboquant-stirred-the-ai-industry/td-p/7265346</w:t>
       </w:r>
     </w:p>
     <w:p>
@@ -11474,7 +11579,7 @@
           <w:b w:val="0"/>
           <w:sz w:val="20"/>
         </w:rPr>
-        <w:t>[16] arxiv.org(2026-09-22 접속). [2606.12556] ITME: Inference Tiered Memory Expansion with Disaggregated CXL-Hybrid Memories. ar5iv.labs.arxiv.org, https://ar5iv.labs.arxiv.org/html/2606.12556</w:t>
+        <w:t>[16] semiwiki.com(2026-09-22 접속). SK Hynix proposes HBM and HBF hybrid for LLM inference. semiwiki.com, https://semiwiki.com/forum/threads/sk-hynix-proposes-hbm-and-hbf-hybrid-for-llm-inference.24754</w:t>
       </w:r>
     </w:p>
     <w:p>
@@ -11497,7 +11602,7 @@
           <w:b w:val="0"/>
           <w:sz w:val="20"/>
         </w:rPr>
-        <w:t>[17] towardsai.net(2026-09-22 접속). Google's TurboQuant Explained: How They Cut LLM .... pub.towardsai.net, https://pub.towardsai.net/googles-turboquant-how-they-cut-llm-memory-by-6x-without-losing-accuracy-971313c9aa7e</w:t>
+        <w:t>[17] seagate.com(2026-09-22 접속). Enabling inference at massive scale with hybrid storage for .... seagate.com, https://www.seagate.com/resources/enabling-inference-at-massive-scale-with-hybrid-storage-for-kv-cache-offloading</w:t>
       </w:r>
     </w:p>
     <w:p>
@@ -11520,7 +11625,7 @@
           <w:b w:val="0"/>
           <w:sz w:val="20"/>
         </w:rPr>
-        <w:t>[18] everpuredata.com(2026-09-22 접속). TurboQuant Compresses KV Cache by 5X. Does That Mean You .... blog.everpuredata.com, https://blog.everpuredata.com/purely-technical/turboquant-compresses-kv-cache-by-5x-does-that-mean-you-need-less-memory</w:t>
+        <w:t>[18] tradingkey.com(2026-09-22 접속). SK Hynix Capacity Hits Zero: Tech Giants Offer to Fund Factories Amid AI Chip Shortage. tradingkey.com, https://www.tradingkey.com/analysis/stocks/more/261873534-sk-hynix-memory-shortage-capacity-tradingkey</w:t>
       </w:r>
     </w:p>
     <w:p>
@@ -11543,7 +11648,7 @@
           <w:b w:val="0"/>
           <w:sz w:val="20"/>
         </w:rPr>
-        <w:t>[19] digitalapplied.com(2026-09-22 접속). Google TurboQuant: 6x LLM Memory Compression Guide. digitalapplied.com, https://www.digitalapplied.com/blog/google-turboquant-6x-llm-memory-compression-guide</w:t>
+        <w:t>[19] futurumgroup.com(2026-09-22 접속). SK Hynix ADR Issuance Strategy. futurumgroup.com, https://futurumgroup.com/insights/will-sk-hynixs-record-265bn-adr-issuance-help-close-its-capex-intensity-gap</w:t>
       </w:r>
     </w:p>
     <w:p>
@@ -11566,7 +11671,7 @@
           <w:b w:val="0"/>
           <w:sz w:val="20"/>
         </w:rPr>
-        <w:t>[20] sedaily.com(2026-09-22 접속). SK hynix Developing New NAND Products for KV Cache Demands - Seoul Economic Daily. en.sedaily.com, https://en.sedaily.com/finance/2026/07/29/sk-hynix-developing-new-nand-products-for-kv-cache-demands</w:t>
+        <w:t>[20] whatthechiphappened.com(2026-09-22 접속). The Market Just Sold Micron on a Paper It Did Not Read. news.whatthechiphappened.com, https://news.whatthechiphappened.com/p/the-market-just-sold-micron-on-a</w:t>
       </w:r>
     </w:p>
     <w:p>
@@ -11589,7 +11694,7 @@
           <w:b w:val="0"/>
           <w:sz w:val="20"/>
         </w:rPr>
-        <w:t>[21] hpe.com(2026-09-22 접속). How Google TurboQuant Stirred the AI Industry. community.hpe.com, https://community.hpe.com/t5/software-general/how-google-turboquant-stirred-the-ai-industry/td-p/7265346</w:t>
+        <w:t>[21] NVIDIA(2026-09-22 접속). Why Turboquant saves DGX twice - NVIDIA Developer Forums. forums.developer.nvidia.com, https://forums.developer.nvidia.com/t/why-turboquant-saves-dgx-twice/364736</w:t>
       </w:r>
     </w:p>
     <w:p>
@@ -11612,7 +11717,7 @@
           <w:b w:val="0"/>
           <w:sz w:val="20"/>
         </w:rPr>
-        <w:t>[22] medium.com(2026-09-22 접속). Implementing Google's TurboQuant: KV Cache Compression and .... medium.com, https://medium.com/online-inference/implementing-googles-turboquant-kv-cache-compression-and-llm-evaluation-with-w-b-1403d460846b</w:t>
+        <w:t>[22] towardsdatascience.com(2026-09-22 접속). KV Cache Is Eating Your VRAM. Here's How Google Fixed .... towardsdatascience.com, https://towardsdatascience.com/kv-cache-is-eating-your-vram-heres-how-google-fixed-it-with-turboquant</w:t>
       </w:r>
     </w:p>
     <w:p>
@@ -11635,7 +11740,7 @@
           <w:b w:val="0"/>
           <w:sz w:val="20"/>
         </w:rPr>
-        <w:t>[23] futurumgroup.com(2026-09-22 접속). SK Hynix ADR Issuance Strategy. futurumgroup.com, https://futurumgroup.com/insights/will-sk-hynixs-record-265bn-adr-issuance-help-close-its-capex-intensity-gap</w:t>
+        <w:t>[23] reddit.com(2026-09-22 접속). [google research] TurboQuant: Redefining AI efficiency .... reddit.com, https://www.reddit.com/r/LocalLLaMA/comments/1s2su28/google_research_turboquant_redefining_ai</w:t>
       </w:r>
     </w:p>
     <w:p>
@@ -11658,7 +11763,7 @@
           <w:b w:val="0"/>
           <w:sz w:val="20"/>
         </w:rPr>
-        <w:t>[24] seagate.com(2026-09-22 접속). Enabling inference at massive scale with hybrid storage for .... seagate.com, https://www.seagate.com/resources/enabling-inference-at-massive-scale-with-hybrid-storage-for-kv-cache-offloading</w:t>
+        <w:t>[24] decodingdiscontinuity.com(2026-09-22 접속). Why TurboQuant Triggered a $100B Memory Stock Sell-Off. decodingdiscontinuity.com, https://www.decodingdiscontinuity.com/p/turboquant-memory-stock-sell-off-panic-paper-google</w:t>
       </w:r>
     </w:p>
     <w:p>
@@ -11681,7 +11786,7 @@
           <w:b w:val="0"/>
           <w:sz w:val="20"/>
         </w:rPr>
-        <w:t>[25] biggo.com(2026-09-22 접속). DeepSeek's New Model Claims Sharp Cut in HBM Usage; Samsung and SK Hynix Plunge Over 3% Intraday. finance.biggo.com, https://finance.biggo.com/news/d8eafdaf-6ff4-490e-b2ea-62f13e1974c9</w:t>
+        <w:t>[25] yahoo.com(2026-09-22 접속). What TurboQuant Actually Means for AI Memory Stocks. finance.yahoo.com, https://finance.yahoo.com/markets/stocks/articles/turboquant-actually-means-ai-memory-125500558.html</w:t>
       </w:r>
     </w:p>
     <w:p>
@@ -11704,7 +11809,7 @@
           <w:b w:val="0"/>
           <w:sz w:val="20"/>
         </w:rPr>
-        <w:t>[26] startupfortune.com(2026-09-22 접속). DeepSeek's New AI Model Spooked Samsung and SK Hynix Investors. startupfortune.com, https://startupfortune.com/deepseeks-new-ai-model-spooked-samsung-and-sk-hynix-investors</w:t>
+        <w:t>[26] mindstudio.ai(2026-09-22 접속). What Is Google TurboQuant? The KV Cache Compression That .... mindstudio.ai, https://www.mindstudio.ai/blog/what-is-google-turboquant-kv-cache-compression</w:t>
       </w:r>
     </w:p>
     <w:p>
@@ -11727,7 +11832,7 @@
           <w:b w:val="0"/>
           <w:sz w:val="20"/>
         </w:rPr>
-        <w:t>[27] NVIDIA(2026-09-22 접속). Why Turboquant saves DGX twice - NVIDIA Developer Forums. forums.developer.nvidia.com, https://forums.developer.nvidia.com/t/why-turboquant-saves-dgx-twice/364736</w:t>
+        <w:t>[27] biggo.com(2026-09-22 접속). DeepSeek's New Model Claims Sharp Cut in HBM Usage; Samsung and SK Hynix Plunge Over 3% Intraday. finance.biggo.com, https://finance.biggo.com/news/d8eafdaf-6ff4-490e-b2ea-62f13e1974c9</w:t>
       </w:r>
     </w:p>
     <w:p>
@@ -11750,7 +11855,7 @@
           <w:b w:val="0"/>
           <w:sz w:val="20"/>
         </w:rPr>
-        <w:t>[28] reddit.com(2026-09-22 접속). [google research] TurboQuant: Redefining AI efficiency .... reddit.com, https://www.reddit.com/r/LocalLLaMA/comments/1s2su28/google_research_turboquant_redefining_ai</w:t>
+        <w:t>[28] investing.com(2026-09-22 접속). SK Hynix outlook revised to positive by S&amp;P and Fitch on memory chip strength By Investing.com. investing.com, https://www.investing.com/news/stock-market-news/sk-hynix-outlook-revised-to-positive-by-sp-and-fitch-on-memory-chip-strength-93CH-4209005</w:t>
       </w:r>
     </w:p>
     <w:p>
@@ -11773,7 +11878,7 @@
           <w:b w:val="0"/>
           <w:sz w:val="20"/>
         </w:rPr>
-        <w:t>[29] theinvestor.co.kr(2026-09-22 접속). Google TurboQuant: Separating hype from reality - THE INVESTOR. theinvestor.co.kr, https://www.theinvestor.co.kr/article/10716199</w:t>
+        <w:t>[29] yahoo.com(2026-09-22 접속). Analysts Still See Massive Upside for SK Hynix — The AI Cycle Isn’t Done But Questions Remain. finance.yahoo.com, https://finance.yahoo.com/markets/stocks/articles/analysts-still-see-massive-upside-151554133.html</w:t>
       </w:r>
     </w:p>
     <w:p>
@@ -11796,7 +11901,7 @@
           <w:b w:val="0"/>
           <w:sz w:val="20"/>
         </w:rPr>
-        <w:t>[30] decodingdiscontinuity.com(2026-09-22 접속). Why TurboQuant Triggered a $100B Memory Stock Sell-Off. decodingdiscontinuity.com, https://www.decodingdiscontinuity.com/p/turboquant-memory-stock-sell-off-panic-paper-google</w:t>
+        <w:t>[30] everpuredata.com(2026-09-22 접속). TurboQuant Compresses KV Cache by 5X. Does That Mean You .... blog.everpuredata.com, https://blog.everpuredata.com/purely-technical/turboquant-compresses-kv-cache-by-5x-does-that-mean-you-need-less-memory</w:t>
       </w:r>
     </w:p>
     <w:p>
@@ -11819,7 +11924,7 @@
           <w:b w:val="0"/>
           <w:sz w:val="20"/>
         </w:rPr>
-        <w:t>[31] yahoo.com(2026-09-22 접속). What TurboQuant Actually Means for AI Memory Stocks. finance.yahoo.com, https://finance.yahoo.com/markets/stocks/articles/turboquant-actually-means-ai-memory-125500558.html</w:t>
+        <w:t>[31] lighthouse-canton.com(2026-09-22 접속). TurboQuant: Why It Changes Nothing for Memory - Lighthouse Canton. lighthouse-canton.com, https://www.lighthouse-canton.com/insights/turboquant-why-it-changes-nothing-for-the-memory-trade-equity-insights</w:t>
       </w:r>
     </w:p>
     <w:p>
@@ -11842,7 +11947,7 @@
           <w:b w:val="0"/>
           <w:sz w:val="20"/>
         </w:rPr>
-        <w:t>[32] mindstudio.ai(2026-09-22 접속). What Is Google TurboQuant? The KV Cache Compression That .... mindstudio.ai, https://www.mindstudio.ai/blog/what-is-google-turboquant-kv-cache-compression</w:t>
+        <w:t>[32] medium.com(2026-09-22 접속). Medium. medium.com, https://medium.com/@anupkawarase.akz/turboquant-how-googles-6x-kv-cache-compression-changes-llm-inference-forever-1110e4be289e</w:t>
       </w:r>
     </w:p>
     <w:p>
@@ -11865,7 +11970,7 @@
           <w:b w:val="0"/>
           <w:sz w:val="20"/>
         </w:rPr>
-        <w:t>[33] tradingkey.com(2026-09-22 접속). SK Hynix Capacity Hits Zero: Tech Giants Offer to Fund Factories Amid AI Chip Shortage. tradingkey.com, https://www.tradingkey.com/analysis/stocks/more/261873534-sk-hynix-memory-shortage-capacity-tradingkey</w:t>
+        <w:t>[33] Intel(2026-09-22 접속). Enhancing long-context, high-concurrency LLM serving on a 32 GB .... community.intel.com, https://community.intel.com/t5/Blogs/Tech-Innovation/Data-Center/Enhancing-long-context-high-concurrency-LLM-serving-on-a-32-GB/post/1751209</w:t>
       </w:r>
     </w:p>
     <w:p>
@@ -11888,168 +11993,7 @@
           <w:b w:val="0"/>
           <w:sz w:val="20"/>
         </w:rPr>
-        <w:t>[34] whatthechiphappened.com(2026-09-22 접속). The Market Just Sold Micron on a Paper It Did Not Read. news.whatthechiphappened.com, https://news.whatthechiphappened.com/p/the-market-just-sold-micron-on-a</w:t>
-      </w:r>
-    </w:p>
-    <w:p>
-      <w:pPr>
-        <w:spacing w:after="40" w:line="312" w:lineRule="auto"/>
-        <w:ind w:left="312" w:hanging="227"/>
-      </w:pPr>
-      <w:r>
-        <w:rPr>
-          <w:rFonts w:ascii="맑은 고딕" w:hAnsi="맑은 고딕" w:eastAsia="맑은 고딕" w:cs="맑은 고딕"/>
-          <w:b/>
-          <w:color w:val="7F4ACB"/>
-          <w:sz w:val="20"/>
-        </w:rPr>
-        <w:t xml:space="preserve">• </w:t>
-      </w:r>
-      <w:r>
-        <w:rPr>
-          <w:rFonts w:ascii="맑은 고딕" w:hAnsi="맑은 고딕" w:eastAsia="맑은 고딕" w:cs="맑은 고딕"/>
-          <w:b w:val="0"/>
-          <w:sz w:val="20"/>
-        </w:rPr>
-        <w:t>[35] morningstar.com(2026-09-22 접속). SK Hynix suggests its stock is too cheap as it embarks on $29 billion buyback · Morningstar. morningstar.com, https://www.morningstar.com/news/marketwatch/2026081999/sk-hynix-suggests-its-stock-is-too-cheap-as-it-embarks-on-29-billion-buyback</w:t>
-      </w:r>
-    </w:p>
-    <w:p>
-      <w:pPr>
-        <w:spacing w:after="40" w:line="312" w:lineRule="auto"/>
-        <w:ind w:left="312" w:hanging="227"/>
-      </w:pPr>
-      <w:r>
-        <w:rPr>
-          <w:rFonts w:ascii="맑은 고딕" w:hAnsi="맑은 고딕" w:eastAsia="맑은 고딕" w:cs="맑은 고딕"/>
-          <w:b/>
-          <w:color w:val="7F4ACB"/>
-          <w:sz w:val="20"/>
-        </w:rPr>
-        <w:t xml:space="preserve">• </w:t>
-      </w:r>
-      <w:r>
-        <w:rPr>
-          <w:rFonts w:ascii="맑은 고딕" w:hAnsi="맑은 고딕" w:eastAsia="맑은 고딕" w:cs="맑은 고딕"/>
-          <w:b w:val="0"/>
-          <w:sz w:val="20"/>
-        </w:rPr>
-        <w:t>[36] lighthouse-canton.com(2026-09-22 접속). TurboQuant: Why It Changes Nothing for Memory - Lighthouse Canton. lighthouse-canton.com, https://www.lighthouse-canton.com/insights/turboquant-why-it-changes-nothing-for-the-memory-trade-equity-insights</w:t>
-      </w:r>
-    </w:p>
-    <w:p>
-      <w:pPr>
-        <w:spacing w:after="40" w:line="312" w:lineRule="auto"/>
-        <w:ind w:left="312" w:hanging="227"/>
-      </w:pPr>
-      <w:r>
-        <w:rPr>
-          <w:rFonts w:ascii="맑은 고딕" w:hAnsi="맑은 고딕" w:eastAsia="맑은 고딕" w:cs="맑은 고딕"/>
-          <w:b/>
-          <w:color w:val="7F4ACB"/>
-          <w:sz w:val="20"/>
-        </w:rPr>
-        <w:t xml:space="preserve">• </w:t>
-      </w:r>
-      <w:r>
-        <w:rPr>
-          <w:rFonts w:ascii="맑은 고딕" w:hAnsi="맑은 고딕" w:eastAsia="맑은 고딕" w:cs="맑은 고딕"/>
-          <w:b w:val="0"/>
-          <w:sz w:val="20"/>
-        </w:rPr>
-        <w:t>[37] vast.ai(2026-09-22 접속). TurboQuant Explained: How It Reduces LLM Memory by 5x and .... vast.ai, https://vast.ai/article/turboquant-explained-llm-memory-inference</w:t>
-      </w:r>
-    </w:p>
-    <w:p>
-      <w:pPr>
-        <w:spacing w:after="40" w:line="312" w:lineRule="auto"/>
-        <w:ind w:left="312" w:hanging="227"/>
-      </w:pPr>
-      <w:r>
-        <w:rPr>
-          <w:rFonts w:ascii="맑은 고딕" w:hAnsi="맑은 고딕" w:eastAsia="맑은 고딕" w:cs="맑은 고딕"/>
-          <w:b/>
-          <w:color w:val="7F4ACB"/>
-          <w:sz w:val="20"/>
-        </w:rPr>
-        <w:t xml:space="preserve">• </w:t>
-      </w:r>
-      <w:r>
-        <w:rPr>
-          <w:rFonts w:ascii="맑은 고딕" w:hAnsi="맑은 고딕" w:eastAsia="맑은 고딕" w:cs="맑은 고딕"/>
-          <w:b w:val="0"/>
-          <w:sz w:val="20"/>
-        </w:rPr>
-        <w:t>[38] turbo-quant.com(2026-09-22 접속). Google TurboQuant — Paper, Tools, Benchmarks &amp; Framework Status. turbo-quant.com, https://turbo-quant.com</w:t>
-      </w:r>
-    </w:p>
-    <w:p>
-      <w:pPr>
-        <w:spacing w:after="40" w:line="312" w:lineRule="auto"/>
-        <w:ind w:left="312" w:hanging="227"/>
-      </w:pPr>
-      <w:r>
-        <w:rPr>
-          <w:rFonts w:ascii="맑은 고딕" w:hAnsi="맑은 고딕" w:eastAsia="맑은 고딕" w:cs="맑은 고딕"/>
-          <w:b/>
-          <w:color w:val="7F4ACB"/>
-          <w:sz w:val="20"/>
-        </w:rPr>
-        <w:t xml:space="preserve">• </w:t>
-      </w:r>
-      <w:r>
-        <w:rPr>
-          <w:rFonts w:ascii="맑은 고딕" w:hAnsi="맑은 고딕" w:eastAsia="맑은 고딕" w:cs="맑은 고딕"/>
-          <w:b w:val="0"/>
-          <w:sz w:val="20"/>
-        </w:rPr>
-        <w:t>[39] Intel(2026-09-22 접속). Enhancing long-context, high-concurrency LLM serving on a 32 GB .... community.intel.com, https://community.intel.com/t5/Blogs/Tech-Innovation/Data-Center/Enhancing-long-context-high-concurrency-LLM-serving-on-a-32-GB/post/1751209</w:t>
-      </w:r>
-    </w:p>
-    <w:p>
-      <w:pPr>
-        <w:spacing w:after="40" w:line="312" w:lineRule="auto"/>
-        <w:ind w:left="312" w:hanging="227"/>
-      </w:pPr>
-      <w:r>
-        <w:rPr>
-          <w:rFonts w:ascii="맑은 고딕" w:hAnsi="맑은 고딕" w:eastAsia="맑은 고딕" w:cs="맑은 고딕"/>
-          <w:b/>
-          <w:color w:val="7F4ACB"/>
-          <w:sz w:val="20"/>
-        </w:rPr>
-        <w:t xml:space="preserve">• </w:t>
-      </w:r>
-      <w:r>
-        <w:rPr>
-          <w:rFonts w:ascii="맑은 고딕" w:hAnsi="맑은 고딕" w:eastAsia="맑은 고딕" w:cs="맑은 고딕"/>
-          <w:b w:val="0"/>
-          <w:sz w:val="20"/>
-        </w:rPr>
-        <w:t>[40] jangwook.net(2026-09-22 접속). Google TurboQuant: 3-Bit KV Cache With Zero Accuracy Loss. jangwook.net, https://jangwook.net/en/blog/en/google-turboquant-kv-cache-3bit-compression</w:t>
-      </w:r>
-    </w:p>
-    <w:p>
-      <w:pPr>
-        <w:spacing w:after="40" w:line="312" w:lineRule="auto"/>
-        <w:ind w:left="312" w:hanging="227"/>
-      </w:pPr>
-      <w:r>
-        <w:rPr>
-          <w:rFonts w:ascii="맑은 고딕" w:hAnsi="맑은 고딕" w:eastAsia="맑은 고딕" w:cs="맑은 고딕"/>
-          <w:b/>
-          <w:color w:val="7F4ACB"/>
-          <w:sz w:val="20"/>
-        </w:rPr>
-        <w:t xml:space="preserve">• </w:t>
-      </w:r>
-      <w:r>
-        <w:rPr>
-          <w:rFonts w:ascii="맑은 고딕" w:hAnsi="맑은 고딕" w:eastAsia="맑은 고딕" w:cs="맑은 고딕"/>
-          <w:b w:val="0"/>
-          <w:sz w:val="20"/>
-        </w:rPr>
-        <w:t>[41] arxiv.org(2026-09-22 접속). HyMCache: A KV Cache Frameworkfor Multi-Turn LLM .... arxiv.org, https://arxiv.org/html/2607.18141v2</w:t>
+        <w:t>[34] regolo.ai(2026-09-22 접속). Why TurboQuant matters for real-world LLM inference. regolo.ai, https://regolo.ai/why-turboquant-matters-for-real-world-llm-inference</w:t>
       </w:r>
     </w:p>
     <w:sectPr>

</xml_diff>

<commit_message>
Final report (14:28 run): code-judged H2, updated submission folder and notes
- D54: H2 judged by code (technology vs ecosystem mentions per technology)
- regenerated caches, report (16 pages, no blank page), state snapshot, RUBRIC_CHECK (12/12)
- submission/: new report PDF, updated guide/team briefing, presentation notes, README
</commit_message>
<xml_diff>
--- a/outputs/RAG-Output_판교_9반_김정인+김지수+김진수+전진만+정원준.docx
+++ b/outputs/RAG-Output_판교_9반_김정인+김지수+김진수+전진만+정원준.docx
@@ -914,7 +914,7 @@
                 <w:b w:val="0"/>
                 <w:sz w:val="17"/>
               </w:rPr>
-              <w:t>4.0 평가 기준 (8) · 4.1 기술 성숙도(TRL) (8) · 4.2 시장성 (8) · 4.3 이해관계자 (9) · 4.4 도메인 적합성(W1·W2) (9)</w:t>
+              <w:t>4.0 평가 기준 (7) · 4.1 기술 성숙도(TRL) (8) · 4.2 시장성 (8) · 4.3 이해관계자 (9) · 4.4 도메인 적합성(W1·W2) (9)</w:t>
             </w:r>
           </w:p>
         </w:tc>
@@ -939,7 +939,7 @@
                 <w:b w:val="0"/>
                 <w:sz w:val="17"/>
               </w:rPr>
-              <w:t>8</w:t>
+              <w:t>7</w:t>
             </w:r>
           </w:p>
         </w:tc>
@@ -995,7 +995,7 @@
                 <w:b w:val="0"/>
                 <w:sz w:val="17"/>
               </w:rPr>
-              <w:t>5.1 관점 간 일치·상충 표 (11) · 5.2 주요 상충 지점 (11) · 5.3 가설 판정 (11) · 5.4 조건별 시사점(추천 아님) (11) · 5.5 기준값 민감도 점검 (12)</w:t>
+              <w:t>5.1 관점 간 일치·상충 표 (10) · 5.2 주요 상충 지점 (10) · 5.3 가설 판정 (10) · 5.4 조건별 시사점(추천 아님) (11) · 5.5 기준값 민감도 점검 (11)</w:t>
             </w:r>
           </w:p>
         </w:tc>
@@ -1020,7 +1020,7 @@
                 <w:b w:val="0"/>
                 <w:sz w:val="17"/>
               </w:rPr>
-              <w:t>11</w:t>
+              <w:t>10</w:t>
             </w:r>
           </w:p>
         </w:tc>
@@ -1076,7 +1076,7 @@
                 <w:b w:val="0"/>
                 <w:sz w:val="17"/>
               </w:rPr>
-              <w:t>6.1 공개 정보 기반 추정의 한계 (13) · 6.2 확증편향 방지 조치와 실행 결과 (13) · 6.3 분석 방법의 한계 (13)</w:t>
+              <w:t>6.1 공개 정보 기반 추정의 한계 (11) · 6.2 확증편향 방지 조치와 실행 결과 (12) · 6.3 분석 방법의 한계 (12)</w:t>
             </w:r>
           </w:p>
         </w:tc>
@@ -1101,7 +1101,7 @@
                 <w:b w:val="0"/>
                 <w:sz w:val="17"/>
               </w:rPr>
-              <w:t>13</w:t>
+              <w:t>11</w:t>
             </w:r>
           </w:p>
         </w:tc>
@@ -1171,7 +1171,7 @@
                 <w:b w:val="0"/>
                 <w:sz w:val="17"/>
               </w:rPr>
-              <w:t>15</w:t>
+              <w:t>13</w:t>
             </w:r>
           </w:p>
         </w:tc>
@@ -1223,7 +1223,7 @@
           <w:b w:val="0"/>
           <w:sz w:val="20"/>
         </w:rPr>
-        <w:t>TurboQuant: TRL 5–7(추정, 신뢰도 높음), 시장성 판단 보류, 이해관계자 5.00, 도메인 적합성 4.75 [1, p.15; 3]</w:t>
+        <w:t>TurboQuant: TRL 4–6(추정, 신뢰도 높음), 시장성 4.45, 이해관계자 5.00, 도메인 적합성 4.78 [1, p.15; 3]</w:t>
       </w:r>
     </w:p>
     <w:p>
@@ -1246,7 +1246,7 @@
           <w:b w:val="0"/>
           <w:sz w:val="20"/>
         </w:rPr>
-        <w:t>ITME: TRL 5–6(추정, 신뢰도 높음), 시장성 5.00, 이해관계자 4.33, 도메인 적합성 판단 보류 [2, p.8; 4]</w:t>
+        <w:t>ITME: TRL 5–6(추정, 신뢰도 보통), 시장성 판단 보류, 이해관계자 4.50, 도메인 적합성 판단 보류 [2, p.8]</w:t>
       </w:r>
     </w:p>
     <w:p>
@@ -1269,7 +1269,7 @@
           <w:b w:val="0"/>
           <w:sz w:val="20"/>
         </w:rPr>
-        <w:t>가설 판정: H1 부분 지지, H2 지지, H3 판단 보류, H4 판단 보류 [2, p.8·10; 1, p.15]</w:t>
+        <w:t>가설 판정: H1 부분 지지, H2 기각, H3 판단 보류, H4 부분 지지 [2, p.2·8]</w:t>
       </w:r>
     </w:p>
     <w:p>
@@ -1292,7 +1292,7 @@
           <w:b w:val="0"/>
           <w:sz w:val="20"/>
         </w:rPr>
-        <w:t>TurboQuant은 TRL 5에서 7 사이로 실험실 검증부터 시제품 시연 단계까지 근거가 보고되었다[1, p.15·16·19; 5; 6; 3].</w:t>
+        <w:t>TurboQuant은 NVIDIA A100 GPU와 실제 데이터셋을 이용한 KV cache 양자화 실험과 긴 문맥 검색 벤치마크를 통해 TRL 4~6 범위에서 실험실 환경 검증이 이루어졌다[1, p.15·16·19; 3; 4; 5].</w:t>
       </w:r>
     </w:p>
     <w:p>
@@ -1315,7 +1315,7 @@
           <w:b w:val="0"/>
           <w:sz w:val="20"/>
         </w:rPr>
-        <w:t>ITME는 TRL 5에서 6 사이로 실제 서버 환경과 FPGA 프로토타입 검증, 시제품 시연 가능성 근거가 존재한다[2, p.8·10; 7; 4].</w:t>
+        <w:t>ITME는 Dell 서버와 CXL-하이브리드 메모리 환경에서 FPGA 프로토타입을 통한 실환경 검증으로 TRL 5~6 단계로 평가되며, SK hynix의 NAND 제품 개발 계획이 시제품 시연 가능성을 시사한다[2, p.8·10; 6].</w:t>
       </w:r>
     </w:p>
     <w:p>
@@ -5103,11 +5103,6 @@
       </w:pPr>
     </w:p>
     <w:p>
-      <w:r>
-        <w:br w:type="page"/>
-      </w:r>
-    </w:p>
-    <w:p>
       <w:pPr>
         <w:pStyle w:val="Heading1"/>
         <w:keepNext/>
@@ -5384,7 +5379,7 @@
                 <w:b w:val="0"/>
                 <w:sz w:val="17"/>
               </w:rPr>
-              <w:t>5–7</w:t>
+              <w:t>4–6</w:t>
             </w:r>
           </w:p>
         </w:tc>
@@ -5434,7 +5429,7 @@
                 <w:b w:val="0"/>
                 <w:sz w:val="17"/>
               </w:rPr>
-              <w:t>[1, p.15·16·19; 5]</w:t>
+              <w:t>[1, p.15·16·19; 7; 8; 9; 10; 11; 12; 13; 14; 15]</w:t>
             </w:r>
           </w:p>
         </w:tc>
@@ -5459,7 +5454,7 @@
                 <w:b w:val="0"/>
                 <w:sz w:val="17"/>
               </w:rPr>
-              <w:t>[3; 5; 6]</w:t>
+              <w:t>[3; 16; 5; 17; 4]</w:t>
             </w:r>
           </w:p>
         </w:tc>
@@ -5536,7 +5531,7 @@
                 <w:b w:val="0"/>
                 <w:sz w:val="17"/>
               </w:rPr>
-              <w:t>높음</w:t>
+              <w:t>보통</w:t>
             </w:r>
           </w:p>
         </w:tc>
@@ -5560,7 +5555,7 @@
                 <w:b w:val="0"/>
                 <w:sz w:val="17"/>
               </w:rPr>
-              <w:t>[2, p.8·10; 7]</w:t>
+              <w:t>[2, p.8·10]</w:t>
             </w:r>
           </w:p>
         </w:tc>
@@ -5584,7 +5579,7 @@
                 <w:b w:val="0"/>
                 <w:sz w:val="17"/>
               </w:rPr>
-              <w:t>[4]</w:t>
+              <w:t>[2, p.8·10; 6]</w:t>
             </w:r>
           </w:p>
         </w:tc>
@@ -5605,7 +5600,7 @@
           <w:b w:val="0"/>
           <w:sz w:val="20"/>
         </w:rPr>
-        <w:t>TRL은 공개 정보로 추정한 범위이다. 하한은 공개 근거로 확인된 가장 높은 단계, 상한은 발표·계획 같은 부분 신호로 보이는 단계이며, 양쪽 모두 개발사 외 독립 근거가 있으면 신뢰도 높음, 한쪽만 있으면 보통, 개발사 자료뿐이면 낮음이다(설계서 C.4). TurboQuant은 NVIDIA A100 GPU에서 KV 캐시 양자화 실험과 여러 데이터셋 검증을 통해 TRL 4 단계 실험실 환경 검증을 충족하며, vLLM 엔진에서 AMD GPU용 생산 준비 구현으로 TRL 5 단계 유사 환경 통합 검증 근거가 있다[1, p.15·16·19; 5]. 또한, 생산 서빙 프레임워크 통합 계획과 공식 출시 발표로 TRL 7 단계 시제품 시연 가능성도 보고되었다[6; 3]. 다만 실제 고객사 시범 적용이나 장기간 실서비스 시험에 대한 공개 정보는 아직 없다. ITME는 실제 서버와 GPU를 포함한 하드웨어 환경에서 기능과 성능을 검증하고 FPGA 프로토타입으로 하드웨어 구현 가능성을 입증했으며, vLLM 프레임워크와 통합하여 유사 환경에서 검증된 점이 확인된다[2, p.8·10; 7]. SK hynix의 NAND 제품 개발 보도는 시제품 시연 단계 가능성을 시사하나 구체적 시연 결과는 공개되지 않았다[4].</w:t>
+        <w:t>TRL은 공개 정보로 추정한 범위이다. 하한은 공개 근거로 확인된 가장 높은 단계, 상한은 발표·계획 같은 부분 신호로 보이는 단계이며, 양쪽 모두 개발사 외 독립 근거가 있으면 신뢰도 높음, 한쪽만 있으면 보통, 개발사 자료뿐이면 낮음이다(설계서 C.4). TurboQuant은 NVIDIA A100 GPU 기반 실험과 긴 문맥 검색 벤치마크를 통해 TRL 4~6 범위에서 실험실 환경 검증이 이루어졌으며, 커뮤니티 구현이 vLLM과 통합되어 실제 워크로드에서 성능 개선을 보이고 있다. 다만 Google 공식 구현은 아직 공개되지 않아 완전한 생산 준비성은 확인되지 않았다[1, p.15·16·19; 3; 4; 5]. ITME는 Dell 서버와 CXL-하이브리드 메모리 환경에서 FPGA 프로토타입을 통한 실환경 검증으로 TRL 5~6 단계로 평가되며, SK hynix의 NAND 제품 개발 계획은 시제품 시연 가능성을 보여주나 실제 시제품 시연이나 고객사 적용에 대한 공개 정보는 부족하다[2, p.8·10; 6].</w:t>
       </w:r>
     </w:p>
     <w:p>
@@ -5783,7 +5778,7 @@
                 <w:b w:val="0"/>
                 <w:sz w:val="17"/>
               </w:rPr>
-              <w:t>판단 보류</w:t>
+              <w:t>4.00 [18; 19; 20]</w:t>
             </w:r>
           </w:p>
         </w:tc>
@@ -5808,7 +5803,7 @@
                 <w:b w:val="0"/>
                 <w:sz w:val="17"/>
               </w:rPr>
-              <w:t>5.00 [8; 4]</w:t>
+              <w:t>판단 보류 [2, p.2]</w:t>
             </w:r>
           </w:p>
         </w:tc>
@@ -5863,7 +5858,7 @@
                 <w:b w:val="0"/>
                 <w:sz w:val="17"/>
               </w:rPr>
-              <w:t>5.00 [9; 10]</w:t>
+              <w:t>4.00 [8; 21; 22; 23]</w:t>
             </w:r>
           </w:p>
         </w:tc>
@@ -5943,7 +5938,7 @@
                 <w:b w:val="0"/>
                 <w:sz w:val="17"/>
               </w:rPr>
-              <w:t>판단 보류</w:t>
+              <w:t>5.00 [24; 21]</w:t>
             </w:r>
           </w:p>
         </w:tc>
@@ -5968,7 +5963,7 @@
                 <w:b w:val="0"/>
                 <w:sz w:val="17"/>
               </w:rPr>
-              <w:t>5.00 [11; 12]</w:t>
+              <w:t>판단 보류 [25]</w:t>
             </w:r>
           </w:p>
         </w:tc>
@@ -6023,7 +6018,7 @@
                 <w:b w:val="0"/>
                 <w:sz w:val="17"/>
               </w:rPr>
-              <w:t>판단 보류 [13]</w:t>
+              <w:t>5.00 [26; 27]</w:t>
             </w:r>
           </w:p>
         </w:tc>
@@ -6103,7 +6098,7 @@
                 <w:color w:val="161A58"/>
                 <w:sz w:val="17"/>
               </w:rPr>
-              <w:t>판단 보류</w:t>
+              <w:t>4.45</w:t>
             </w:r>
           </w:p>
         </w:tc>
@@ -6128,7 +6123,7 @@
                 <w:color w:val="161A58"/>
                 <w:sz w:val="17"/>
               </w:rPr>
-              <w:t>5.00</w:t>
+              <w:t>판단 보류</w:t>
             </w:r>
           </w:p>
         </w:tc>
@@ -6149,7 +6144,7 @@
           <w:b w:val="0"/>
           <w:sz w:val="20"/>
         </w:rPr>
-        <w:t>TurboQuant는 KV 캐시 메모리 사용량을 크게 줄이고 속도 향상을 달성하는 기술로 실험적 평가가 보고되었으며, 메모리 절감과 정확도 손실 간 상충관계를 극복하는 도입 비용 구조를 갖추고 있다[10; 9; 13]. 다만 시장 규모·성장과 생태계 지원에 대한 구체적 근거는 부족하여 시장성 평가가 보류되었다. ITME는 LLM 추론 시장 성장과 수요에 부합하는 NAND 기반 KV 캐시 확장 기술을 개발하고 있으며, 실제 Llama-3.1 모델에서 성능 향상을 입증하고 AiMX 카드와 같은 하드웨어 최적화 사례도 존재한다[2, p.9; 11]. 또한 CXL 하이브리드 메모리와 PCIe Gen5 인터페이스를 활용한 다계층 메모리 관리 및 생태계 통합 측면에서 구체적인 구현과 전략이 보고되었다[11; 12; 7]. 다만 도입 비용 구조에 관한 근거는 부족하다.</w:t>
+        <w:t>TurboQuant은 KV 캐시 메모리 사용량을 최대 6배까지 줄이면서 정확도 손실이 거의 없다는 긍정적 평가가 다수 보고되었고, vLLM, llama.cpp 등 주요 오픈소스 추론 엔진에 통합되어 초기 검증이 진행 중이다[18; 8; 21; 28; 29]. 다만 일부 평가에서는 KV 캐시만 줄이며 전체 메모리 감소로 직결되지 않고 기존 방법 대비 성능이 떨어진다는 의견도 있어 수요가 불확실하다[20]. ITME는 대규모 추론 지원과 성능 향상 근거가 클라우드·데이터센터 사업자 집단에서 보고되었으나, 도입 비용 구조에 관한 근거가 부족해 시장성 판단은 보류된다[30; 31].</w:t>
       </w:r>
     </w:p>
     <w:p>
@@ -6327,7 +6322,7 @@
                 <w:b w:val="0"/>
                 <w:sz w:val="17"/>
               </w:rPr>
-              <w:t>지지(5) [14; 15; 10]</w:t>
+              <w:t>지지(5) [18; 28; 32]</w:t>
             </w:r>
           </w:p>
         </w:tc>
@@ -6352,7 +6347,7 @@
                 <w:b w:val="0"/>
                 <w:sz w:val="17"/>
               </w:rPr>
-              <w:t>지지(5) [16; 17; 18]</w:t>
+              <w:t>지지(5) [30; 31; 33]</w:t>
             </w:r>
           </w:p>
         </w:tc>
@@ -6407,7 +6402,7 @@
                 <w:b w:val="0"/>
                 <w:sz w:val="17"/>
               </w:rPr>
-              <w:t>판단 보류</w:t>
+              <w:t>지지(5) [34]</w:t>
             </w:r>
           </w:p>
         </w:tc>
@@ -6432,7 +6427,7 @@
                 <w:b w:val="0"/>
                 <w:sz w:val="17"/>
               </w:rPr>
-              <w:t>지지(5) [19; 20]</w:t>
+              <w:t>중립·혼재(3) [35; 36]</w:t>
             </w:r>
           </w:p>
         </w:tc>
@@ -6487,7 +6482,7 @@
                 <w:b w:val="0"/>
                 <w:sz w:val="17"/>
               </w:rPr>
-              <w:t>지지(5) [21; 22; 23]</w:t>
+              <w:t>지지(5) [37; 38; 29]</w:t>
             </w:r>
           </w:p>
         </w:tc>
@@ -6512,7 +6507,7 @@
                 <w:b w:val="0"/>
                 <w:sz w:val="17"/>
               </w:rPr>
-              <w:t>판단 보류</w:t>
+              <w:t>지지(5) [39; 40; 41]</w:t>
             </w:r>
           </w:p>
         </w:tc>
@@ -6567,7 +6562,7 @@
                 <w:b w:val="0"/>
                 <w:sz w:val="17"/>
               </w:rPr>
-              <w:t>지지(5) [24; 25; 26]</w:t>
+              <w:t>지지(5) [42; 19; 43]</w:t>
             </w:r>
           </w:p>
         </w:tc>
@@ -6592,7 +6587,7 @@
                 <w:b w:val="0"/>
                 <w:sz w:val="17"/>
               </w:rPr>
-              <w:t>중립·혼재(3) [27; 28; 29]</w:t>
+              <w:t>지지(5) [44; 45; 22]</w:t>
             </w:r>
           </w:p>
         </w:tc>
@@ -6672,7 +6667,7 @@
                 <w:color w:val="161A58"/>
                 <w:sz w:val="17"/>
               </w:rPr>
-              <w:t>4.33</w:t>
+              <w:t>4.50</w:t>
             </w:r>
           </w:p>
         </w:tc>
@@ -6693,7 +6688,7 @@
           <w:b w:val="0"/>
           <w:sz w:val="20"/>
         </w:rPr>
-        <w:t>개발사(TurboQuant는 Google, ITME는 SK hynix)의 발언과 보도자료는 점수에서 제외하고 참고로만 인용했다. TurboQuant는 클라우드·데이터센터 사업자 집단에서 KV 캐시 압축과 메모리 사용량 감소, 속도 향상, 정확도 유지 측면에서 긍정적 평가가 다수 보고되었으며[14; 15; 10], 개발자 커뮤니티와 투자·분석·언론 집단에서는 긍정적 평가가 우세하나 일부 우려와 중립 의견도 존재한다[21; 30; 31]. GPU·메모리 벤더 집단에서는 근거가 부족하여 평가가 어렵다. ITME는 클라우드·데이터센터 사업자와 GPU·메모리 벤더 집단에서 KV 캐시 최적화와 대규모 AI 추론 서비스 지원에 긍정적 평가를 받고 있으나[16; 19], 투자·분석·언론 집단에서는 긍정과 우려가 혼재되어 시장 수요에 대한 불확실성이 존재한다[28; 27]. 개발자 커뮤니티의 의견은 근거 부족으로 평가가 어렵다.</w:t>
+        <w:t>개발사(TurboQuant는 Google, ITME는 SK hynix)의 발언과 보도자료는 점수에서 제외하고 참고로만 인용했다. TurboQuant은 클라우드·데이터센터 사업자, GPU·메모리 벤더, 개발자 커뮤니티, 투자·분석·언론 집단에서 GPU 메모리 비용 절감과 동시성 향상, 정확도 유지 등의 긍정적 평가를 받으나, 일부에서는 연구 단계에 머물러 있고 실제 채택 사례가 부족하다는 우려도 있다[28; 34; 37; 19; 46]. ITME는 클라우드·데이터센터 사업자 집단에서 대규모 추론 지원과 성능 향상 근거로 강한 지지를 받았으나, GPU·메모리 벤더와 투자·분석·언론 집단에서는 긍정적 평가와 함께 일부 우려가 공존하며, 개발자 커뮤니티는 기술 중요성을 인정하면서도 메모리 풋프린트 문제를 지적하였다[30; 31; 36; 35; 47; 39; 48].</w:t>
       </w:r>
     </w:p>
     <w:p>
@@ -6929,7 +6924,7 @@
                 <w:b w:val="0"/>
                 <w:sz w:val="17"/>
               </w:rPr>
-              <w:t>5.00 [14; 9]</w:t>
+              <w:t>5.00 [49; 50]</w:t>
             </w:r>
           </w:p>
         </w:tc>
@@ -6954,7 +6949,7 @@
                 <w:b w:val="0"/>
                 <w:sz w:val="17"/>
               </w:rPr>
-              <w:t>5.00 [14; 9]</w:t>
+              <w:t>5.00 [49; 51]</w:t>
             </w:r>
           </w:p>
         </w:tc>
@@ -7059,7 +7054,7 @@
                 <w:b w:val="0"/>
                 <w:sz w:val="17"/>
               </w:rPr>
-              <w:t>4.00 [9; 32]</w:t>
+              <w:t>5.00 [24; 51]</w:t>
             </w:r>
           </w:p>
         </w:tc>
@@ -7084,7 +7079,7 @@
                 <w:b w:val="0"/>
                 <w:sz w:val="17"/>
               </w:rPr>
-              <w:t>4.00 [9; 32]</w:t>
+              <w:t>4.00 [24; 51]</w:t>
             </w:r>
           </w:p>
         </w:tc>
@@ -7189,7 +7184,7 @@
                 <w:b w:val="0"/>
                 <w:sz w:val="17"/>
               </w:rPr>
-              <w:t>5.00 [32; 33]</w:t>
+              <w:t>5.00 [50; 52]</w:t>
             </w:r>
           </w:p>
         </w:tc>
@@ -7214,7 +7209,7 @@
                 <w:b w:val="0"/>
                 <w:sz w:val="17"/>
               </w:rPr>
-              <w:t>5.00 [32; 33]</w:t>
+              <w:t>4.00 [52; 53]</w:t>
             </w:r>
           </w:p>
         </w:tc>
@@ -7239,7 +7234,7 @@
                 <w:b w:val="0"/>
                 <w:sz w:val="17"/>
               </w:rPr>
-              <w:t>판단 보류 [7]</w:t>
+              <w:t>판단 보류 [25]</w:t>
             </w:r>
           </w:p>
         </w:tc>
@@ -7264,7 +7259,7 @@
                 <w:b w:val="0"/>
                 <w:sz w:val="17"/>
               </w:rPr>
-              <w:t>판단 보류 [7]</w:t>
+              <w:t>판단 보류 [25]</w:t>
             </w:r>
           </w:p>
         </w:tc>
@@ -7319,7 +7314,7 @@
                 <w:b w:val="0"/>
                 <w:sz w:val="17"/>
               </w:rPr>
-              <w:t>5.00 [1, p.18; 14]</w:t>
+              <w:t>5.00 [1, p.18; 49]</w:t>
             </w:r>
           </w:p>
         </w:tc>
@@ -7344,7 +7339,7 @@
                 <w:b w:val="0"/>
                 <w:sz w:val="17"/>
               </w:rPr>
-              <w:t>5.00 [1, p.18; 14]</w:t>
+              <w:t>5.00 [49; 24]</w:t>
             </w:r>
           </w:p>
         </w:tc>
@@ -7449,7 +7444,7 @@
                 <w:b w:val="0"/>
                 <w:sz w:val="17"/>
               </w:rPr>
-              <w:t>판단 보류</w:t>
+              <w:t>5.00 [54; 55]</w:t>
             </w:r>
           </w:p>
         </w:tc>
@@ -7474,7 +7469,7 @@
                 <w:b w:val="0"/>
                 <w:sz w:val="17"/>
               </w:rPr>
-              <w:t>판단 보류</w:t>
+              <w:t>판단 보류 [55]</w:t>
             </w:r>
           </w:p>
         </w:tc>
@@ -7579,7 +7574,7 @@
                 <w:color w:val="161A58"/>
                 <w:sz w:val="17"/>
               </w:rPr>
-              <w:t>4.75</w:t>
+              <w:t>4.78</w:t>
             </w:r>
           </w:p>
         </w:tc>
@@ -7657,12 +7652,7 @@
           <w:b w:val="0"/>
           <w:sz w:val="20"/>
         </w:rPr>
-        <w:t>워크로드별 평균: TurboQuant W1 4.75, W2 4.75; ITME W1 판단 보류, W2 판단 보류. 가중 평균 행은 기술별 W1·W2 합산값이다(W1 열에 표기). TurboQuant는 KV 캐시를 3비트까지 압축하면서 6배 이상의 메모리 절감과 비용 절감을 보고했으며, 정확도 손실이 없다는 근거가 다수 존재한다[14; 9; 32]. 단일 요청 지연이 약간 증가하는 부정적 근거가 있으나, 전반적으로 지연 유지 및 처리량 향상 근거가 더 많다[9; 34; 32]. 통합 난이도에 관한 근거는 부족하다. ITME는 다계층 메모리 구조를 활용하여 GPU 메모리와 호스트 메모리의 역할 분담으로 비용과 지연 측면에서 용량 문제를 해결하는 결과가 보고되었으며, NVMe-oF 대비 처리량이 1.8배 이상 향상된 점도 확인되었다[2, p.2; 7]. 다만 정확도 영향과 통합 난이도에 대한 근거가 부족하여 평가가 제한적이다.</w:t>
-      </w:r>
-    </w:p>
-    <w:p>
-      <w:r>
-        <w:br w:type="page"/>
+        <w:t>워크로드별 평균: TurboQuant W1 5.00, W2 4.50; ITME W1 판단 보류, W2 판단 보류. 가중 평균 행은 기술별 W1·W2 합산값이다(W1 열에 표기). TurboQuant은 Llama-3.1-8B-Instruct, Ministral-7B-Instruct 등 모델을 대상으로 긴 문맥 시나리오에서 KV 캐시를 FP16에서 약 3비트로 압축하여 정확도 손실 없이 5~6배 메모리 절감과 최대 8배 속도 향상을 달성하였다[49; 24; 19; 29]. 다만 일부 환경에서는 지연 및 처리량 관련 부정적 근거가 있어 추가 검증이 필요하다[53]. ITME는 LLM 데이터 유형을 지연 민감도와 용량에 따라 분류하고, 다계층 메모리 구조와 소프트웨어 프리페칭으로 메모리 용량과 I/O 병목을 완화하여 처리량 개선을 달성하였다[25; 2, p.2]. 정확도 영향과 통합 난이도에 대한 근거는 부족하여 판단 보류된다.</w:t>
       </w:r>
     </w:p>
     <w:p>
@@ -7914,7 +7904,7 @@
                 <w:b w:val="0"/>
                 <w:sz w:val="17"/>
               </w:rPr>
-              <w:t>5–7</w:t>
+              <w:t>4–6</w:t>
             </w:r>
           </w:p>
         </w:tc>
@@ -7939,7 +7929,7 @@
                 <w:b w:val="0"/>
                 <w:sz w:val="17"/>
               </w:rPr>
-              <w:t>판단 보류</w:t>
+              <w:t>4.45</w:t>
             </w:r>
           </w:p>
         </w:tc>
@@ -7989,7 +7979,7 @@
                 <w:b w:val="0"/>
                 <w:sz w:val="17"/>
               </w:rPr>
-              <w:t>4.75</w:t>
+              <w:t>4.78</w:t>
             </w:r>
           </w:p>
         </w:tc>
@@ -8066,7 +8056,7 @@
                 <w:b w:val="0"/>
                 <w:sz w:val="17"/>
               </w:rPr>
-              <w:t>5.00</w:t>
+              <w:t>판단 보류</w:t>
             </w:r>
           </w:p>
         </w:tc>
@@ -8090,7 +8080,7 @@
                 <w:b w:val="0"/>
                 <w:sz w:val="17"/>
               </w:rPr>
-              <w:t>4.33</w:t>
+              <w:t>4.50</w:t>
             </w:r>
           </w:p>
         </w:tc>
@@ -8315,7 +8305,7 @@
                 <w:b w:val="0"/>
                 <w:sz w:val="17"/>
               </w:rPr>
-              <w:t>이해관계자 – 도메인 적합성</w:t>
+              <w:t>시장성 – 이해관계자</w:t>
             </w:r>
           </w:p>
         </w:tc>
@@ -8340,7 +8330,7 @@
                 <w:b w:val="0"/>
                 <w:sz w:val="17"/>
               </w:rPr>
-              <w:t>0.25</w:t>
+              <w:t>0.55</w:t>
             </w:r>
           </w:p>
         </w:tc>
@@ -8386,15 +8376,16 @@
           </w:tcPr>
           <w:p>
             <w:pPr>
-              <w:spacing w:after="0" w:line="276" w:lineRule="auto"/>
-            </w:pPr>
-            <w:r>
-              <w:rPr>
-                <w:rFonts w:ascii="맑은 고딕" w:hAnsi="맑은 고딕" w:eastAsia="맑은 고딕" w:cs="맑은 고딕"/>
-                <w:b w:val="0"/>
-                <w:sz w:val="17"/>
-              </w:rPr>
-              <w:t>ITME</w:t>
+              <w:keepNext/>
+              <w:spacing w:after="0" w:line="276" w:lineRule="auto"/>
+            </w:pPr>
+            <w:r>
+              <w:rPr>
+                <w:rFonts w:ascii="맑은 고딕" w:hAnsi="맑은 고딕" w:eastAsia="맑은 고딕" w:cs="맑은 고딕"/>
+                <w:b w:val="0"/>
+                <w:sz w:val="17"/>
+              </w:rPr>
+              <w:t>TurboQuant</w:t>
             </w:r>
           </w:p>
         </w:tc>
@@ -8410,15 +8401,16 @@
           </w:tcPr>
           <w:p>
             <w:pPr>
-              <w:spacing w:after="0" w:line="276" w:lineRule="auto"/>
-            </w:pPr>
-            <w:r>
-              <w:rPr>
-                <w:rFonts w:ascii="맑은 고딕" w:hAnsi="맑은 고딕" w:eastAsia="맑은 고딕" w:cs="맑은 고딕"/>
-                <w:b w:val="0"/>
-                <w:sz w:val="17"/>
-              </w:rPr>
-              <w:t>시장성 – 이해관계자</w:t>
+              <w:keepNext/>
+              <w:spacing w:after="0" w:line="276" w:lineRule="auto"/>
+            </w:pPr>
+            <w:r>
+              <w:rPr>
+                <w:rFonts w:ascii="맑은 고딕" w:hAnsi="맑은 고딕" w:eastAsia="맑은 고딕" w:cs="맑은 고딕"/>
+                <w:b w:val="0"/>
+                <w:sz w:val="17"/>
+              </w:rPr>
+              <w:t>시장성 – 도메인 적합성</w:t>
             </w:r>
           </w:p>
         </w:tc>
@@ -8434,15 +8426,118 @@
           </w:tcPr>
           <w:p>
             <w:pPr>
-              <w:spacing w:after="0" w:line="276" w:lineRule="auto"/>
-            </w:pPr>
-            <w:r>
-              <w:rPr>
-                <w:rFonts w:ascii="맑은 고딕" w:hAnsi="맑은 고딕" w:eastAsia="맑은 고딕" w:cs="맑은 고딕"/>
-                <w:b w:val="0"/>
-                <w:sz w:val="17"/>
-              </w:rPr>
-              <w:t>0.67</w:t>
+              <w:keepNext/>
+              <w:spacing w:after="0" w:line="276" w:lineRule="auto"/>
+            </w:pPr>
+            <w:r>
+              <w:rPr>
+                <w:rFonts w:ascii="맑은 고딕" w:hAnsi="맑은 고딕" w:eastAsia="맑은 고딕" w:cs="맑은 고딕"/>
+                <w:b w:val="0"/>
+                <w:sz w:val="17"/>
+              </w:rPr>
+              <w:t>0.33</w:t>
+            </w:r>
+          </w:p>
+        </w:tc>
+        <w:tc>
+          <w:tcPr>
+            <w:tcW w:type="dxa" w:w="2551"/>
+            <w:tcMar>
+              <w:top w:w="70" w:type="dxa"/>
+              <w:left w:w="90" w:type="dxa"/>
+              <w:bottom w:w="70" w:type="dxa"/>
+              <w:right w:w="90" w:type="dxa"/>
+            </w:tcMar>
+          </w:tcPr>
+          <w:p>
+            <w:pPr>
+              <w:keepNext/>
+              <w:spacing w:after="0" w:line="276" w:lineRule="auto"/>
+            </w:pPr>
+            <w:r>
+              <w:rPr>
+                <w:rFonts w:ascii="맑은 고딕" w:hAnsi="맑은 고딕" w:eastAsia="맑은 고딕" w:cs="맑은 고딕"/>
+                <w:b w:val="0"/>
+                <w:sz w:val="17"/>
+              </w:rPr>
+              <w:t>일치</w:t>
+            </w:r>
+          </w:p>
+        </w:tc>
+      </w:tr>
+      <w:tr>
+        <w:trPr>
+          <w:cantSplit/>
+        </w:trPr>
+        <w:tc>
+          <w:tcPr>
+            <w:tcW w:type="dxa" w:w="1701"/>
+            <w:tcMar>
+              <w:top w:w="70" w:type="dxa"/>
+              <w:left w:w="90" w:type="dxa"/>
+              <w:bottom w:w="70" w:type="dxa"/>
+              <w:right w:w="90" w:type="dxa"/>
+            </w:tcMar>
+          </w:tcPr>
+          <w:p>
+            <w:pPr>
+              <w:spacing w:after="0" w:line="276" w:lineRule="auto"/>
+            </w:pPr>
+            <w:r>
+              <w:rPr>
+                <w:rFonts w:ascii="맑은 고딕" w:hAnsi="맑은 고딕" w:eastAsia="맑은 고딕" w:cs="맑은 고딕"/>
+                <w:b w:val="0"/>
+                <w:sz w:val="17"/>
+              </w:rPr>
+              <w:t>TurboQuant</w:t>
+            </w:r>
+          </w:p>
+        </w:tc>
+        <w:tc>
+          <w:tcPr>
+            <w:tcW w:type="dxa" w:w="3402"/>
+            <w:tcMar>
+              <w:top w:w="70" w:type="dxa"/>
+              <w:left w:w="90" w:type="dxa"/>
+              <w:bottom w:w="70" w:type="dxa"/>
+              <w:right w:w="90" w:type="dxa"/>
+            </w:tcMar>
+          </w:tcPr>
+          <w:p>
+            <w:pPr>
+              <w:spacing w:after="0" w:line="276" w:lineRule="auto"/>
+            </w:pPr>
+            <w:r>
+              <w:rPr>
+                <w:rFonts w:ascii="맑은 고딕" w:hAnsi="맑은 고딕" w:eastAsia="맑은 고딕" w:cs="맑은 고딕"/>
+                <w:b w:val="0"/>
+                <w:sz w:val="17"/>
+              </w:rPr>
+              <w:t>이해관계자 – 도메인 적합성</w:t>
+            </w:r>
+          </w:p>
+        </w:tc>
+        <w:tc>
+          <w:tcPr>
+            <w:tcW w:type="dxa" w:w="1417"/>
+            <w:tcMar>
+              <w:top w:w="70" w:type="dxa"/>
+              <w:left w:w="90" w:type="dxa"/>
+              <w:bottom w:w="70" w:type="dxa"/>
+              <w:right w:w="90" w:type="dxa"/>
+            </w:tcMar>
+          </w:tcPr>
+          <w:p>
+            <w:pPr>
+              <w:spacing w:after="0" w:line="276" w:lineRule="auto"/>
+            </w:pPr>
+            <w:r>
+              <w:rPr>
+                <w:rFonts w:ascii="맑은 고딕" w:hAnsi="맑은 고딕" w:eastAsia="맑은 고딕" w:cs="맑은 고딕"/>
+                <w:b w:val="0"/>
+                <w:sz w:val="17"/>
+              </w:rPr>
+              <w:t>0.22</w:t>
             </w:r>
           </w:p>
         </w:tc>
@@ -8728,7 +8823,7 @@
                 <w:b w:val="0"/>
                 <w:sz w:val="17"/>
               </w:rPr>
-              <w:t>TurboQuant: TRL 5–7 (신뢰도 높음), 시장성 판단 보류 → 판단 보류; ITME: TRL 5–6 (신뢰도 높음), 시장성 5.0 → 부분 괴리 (기대 선행) (C.5 격자, 코드 계산) [2, p.8·10; 1, p.15·16]</w:t>
+              <w:t>TurboQuant: TRL 4–6 (신뢰도 높음), 시장성 4.45 → 부분 괴리 (기대 선행); ITME: TRL 5–6 (신뢰도 보통), 시장성 판단 보류 → 판단 보류 (C.5 격자, 코드 계산) [2, p.8·10; 1, p.15·16]</w:t>
             </w:r>
           </w:p>
         </w:tc>
@@ -8783,7 +8878,7 @@
                 <w:b w:val="0"/>
                 <w:sz w:val="17"/>
               </w:rPr>
-              <w:t>지지</w:t>
+              <w:t>기각</w:t>
             </w:r>
           </w:p>
         </w:tc>
@@ -8808,7 +8903,7 @@
                 <w:b w:val="0"/>
                 <w:sz w:val="17"/>
               </w:rPr>
-              <w:t>TurboQuant는 기술 자체에 대한 언급이 15건으로 많고 생태계 언급은 5건에 불과한 반면, ITME는 기술 언급이 5건, 생태계 언급이 9건으로 생태계·전략 측면의 언급이 더 많아 두 기술의 이해관계자 근거 비중이 다르다.</w:t>
+              <w:t>TurboQuant: 기술 언급 14건, 생태계·전략 언급 7건 → 기각; ITME: 기술 언급 14건, 생태계·전략 언급 8건 → 기각 (개발사 발언 제외, C.7 기준, 코드 계산) [56; 30; 18; 42]</w:t>
             </w:r>
           </w:p>
         </w:tc>
@@ -8888,7 +8983,7 @@
                 <w:b w:val="0"/>
                 <w:sz w:val="17"/>
               </w:rPr>
-              <w:t>TurboQuant의 도메인 평가 점수는 W1과 W2 모두 4.75점으로 동일하며, ITME는 도메인 점수가 부재하여 W1과 W2 점수 차이에 따른 판정 기준 적용이 어렵다.</w:t>
+              <w:t>TurboQuant: W1 5.0, W2 4.5, 3점을 사이에 두고 갈리는 기준 없음 → 기각; ITME: W1·W2 점수를 낼 근거가 부족해 판단 보류 (평가 가능한 기술이 일부뿐이라 가설 전체는 판단 보류) (C.7 기준, 코드 계산) [2, p.2; 49; 24]</w:t>
             </w:r>
           </w:p>
         </w:tc>
@@ -8941,7 +9036,7 @@
                 <w:b w:val="0"/>
                 <w:sz w:val="17"/>
               </w:rPr>
-              <w:t>판단 보류</w:t>
+              <w:t>부분 지지</w:t>
             </w:r>
           </w:p>
         </w:tc>
@@ -8965,7 +9060,7 @@
                 <w:b w:val="0"/>
                 <w:sz w:val="17"/>
               </w:rPr>
-              <w:t>근거 문장이 Judge 검사를 통과하지 못함</w:t>
+              <w:t>TurboQuant은 도입 주체별 근거가 있으나 함께 쓰는 사례 근거가 없고, ITME는 함께 쓰는 사례 근거가 있으나 도입 주체별 근거가 별도로 존재한다. 따라서 두 조건 중 하나만 충족되어 부분 지지로 판단한다. [57; 30; 58]</w:t>
             </w:r>
           </w:p>
         </w:tc>
@@ -8986,7 +9081,7 @@
           <w:b w:val="0"/>
           <w:sz w:val="20"/>
         </w:rPr>
-        <w:t>H1은 TRL 범위의 가운데 값과 시장성 점수로 설계서 C.5의 3×3 격자에서 코드로 판정했다: TurboQuant 판단 보류; ITME 부분 괴리 (기대 선행).</w:t>
+        <w:t>H1은 TRL 범위의 가운데 값과 시장성 점수로 설계서 C.5의 3×3 격자에서 코드로 판정했다: TurboQuant 부분 괴리 (기대 선행); ITME 판단 보류.</w:t>
       </w:r>
     </w:p>
     <w:p>
@@ -9024,7 +9119,7 @@
           <w:b w:val="0"/>
           <w:sz w:val="20"/>
         </w:rPr>
-        <w:t>GPU 메모리 용량 한계가 중요한 워크로드에서는 ITME의 다계층 메모리 구조와 NAND 기반 확장 기술 근거가 관련된다[2, p.2; 4].</w:t>
+        <w:t>긴 문맥 처리와 다중 동시 요청이 중요한 워크로드에서는 TurboQuant의 3비트 KV 캐시 압축과 최대 8배 속도 향상 근거가 관련된다[49; 19; 29].</w:t>
       </w:r>
     </w:p>
     <w:p>
@@ -9047,7 +9142,7 @@
           <w:b w:val="0"/>
           <w:sz w:val="20"/>
         </w:rPr>
-        <w:t>기존에 NVIDIA A100 GPU를 보유한 환경에서는 TurboQuant의 KV 캐시 3비트 압축과 실험실 검증 근거가 적용될 수 있다[1, p.15·16].</w:t>
+        <w:t>기존 GPU 보유 여부가 중요한 도입 주체에서는 TurboQuant가 기존 서빙 엔진을 크게 수정하지 않고 드롭인 최적화가 가능하다는 점이 관련된다[54; 55].</w:t>
       </w:r>
     </w:p>
     <w:p>
@@ -9070,7 +9165,7 @@
           <w:b w:val="0"/>
           <w:sz w:val="20"/>
         </w:rPr>
-        <w:t>클라우드·데이터센터 사업자가 도입 주체일 경우 TurboQuant와 ITME 모두에서 긍정적 평가 근거가 다수 보고되어 관련 근거가 참고된다[14; 16].</w:t>
+        <w:t>대규모 추론 지원과 메모리 용량 확장이 필요한 클라우드·데이터센터 사업자에서는 ITME의 다계층 메모리 구조와 FPGA 프로토타입 실환경 검증 근거가 관련된다[2, p.8·10; 30].</w:t>
       </w:r>
     </w:p>
     <w:p>
@@ -9093,7 +9188,7 @@
           <w:b w:val="0"/>
           <w:sz w:val="20"/>
         </w:rPr>
-        <w:t>투자·분석·언론 집단의 시장 수요 판단에서는 TurboQuant가 긍정과 우려가 혼재된 반면, ITME는 긍정과 부정 근거가 혼재되어 불확실성 근거가 관련된다[28; 31].</w:t>
+        <w:t>고성능 서버 환경에서 메모리 I/O 병목 완화가 필요한 경우 ITME의 소프트웨어 프리페칭과 읽기 우선 스케줄링에 의한 처리량 개선 근거가 관련된다[25].</w:t>
       </w:r>
     </w:p>
     <w:p>
@@ -9242,7 +9337,7 @@
                 <w:b w:val="0"/>
                 <w:sz w:val="17"/>
               </w:rPr>
-              <w:t>0 / 2칸</w:t>
+              <w:t>0 / 3칸</w:t>
             </w:r>
           </w:p>
         </w:tc>
@@ -9297,7 +9392,7 @@
                 <w:b w:val="0"/>
                 <w:sz w:val="17"/>
               </w:rPr>
-              <w:t>0 / 2칸</w:t>
+              <w:t>0 / 3칸</w:t>
             </w:r>
           </w:p>
         </w:tc>
@@ -9352,7 +9447,7 @@
                 <w:b w:val="0"/>
                 <w:sz w:val="17"/>
               </w:rPr>
-              <w:t>0 / 2칸</w:t>
+              <w:t>0 / 3칸</w:t>
             </w:r>
           </w:p>
         </w:tc>
@@ -9405,7 +9500,7 @@
                 <w:b w:val="0"/>
                 <w:sz w:val="17"/>
               </w:rPr>
-              <w:t>1 / 2칸</w:t>
+              <w:t>1 / 3칸</w:t>
             </w:r>
           </w:p>
         </w:tc>
@@ -9829,7 +9924,7 @@
                 <w:b w:val="0"/>
                 <w:sz w:val="17"/>
               </w:rPr>
-              <w:t>0 / 2칸 (H1 판정: 부분 지지)</w:t>
+              <w:t>1 / 2칸 (H1 판정: 기각)</w:t>
             </w:r>
           </w:p>
         </w:tc>
@@ -9851,11 +9946,6 @@
           <w:sz w:val="20"/>
         </w:rPr>
         <w:t>2.0·1.0과 격자 경계는 절대 기준이 아니라 분류를 일관되게 하려고 미리 정한 값이므로, 각 값을 0.5씩 바꿨을 때 판정이 달라지는 칸 수를 함께 보고한다.</w:t>
-      </w:r>
-    </w:p>
-    <w:p>
-      <w:r>
-        <w:br w:type="page"/>
       </w:r>
     </w:p>
     <w:p>
@@ -10274,7 +10364,7 @@
                 <w:b w:val="0"/>
                 <w:sz w:val="17"/>
               </w:rPr>
-              <w:t>50%</w:t>
+              <w:t>100%</w:t>
             </w:r>
           </w:p>
         </w:tc>
@@ -10299,7 +10389,7 @@
                 <w:b w:val="0"/>
                 <w:sz w:val="17"/>
               </w:rPr>
-              <w:t>TurboQuant 하·상한 2, ITME 하·상한 1</w:t>
+              <w:t>TurboQuant 하·상한 5, ITME 하·상한 1</w:t>
             </w:r>
           </w:p>
         </w:tc>
@@ -10349,7 +10439,7 @@
                 <w:b w:val="0"/>
                 <w:sz w:val="17"/>
               </w:rPr>
-              <w:t>0</w:t>
+              <w:t>2</w:t>
             </w:r>
           </w:p>
         </w:tc>
@@ -10374,7 +10464,7 @@
                 <w:b w:val="0"/>
                 <w:sz w:val="17"/>
               </w:rPr>
-              <w:t>통과</w:t>
+              <w:t>판정 불확실</w:t>
             </w:r>
           </w:p>
         </w:tc>
@@ -10454,7 +10544,7 @@
                 <w:b w:val="0"/>
                 <w:sz w:val="17"/>
               </w:rPr>
-              <w:t>40%</w:t>
+              <w:t>100%</w:t>
             </w:r>
           </w:p>
         </w:tc>
@@ -10479,7 +10569,7 @@
                 <w:b w:val="0"/>
                 <w:sz w:val="17"/>
               </w:rPr>
-              <w:t>TurboQuant 찬3/반0, ITME 찬4/반0</w:t>
+              <w:t>TurboQuant 찬14/반3, ITME 찬2/반0</w:t>
             </w:r>
           </w:p>
         </w:tc>
@@ -10504,7 +10594,7 @@
                 <w:b w:val="0"/>
                 <w:sz w:val="17"/>
               </w:rPr>
-              <w:t>0</w:t>
+              <w:t>2</w:t>
             </w:r>
           </w:p>
         </w:tc>
@@ -10609,7 +10699,7 @@
                 <w:b w:val="0"/>
                 <w:sz w:val="17"/>
               </w:rPr>
-              <w:t>5/4/5/4</w:t>
+              <w:t>4/4/4/4</w:t>
             </w:r>
           </w:p>
         </w:tc>
@@ -10634,7 +10724,7 @@
                 <w:b w:val="0"/>
                 <w:sz w:val="17"/>
               </w:rPr>
-              <w:t>14%</w:t>
+              <w:t>19%</w:t>
             </w:r>
           </w:p>
         </w:tc>
@@ -10659,7 +10749,7 @@
                 <w:b w:val="0"/>
                 <w:sz w:val="17"/>
               </w:rPr>
-              <w:t>TurboQuant 찬14/반2, ITME 찬9/반2</w:t>
+              <w:t>TurboQuant 찬16/반3, ITME 찬14/반3</w:t>
             </w:r>
           </w:p>
         </w:tc>
@@ -10787,7 +10877,7 @@
                 <w:b w:val="0"/>
                 <w:sz w:val="17"/>
               </w:rPr>
-              <w:t>4/5/4/4</w:t>
+              <w:t>4/4/3/4</w:t>
             </w:r>
           </w:p>
         </w:tc>
@@ -10835,7 +10925,7 @@
                 <w:b w:val="0"/>
                 <w:sz w:val="17"/>
               </w:rPr>
-              <w:t>TurboQuant 찬6/반1, ITME 찬2/반0</w:t>
+              <w:t>TurboQuant 찬23/반1, ITME 찬2/반0</w:t>
             </w:r>
           </w:p>
         </w:tc>
@@ -10938,7 +11028,7 @@
           <w:b w:val="0"/>
           <w:sz w:val="20"/>
         </w:rPr>
-        <w:t>본문 인용 근거의 출처 구분: 벤더 26건, 제3자 24건, 학술 3건. 관점마다 지지·반대 질의를 짝지어 검색했고, 한 원 출처 계열이 웹 근거의 50%를 넘지 않게 했으며, 개발사 발언은 이해관계자 점수에서 뺐다.</w:t>
+        <w:t>본문 인용 근거의 출처 구분: 벤더 24건, 제3자 47건, 학술 6건. 관점마다 지지·반대 질의를 짝지어 검색했고, 한 원 출처 계열이 웹 근거의 50%를 넘지 않게 했으며, 개발사 발언은 이해관계자 점수에서 뺐다.</w:t>
       </w:r>
     </w:p>
     <w:p>
@@ -10984,7 +11074,7 @@
           <w:b w:val="0"/>
           <w:sz w:val="20"/>
         </w:rPr>
-        <w:t>판정 불확실: 시장성 관점이 재실행 한도(2회) 후에도 Judge 기준 미달</w:t>
+        <w:t>판정 불확실: TRL 관점이 재실행 한도(2회) 후에도 Judge 기준 미달</w:t>
       </w:r>
     </w:p>
     <w:p>
@@ -11007,6 +11097,29 @@
           <w:b w:val="0"/>
           <w:sz w:val="20"/>
         </w:rPr>
+        <w:t>판정 불확실: 시장성 관점이 재실행 한도(2회) 후에도 Judge 기준 미달</w:t>
+      </w:r>
+    </w:p>
+    <w:p>
+      <w:pPr>
+        <w:spacing w:after="40" w:line="312" w:lineRule="auto"/>
+        <w:ind w:left="312" w:hanging="227"/>
+      </w:pPr>
+      <w:r>
+        <w:rPr>
+          <w:rFonts w:ascii="맑은 고딕" w:hAnsi="맑은 고딕" w:eastAsia="맑은 고딕" w:cs="맑은 고딕"/>
+          <w:b/>
+          <w:color w:val="7F4ACB"/>
+          <w:sz w:val="20"/>
+        </w:rPr>
+        <w:t xml:space="preserve">• </w:t>
+      </w:r>
+      <w:r>
+        <w:rPr>
+          <w:rFonts w:ascii="맑은 고딕" w:hAnsi="맑은 고딕" w:eastAsia="맑은 고딕" w:cs="맑은 고딕"/>
+          <w:b w:val="0"/>
+          <w:sz w:val="20"/>
+        </w:rPr>
         <w:t>판정 불확실: 도메인 적합성 관점이 재실행 한도(2회) 후에도 Judge 기준 미달</w:t>
       </w:r>
     </w:p>
@@ -11137,7 +11250,7 @@
           <w:b w:val="0"/>
           <w:sz w:val="20"/>
         </w:rPr>
-        <w:t>실행 중 기록된 경고: 도메인 적합성 관점 ITME: 빠진 가중치가 50%를 넘어 판단 보류; 시장성 관점 TurboQuant: 빠진 가중치가 50%를 넘어 판단 보류; 시장성 관점 ITME: 빠진 가중치가 50%를 넘어 판단 보류; 같은 근거 ID에 다른 제목이 들어온 경우 3건(기존 항목 유지, 실행 로그에 기록)</w:t>
+        <w:t>실행 중 기록된 경고: 도메인 적합성 관점 ITME: 빠진 가중치가 50%를 넘어 판단 보류; 시장성 관점 ITME: 빠진 가중치가 50%를 넘어 판단 보류; 같은 근거 ID에 다른 제목이 들어온 경우 5건(기존 항목 유지, 실행 로그에 기록)</w:t>
       </w:r>
     </w:p>
     <w:p>
@@ -11161,11 +11274,6 @@
           <w:sz w:val="20"/>
         </w:rPr>
         <w:t>RAG 문서는 Doc Pool 논문 6편 136쪽(한도 200쪽), 청크 159개이다.</w:t>
-      </w:r>
-    </w:p>
-    <w:p>
-      <w:r>
-        <w:br w:type="page"/>
       </w:r>
     </w:p>
     <w:p>
@@ -11280,7 +11388,7 @@
           <w:b w:val="0"/>
           <w:sz w:val="20"/>
         </w:rPr>
-        <w:t>[3] tradingkey.com(2026-09-22 접속). What Is Google TurboQuant Compression Algorithm? How Does It Affect the AI Memory Chip Industry?. tradingkey.com, https://tradingkey.com/analysis/stocks/us-stocks/261728257-what-is-google-turboquant-compression-algorithm-how-impact-ai-memory-chip-industry-tradingkey</w:t>
+        <w:t>[3] medium.com(2026-09-22 접속). Medium. medium.com, https://medium.com/@anupkawarase.akz/turboquant-how-googles-6x-kv-cache-compression-changes-llm-inference-forever-1110e4be289e</w:t>
       </w:r>
     </w:p>
     <w:p>
@@ -11303,7 +11411,7 @@
           <w:b w:val="0"/>
           <w:sz w:val="20"/>
         </w:rPr>
-        <w:t>[4] sedaily.com(2026-09-22 접속). SK hynix Developing New NAND Products for KV Cache Demands - Seoul Economic Daily. en.sedaily.com, https://en.sedaily.com/finance/2026/07/29/sk-hynix-developing-new-nand-products-for-kv-cache-demands</w:t>
+        <w:t>[4] dev.to(2026-09-22 접속). TurboQuant: What Developers Need to Know About .... dev.to, https://dev.to/arshtechpro/turboquant-what-developers-need-to-know-about-googles-kv-cache-compression-eeg</w:t>
       </w:r>
     </w:p>
     <w:p>
@@ -11326,7 +11434,7 @@
           <w:b w:val="0"/>
           <w:sz w:val="20"/>
         </w:rPr>
-        <w:t>[5] AMD(2026-09-22 접속). Productionizing TurboQuant on AMD GPUs for KV-Cache-Bound .... rocm.blogs.amd.com, https://rocm.blogs.amd.com/artificial-intelligence/turboquant-vllm-agentic/README.html</w:t>
+        <w:t>[5] ThePromptBuddy(2026-09-22 접속). Google TurboQuant: The KV-Cache Breakthrough That Could Make Large AI Models Cheaper. thepromptbuddy.com, https://www.thepromptbuddy.com/prompts/google-turboquant-the-kv-cache-breakthrough-that-could-make-large-ai-models-cheaper</w:t>
       </w:r>
     </w:p>
     <w:p>
@@ -11349,7 +11457,7 @@
           <w:b w:val="0"/>
           <w:sz w:val="20"/>
         </w:rPr>
-        <w:t>[6] medium.com(2026-09-22 접속). TurboQuant Changes the Economics of Local AI Inference - Medium. medium.com, https://medium.com/@michael.hannecke/googles-turboquant-changes-the-economics-of-local-ai-inference-acce5839014d</w:t>
+        <w:t>[6] sedaily.com(2026-07-29). SK hynix Developing New NAND Products for KV Cache .... en.sedaily.com, https://en.sedaily.com/finance/2026/07/29/sk-hynix-developing-new-nand-products-for-kv-cache-demands</w:t>
       </w:r>
     </w:p>
     <w:p>
@@ -11372,7 +11480,7 @@
           <w:b w:val="0"/>
           <w:sz w:val="20"/>
         </w:rPr>
-        <w:t>[7] arxiv.org(2026-09-22 접속). ITME: Inference Tiered Memory Expansion with .... arxiv.org, https://arxiv.org/html/2606.12556v2</w:t>
+        <w:t>[7] arxiv.org(2026-09-22 접속). TurboQuant: Online Vector Quantization with Near-optimal .... arxiv.org, https://arxiv.org/html/2504.19874v1</w:t>
       </w:r>
     </w:p>
     <w:p>
@@ -11395,7 +11503,7 @@
           <w:b w:val="0"/>
           <w:sz w:val="20"/>
         </w:rPr>
-        <w:t>[8] neurips.cc(2026-09-22 접속). HiFC: High-efficiency Flash-based KV Cache Swapping for .... papers.neurips.cc, https://papers.neurips.cc/paper_files/paper/2025/file/4431224d3762aa655f0aee4eaf04ff16-Paper-Conference.pdf</w:t>
+        <w:t>[8] Artificial Intelligence(2026-09-22 접속). Efficient LLM Inference with TurboQuant and KV Cache Offloading. artificial-inteligence.phptutorial.co.in, https://artificial-inteligence.phptutorial.co.in/efficient-llm-inference-with-turboquant-and-kv-cache-offloading</w:t>
       </w:r>
     </w:p>
     <w:p>
@@ -11418,7 +11526,7 @@
           <w:b w:val="0"/>
           <w:sz w:val="20"/>
         </w:rPr>
-        <w:t>[9] Google(2026-09-22 접속). TurboQuant: Redefining AI efficiency with extreme .... research.google, https://research.google/blog/turboquant-redefining-ai-efficiency-with-extreme-compression</w:t>
+        <w:t>[9] github.com(2026-09-22 접속). OmarHory/turboquant: Open-source implementation .... github.com, https://github.com/OmarHory/turboquant</w:t>
       </w:r>
     </w:p>
     <w:p>
@@ -11441,7 +11549,7 @@
           <w:b w:val="0"/>
           <w:sz w:val="20"/>
         </w:rPr>
-        <w:t>[10] youtube.com(2026-09-22 접속). Google's TurboQuant Memory Reduction Claim vs Reality. youtube.com, https://www.youtube.com/watch?v=haoAI2lIZ74</w:t>
+        <w:t>[10] deepinfra.com(2026-09-22 접속). What Is Google TurboQuant and What Does It Mean .... deepinfra.com, https://deepinfra.com/blog/google-turboquant</w:t>
       </w:r>
     </w:p>
     <w:p>
@@ -11464,7 +11572,7 @@
           <w:b w:val="0"/>
           <w:sz w:val="20"/>
         </w:rPr>
-        <w:t>[11] SK hynix(2026-09-22 접속). SK hynix Showcases Full-Stack AI Memory Portfolio at .... news.skhynix.com, https://news.skhynix.com/en/sk-hynix-showcases-full-stack-ai-memory-portfolio-at-2025-ocp-global-summit</w:t>
+        <w:t>[11] o-mega.ai(2026-09-22 접속). Google TurboQuant in August 2026: Where It Actually Runs. o-mega.ai, https://o-mega.ai/articles/google-turboquant-the-2026-llm-compression-guide</w:t>
       </w:r>
     </w:p>
     <w:p>
@@ -11487,7 +11595,7 @@
           <w:b w:val="0"/>
           <w:sz w:val="20"/>
         </w:rPr>
-        <w:t>[12] arxiv.org(2026-09-22 접속). [2606.12556] ITME: Inference Tiered Memory Expansion with Disaggregated CXL-Hybrid Memories. ar5iv.labs.arxiv.org, https://ar5iv.labs.arxiv.org/html/2606.12556</w:t>
+        <w:t>[12] Tech Bytes(2026-09-22 접속). Google TurboQuant: Technical Analysis of 6x KV Cache Compression. techbytes.app, https://techbytes.app/posts/google-turboquant-llm-memory-compression-breakthrough</w:t>
       </w:r>
     </w:p>
     <w:p>
@@ -11510,7 +11618,7 @@
           <w:b w:val="0"/>
           <w:sz w:val="20"/>
         </w:rPr>
-        <w:t>[13] towardsai.net(2026-09-22 접속). Google's TurboQuant Explained: How They Cut LLM .... pub.towardsai.net, https://pub.towardsai.net/googles-turboquant-how-they-cut-llm-memory-by-6x-without-losing-accuracy-971313c9aa7e</w:t>
+        <w:t>[13] Bizrescuepro(2026-09-22 접속). Canadian Technology Magazine: Google’s TurboQuant and the KV Cache. bizrescuepro.com, https://bizrescuepro.com/googles-turboquant-explained-kv-cache-compression-for-cheaper-faster-llm-inference</w:t>
       </w:r>
     </w:p>
     <w:p>
@@ -11533,7 +11641,7 @@
           <w:b w:val="0"/>
           <w:sz w:val="20"/>
         </w:rPr>
-        <w:t>[14] starkinsider.com(2026-09-22 접속). Google’s TurboQuant: The Unsexy AI Breakthrough Worth Watching. starkinsider.com, https://www.starkinsider.com/2026/03/google-turboquant-llm-compression-less-memory.html</w:t>
+        <w:t>[14] arxiv.org(2026-09-22 접속). Token-Operations-Oriented Inference Optimization Techniques for .... arxiv.org, https://arxiv.org/html/2606.20295v2</w:t>
       </w:r>
     </w:p>
     <w:p>
@@ -11556,7 +11664,7 @@
           <w:b w:val="0"/>
           <w:sz w:val="20"/>
         </w:rPr>
-        <w:t>[15] hpe.com(2026-09-22 접속). How Google TurboQuant Stirred the AI Industry. community.hpe.com, https://community.hpe.com/t5/software-general/how-google-turboquant-stirred-the-ai-industry/td-p/7265346</w:t>
+        <w:t>[15] WOWHOW(2026-09-22 접속). Google TurboQuant: 6x KV Cache Compression Changes AI Inference Economics. wowhow.cloud, https://wowhow.cloud/blogs/google-turboquant-kv-cache-compression-llm-inference-2026</w:t>
       </w:r>
     </w:p>
     <w:p>
@@ -11579,7 +11687,7 @@
           <w:b w:val="0"/>
           <w:sz w:val="20"/>
         </w:rPr>
-        <w:t>[16] semiwiki.com(2026-09-22 접속). SK Hynix proposes HBM and HBF hybrid for LLM inference. semiwiki.com, https://semiwiki.com/forum/threads/sk-hynix-proposes-hbm-and-hbf-hybrid-for-llm-inference.24754</w:t>
+        <w:t>[16] yage.ai(2026-09-22 접속). TurboQuant: Google Wants to Compress KV Cache Down to 3 Bits. yage.ai, https://yage.ai/share/turboquant-kv-cache-3-bit-en-20260325.html</w:t>
       </w:r>
     </w:p>
     <w:p>
@@ -11602,7 +11710,7 @@
           <w:b w:val="0"/>
           <w:sz w:val="20"/>
         </w:rPr>
-        <w:t>[17] seagate.com(2026-09-22 접속). Enabling inference at massive scale with hybrid storage for .... seagate.com, https://www.seagate.com/resources/enabling-inference-at-massive-scale-with-hybrid-storage-for-kv-cache-offloading</w:t>
+        <w:t>[17] github.com(2026-09-22 접속). GitHub - back2matching/turboquant: First open-source TurboQuant.... github.com, https://github.com/back2matching/turboquant</w:t>
       </w:r>
     </w:p>
     <w:p>
@@ -11625,7 +11733,7 @@
           <w:b w:val="0"/>
           <w:sz w:val="20"/>
         </w:rPr>
-        <w:t>[18] tradingkey.com(2026-09-22 접속). SK Hynix Capacity Hits Zero: Tech Giants Offer to Fund Factories Amid AI Chip Shortage. tradingkey.com, https://www.tradingkey.com/analysis/stocks/more/261873534-sk-hynix-memory-shortage-capacity-tradingkey</w:t>
+        <w:t>[18] starkinsider.com(2026-03). Google’s TurboQuant: The Unsexy AI Breakthrough Worth Watching. starkinsider.com, https://www.starkinsider.com/2026/03/google-turboquant-llm-compression-less-memory.html</w:t>
       </w:r>
     </w:p>
     <w:p>
@@ -11648,7 +11756,7 @@
           <w:b w:val="0"/>
           <w:sz w:val="20"/>
         </w:rPr>
-        <w:t>[19] futurumgroup.com(2026-09-22 접속). SK Hynix ADR Issuance Strategy. futurumgroup.com, https://futurumgroup.com/insights/will-sk-hynixs-record-265bn-adr-issuance-help-close-its-capex-intensity-gap</w:t>
+        <w:t>[19] mindstudio.ai(2026-09-22 접속). What Is Google TurboQuant? The KV Cache Compression .... mindstudio.ai, https://www.mindstudio.ai/blog/what-is-google-turboquant-kv-cache-compression</w:t>
       </w:r>
     </w:p>
     <w:p>
@@ -11671,7 +11779,7 @@
           <w:b w:val="0"/>
           <w:sz w:val="20"/>
         </w:rPr>
-        <w:t>[20] whatthechiphappened.com(2026-09-22 접속). The Market Just Sold Micron on a Paper It Did Not Read. news.whatthechiphappened.com, https://news.whatthechiphappened.com/p/the-market-just-sold-micron-on-a</w:t>
+        <w:t>[20] reddit.com(2026-09-22 접속). Will Google's TurboQuant technology save us? : r/StableDiffusion. reddit.com, https://www.reddit.com/r/StableDiffusion/comments/1s6t8yu/will_googles_turboquant_technology_save_us</w:t>
       </w:r>
     </w:p>
     <w:p>
@@ -11694,7 +11802,7 @@
           <w:b w:val="0"/>
           <w:sz w:val="20"/>
         </w:rPr>
-        <w:t>[21] NVIDIA(2026-09-22 접속). Why Turboquant saves DGX twice - NVIDIA Developer Forums. forums.developer.nvidia.com, https://forums.developer.nvidia.com/t/why-turboquant-saves-dgx-twice/364736</w:t>
+        <w:t>[21] github.com(2026-09-22 접속). Add TurboQuant KV Cache Quantization for Memory-Efficient Long .... github.com, https://github.com/sgl-project/sglang/issues/21618</w:t>
       </w:r>
     </w:p>
     <w:p>
@@ -11717,7 +11825,7 @@
           <w:b w:val="0"/>
           <w:sz w:val="20"/>
         </w:rPr>
-        <w:t>[22] towardsdatascience.com(2026-09-22 접속). KV Cache Is Eating Your VRAM. Here's How Google Fixed .... towardsdatascience.com, https://towardsdatascience.com/kv-cache-is-eating-your-vram-heres-how-google-fixed-it-with-turboquant</w:t>
+        <w:t>[22] youtube.com(2026-09-22 접속). Google's TurboQuant Memory Reduction Claim vs Reality. youtube.com, https://www.youtube.com/watch?v=haoAI2lIZ74</w:t>
       </w:r>
     </w:p>
     <w:p>
@@ -11740,7 +11848,7 @@
           <w:b w:val="0"/>
           <w:sz w:val="20"/>
         </w:rPr>
-        <w:t>[23] reddit.com(2026-09-22 접속). [google research] TurboQuant: Redefining AI efficiency .... reddit.com, https://www.reddit.com/r/LocalLLaMA/comments/1s2su28/google_research_turboquant_redefining_ai</w:t>
+        <w:t>[23] digitalapplied.com(2026-09-22 접속). Google TurboQuant: 6x LLM Memory Compression Guide. digitalapplied.com, https://www.digitalapplied.com/blog/google-turboquant-6x-llm-memory-compression-guide</w:t>
       </w:r>
     </w:p>
     <w:p>
@@ -11763,7 +11871,7 @@
           <w:b w:val="0"/>
           <w:sz w:val="20"/>
         </w:rPr>
-        <w:t>[24] decodingdiscontinuity.com(2026-09-22 접속). Why TurboQuant Triggered a $100B Memory Stock Sell-Off. decodingdiscontinuity.com, https://www.decodingdiscontinuity.com/p/turboquant-memory-stock-sell-off-panic-paper-google</w:t>
+        <w:t>[24] Google(2026-09-22 접속). TurboQuant: Redefining AI efficiency with extreme .... research.google, https://research.google/blog/turboquant-redefining-ai-efficiency-with-extreme-compression</w:t>
       </w:r>
     </w:p>
     <w:p>
@@ -11786,7 +11894,7 @@
           <w:b w:val="0"/>
           <w:sz w:val="20"/>
         </w:rPr>
-        <w:t>[25] yahoo.com(2026-09-22 접속). What TurboQuant Actually Means for AI Memory Stocks. finance.yahoo.com, https://finance.yahoo.com/markets/stocks/articles/turboquant-actually-means-ai-memory-125500558.html</w:t>
+        <w:t>[25] arxiv.org(2026-09-22 접속). ITME: Inference Tiered Memory Expansion with .... arxiv.org, https://arxiv.org/html/2606.12556v2</w:t>
       </w:r>
     </w:p>
     <w:p>
@@ -11809,7 +11917,7 @@
           <w:b w:val="0"/>
           <w:sz w:val="20"/>
         </w:rPr>
-        <w:t>[26] mindstudio.ai(2026-09-22 접속). What Is Google TurboQuant? The KV Cache Compression That .... mindstudio.ai, https://www.mindstudio.ai/blog/what-is-google-turboquant-kv-cache-compression</w:t>
+        <w:t>[26] tradingkey.com(2026-09-22 접속). What Is Google TurboQuant Compression Algorithm? How Does It Affect the AI Memory Chip Industry?. tradingkey.com, https://tradingkey.com/analysis/stocks/us-stocks/261728257-what-is-google-turboquant-compression-algorithm-how-impact-ai-memory-chip-industry-tradingkey</w:t>
       </w:r>
     </w:p>
     <w:p>
@@ -11832,7 +11940,7 @@
           <w:b w:val="0"/>
           <w:sz w:val="20"/>
         </w:rPr>
-        <w:t>[27] biggo.com(2026-09-22 접속). DeepSeek's New Model Claims Sharp Cut in HBM Usage; Samsung and SK Hynix Plunge Over 3% Intraday. finance.biggo.com, https://finance.biggo.com/news/d8eafdaf-6ff4-490e-b2ea-62f13e1974c9</w:t>
+        <w:t>[27] CryptoRank.io(2026-09-22 접속). Google TurboQuant: Revolutionary AI Memory Compression Sparks ‘Pied Piper’ Frenzy · Technology AI News. cryptorank.io, https://cryptorank.io/ru/news/feed/ee99c-google-turboquant-ai-memory-compression</w:t>
       </w:r>
     </w:p>
     <w:p>
@@ -11855,7 +11963,7 @@
           <w:b w:val="0"/>
           <w:sz w:val="20"/>
         </w:rPr>
-        <w:t>[28] investing.com(2026-09-22 접속). SK Hynix outlook revised to positive by S&amp;P and Fitch on memory chip strength By Investing.com. investing.com, https://www.investing.com/news/stock-market-news/sk-hynix-outlook-revised-to-positive-by-sp-and-fitch-on-memory-chip-strength-93CH-4209005</w:t>
+        <w:t>[28] hpe.com(2026-09-22 접속). How Google TurboQuant Stirred the AI Industry. community.hpe.com, https://community.hpe.com/t5/software-general/how-google-turboquant-stirred-the-ai-industry/td-p/7265346</w:t>
       </w:r>
     </w:p>
     <w:p>
@@ -11878,7 +11986,7 @@
           <w:b w:val="0"/>
           <w:sz w:val="20"/>
         </w:rPr>
-        <w:t>[29] yahoo.com(2026-09-22 접속). Analysts Still See Massive Upside for SK Hynix — The AI Cycle Isn’t Done But Questions Remain. finance.yahoo.com, https://finance.yahoo.com/markets/stocks/articles/analysts-still-see-massive-upside-151554133.html</w:t>
+        <w:t>[29] towardsdatascience.com(2026-09-22 접속). KV Cache Is Eating Your VRAM. Here's How Google Fixed .... towardsdatascience.com, https://towardsdatascience.com/kv-cache-is-eating-your-vram-heres-how-google-fixed-it-with-turboquant</w:t>
       </w:r>
     </w:p>
     <w:p>
@@ -11901,7 +12009,7 @@
           <w:b w:val="0"/>
           <w:sz w:val="20"/>
         </w:rPr>
-        <w:t>[30] everpuredata.com(2026-09-22 접속). TurboQuant Compresses KV Cache by 5X. Does That Mean You .... blog.everpuredata.com, https://blog.everpuredata.com/purely-technical/turboquant-compresses-kv-cache-by-5x-does-that-mean-you-need-less-memory</w:t>
+        <w:t>[30] seagate.com(2026-09-22 접속). Enabling inference at massive scale with hybrid storage for .... seagate.com, https://www.seagate.com/resources/enabling-inference-at-massive-scale-with-hybrid-storage-for-kv-cache-offloading</w:t>
       </w:r>
     </w:p>
     <w:p>
@@ -11924,7 +12032,7 @@
           <w:b w:val="0"/>
           <w:sz w:val="20"/>
         </w:rPr>
-        <w:t>[31] lighthouse-canton.com(2026-09-22 접속). TurboQuant: Why It Changes Nothing for Memory - Lighthouse Canton. lighthouse-canton.com, https://www.lighthouse-canton.com/insights/turboquant-why-it-changes-nothing-for-the-memory-trade-equity-insights</w:t>
+        <w:t>[31] arxiv.org(2026-09-22 접속). ITME: Inference Tiered Memory Expansion with Disaggregated CXL-Hybrid Memories. arxiv.org, https://arxiv.org/html/2606.12556</w:t>
       </w:r>
     </w:p>
     <w:p>
@@ -11947,7 +12055,7 @@
           <w:b w:val="0"/>
           <w:sz w:val="20"/>
         </w:rPr>
-        <w:t>[32] medium.com(2026-09-22 접속). Medium. medium.com, https://medium.com/@anupkawarase.akz/turboquant-how-googles-6x-kv-cache-compression-changes-llm-inference-forever-1110e4be289e</w:t>
+        <w:t>[32] medium.com(2026-09-22 접속). KV Cache Compression and LLM Evaluation with W&amp;B. medium.com, https://medium.com/online-inference/implementing-googles-turboquant-kv-cache-compression-and-llm-evaluation-with-w-b-1403d460846b</w:t>
       </w:r>
     </w:p>
     <w:p>
@@ -11970,7 +12078,7 @@
           <w:b w:val="0"/>
           <w:sz w:val="20"/>
         </w:rPr>
-        <w:t>[33] Intel(2026-09-22 접속). Enhancing long-context, high-concurrency LLM serving on a 32 GB .... community.intel.com, https://community.intel.com/t5/Blogs/Tech-Innovation/Data-Center/Enhancing-long-context-high-concurrency-LLM-serving-on-a-32-GB/post/1751209</w:t>
+        <w:t>[33] Gate News(2026-09-22 접속). SK Hynix and Marvell Unveil CXL Memory Module With 5.5x GPU Throughput. gate.com, https://www.gate.com/news/detail/23368788</w:t>
       </w:r>
     </w:p>
     <w:p>
@@ -11993,7 +12101,559 @@
           <w:b w:val="0"/>
           <w:sz w:val="20"/>
         </w:rPr>
-        <w:t>[34] regolo.ai(2026-09-22 접속). Why TurboQuant matters for real-world LLM inference. regolo.ai, https://regolo.ai/why-turboquant-matters-for-real-world-llm-inference</w:t>
+        <w:t>[34] NVIDIA Developer Forums(2026-09-22 접속). Why Turboquant saves DGX twice. forums.developer.nvidia.com, https://forums.developer.nvidia.com/t/why-turboquant-saves-dgx-twice/364736</w:t>
+      </w:r>
+    </w:p>
+    <w:p>
+      <w:pPr>
+        <w:spacing w:after="40" w:line="312" w:lineRule="auto"/>
+        <w:ind w:left="312" w:hanging="227"/>
+      </w:pPr>
+      <w:r>
+        <w:rPr>
+          <w:rFonts w:ascii="맑은 고딕" w:hAnsi="맑은 고딕" w:eastAsia="맑은 고딕" w:cs="맑은 고딕"/>
+          <w:b/>
+          <w:color w:val="7F4ACB"/>
+          <w:sz w:val="20"/>
+        </w:rPr>
+        <w:t xml:space="preserve">• </w:t>
+      </w:r>
+      <w:r>
+        <w:rPr>
+          <w:rFonts w:ascii="맑은 고딕" w:hAnsi="맑은 고딕" w:eastAsia="맑은 고딕" w:cs="맑은 고딕"/>
+          <w:b w:val="0"/>
+          <w:sz w:val="20"/>
+        </w:rPr>
+        <w:t>[35] Micron, SanDisk Hold Up(2026-09-22 접속). SK Hynix, Samsung Shares Dip In Korea After DeepSeek Debuts AI Tech That Uses Less Memory. stocktwits.com, https://stocktwits.com/news-articles/markets/equity/sk-hynix-samsung-shares-dip-in-korea-after-deep-seek-debuts-ai-tech-that-uses-less-memory-micron-san-disk-hold-up/cZtXBNqRBGe</w:t>
+      </w:r>
+    </w:p>
+    <w:p>
+      <w:pPr>
+        <w:spacing w:after="40" w:line="312" w:lineRule="auto"/>
+        <w:ind w:left="312" w:hanging="227"/>
+      </w:pPr>
+      <w:r>
+        <w:rPr>
+          <w:rFonts w:ascii="맑은 고딕" w:hAnsi="맑은 고딕" w:eastAsia="맑은 고딕" w:cs="맑은 고딕"/>
+          <w:b/>
+          <w:color w:val="7F4ACB"/>
+          <w:sz w:val="20"/>
+        </w:rPr>
+        <w:t xml:space="preserve">• </w:t>
+      </w:r>
+      <w:r>
+        <w:rPr>
+          <w:rFonts w:ascii="맑은 고딕" w:hAnsi="맑은 고딕" w:eastAsia="맑은 고딕" w:cs="맑은 고딕"/>
+          <w:b w:val="0"/>
+          <w:sz w:val="20"/>
+        </w:rPr>
+        <w:t>[36] semidynamics.com(2026-09-22 접속). Semidynamics Secures a Strategic Investment to Advance Memory-Centric AI Inference Chips. semidynamics.com, https://semidynamics.com/newsroom/press-releases/post/semidynamics-secures-a-strategic-investment-to-advance-memory-centric-ai-inference-chips</w:t>
+      </w:r>
+    </w:p>
+    <w:p>
+      <w:pPr>
+        <w:spacing w:after="40" w:line="312" w:lineRule="auto"/>
+        <w:ind w:left="312" w:hanging="227"/>
+      </w:pPr>
+      <w:r>
+        <w:rPr>
+          <w:rFonts w:ascii="맑은 고딕" w:hAnsi="맑은 고딕" w:eastAsia="맑은 고딕" w:cs="맑은 고딕"/>
+          <w:b/>
+          <w:color w:val="7F4ACB"/>
+          <w:sz w:val="20"/>
+        </w:rPr>
+        <w:t xml:space="preserve">• </w:t>
+      </w:r>
+      <w:r>
+        <w:rPr>
+          <w:rFonts w:ascii="맑은 고딕" w:hAnsi="맑은 고딕" w:eastAsia="맑은 고딕" w:cs="맑은 고딕"/>
+          <w:b w:val="0"/>
+          <w:sz w:val="20"/>
+        </w:rPr>
+        <w:t>[37] yahoo.com(2026-09-22 접속). What TurboQuant Actually Means for AI Memory Stocks. finance.yahoo.com, https://finance.yahoo.com/markets/stocks/articles/turboquant-actually-means-ai-memory-125500558.html</w:t>
+      </w:r>
+    </w:p>
+    <w:p>
+      <w:pPr>
+        <w:spacing w:after="40" w:line="312" w:lineRule="auto"/>
+        <w:ind w:left="312" w:hanging="227"/>
+      </w:pPr>
+      <w:r>
+        <w:rPr>
+          <w:rFonts w:ascii="맑은 고딕" w:hAnsi="맑은 고딕" w:eastAsia="맑은 고딕" w:cs="맑은 고딕"/>
+          <w:b/>
+          <w:color w:val="7F4ACB"/>
+          <w:sz w:val="20"/>
+        </w:rPr>
+        <w:t xml:space="preserve">• </w:t>
+      </w:r>
+      <w:r>
+        <w:rPr>
+          <w:rFonts w:ascii="맑은 고딕" w:hAnsi="맑은 고딕" w:eastAsia="맑은 고딕" w:cs="맑은 고딕"/>
+          <w:b w:val="0"/>
+          <w:sz w:val="20"/>
+        </w:rPr>
+        <w:t>[38] substack.com(2026-09-22 접속). TurboQuant: What 3-Bit KV Caches Actually Mean for Your Inference .... themlsurgeon.substack.com, https://themlsurgeon.substack.com/p/turboquant-what-3-bit-kv-caches-actually</w:t>
+      </w:r>
+    </w:p>
+    <w:p>
+      <w:pPr>
+        <w:spacing w:after="40" w:line="312" w:lineRule="auto"/>
+        <w:ind w:left="312" w:hanging="227"/>
+      </w:pPr>
+      <w:r>
+        <w:rPr>
+          <w:rFonts w:ascii="맑은 고딕" w:hAnsi="맑은 고딕" w:eastAsia="맑은 고딕" w:cs="맑은 고딕"/>
+          <w:b/>
+          <w:color w:val="7F4ACB"/>
+          <w:sz w:val="20"/>
+        </w:rPr>
+        <w:t xml:space="preserve">• </w:t>
+      </w:r>
+      <w:r>
+        <w:rPr>
+          <w:rFonts w:ascii="맑은 고딕" w:hAnsi="맑은 고딕" w:eastAsia="맑은 고딕" w:cs="맑은 고딕"/>
+          <w:b w:val="0"/>
+          <w:sz w:val="20"/>
+        </w:rPr>
+        <w:t>[39] lmcache.ai(2026-04-28). Stop Calling It KV Cache: It's Something Much Bigger. blog.lmcache.ai, https://blog.lmcache.ai/en/2026/04/28/stop-calling-it-kv-cache-its-something-much-bigger</w:t>
+      </w:r>
+    </w:p>
+    <w:p>
+      <w:pPr>
+        <w:spacing w:after="40" w:line="312" w:lineRule="auto"/>
+        <w:ind w:left="312" w:hanging="227"/>
+      </w:pPr>
+      <w:r>
+        <w:rPr>
+          <w:rFonts w:ascii="맑은 고딕" w:hAnsi="맑은 고딕" w:eastAsia="맑은 고딕" w:cs="맑은 고딕"/>
+          <w:b/>
+          <w:color w:val="7F4ACB"/>
+          <w:sz w:val="20"/>
+        </w:rPr>
+        <w:t xml:space="preserve">• </w:t>
+      </w:r>
+      <w:r>
+        <w:rPr>
+          <w:rFonts w:ascii="맑은 고딕" w:hAnsi="맑은 고딕" w:eastAsia="맑은 고딕" w:cs="맑은 고딕"/>
+          <w:b w:val="0"/>
+          <w:sz w:val="20"/>
+        </w:rPr>
+        <w:t>[40] WEKA(2026-09-22 접속). AI storage that fixes KV cache bottlenecks. weka.io, https://www.weka.io/article/the-real-state-of-ai-hype-vs-reality</w:t>
+      </w:r>
+    </w:p>
+    <w:p>
+      <w:pPr>
+        <w:spacing w:after="40" w:line="312" w:lineRule="auto"/>
+        <w:ind w:left="312" w:hanging="227"/>
+      </w:pPr>
+      <w:r>
+        <w:rPr>
+          <w:rFonts w:ascii="맑은 고딕" w:hAnsi="맑은 고딕" w:eastAsia="맑은 고딕" w:cs="맑은 고딕"/>
+          <w:b/>
+          <w:color w:val="7F4ACB"/>
+          <w:sz w:val="20"/>
+        </w:rPr>
+        <w:t xml:space="preserve">• </w:t>
+      </w:r>
+      <w:r>
+        <w:rPr>
+          <w:rFonts w:ascii="맑은 고딕" w:hAnsi="맑은 고딕" w:eastAsia="맑은 고딕" w:cs="맑은 고딕"/>
+          <w:b w:val="0"/>
+          <w:sz w:val="20"/>
+        </w:rPr>
+        <w:t>[41] arxiv.org(2026-09-22 접속). [2606.12556] ITME: Inference Tiered Memory Expansion with Disaggregated CXL-Hybrid Memories. ar5iv.labs.arxiv.org, https://ar5iv.labs.arxiv.org/html/2606.12556</w:t>
+      </w:r>
+    </w:p>
+    <w:p>
+      <w:pPr>
+        <w:spacing w:after="40" w:line="312" w:lineRule="auto"/>
+        <w:ind w:left="312" w:hanging="227"/>
+      </w:pPr>
+      <w:r>
+        <w:rPr>
+          <w:rFonts w:ascii="맑은 고딕" w:hAnsi="맑은 고딕" w:eastAsia="맑은 고딕" w:cs="맑은 고딕"/>
+          <w:b/>
+          <w:color w:val="7F4ACB"/>
+          <w:sz w:val="20"/>
+        </w:rPr>
+        <w:t xml:space="preserve">• </w:t>
+      </w:r>
+      <w:r>
+        <w:rPr>
+          <w:rFonts w:ascii="맑은 고딕" w:hAnsi="맑은 고딕" w:eastAsia="맑은 고딕" w:cs="맑은 고딕"/>
+          <w:b w:val="0"/>
+          <w:sz w:val="20"/>
+        </w:rPr>
+        <w:t>[42] decodingdiscontinuity.com(2026-09-22 접속). Why TurboQuant Triggered a $100B Memory Stock Sell-Off. decodingdiscontinuity.com, https://www.decodingdiscontinuity.com/p/turboquant-memory-stock-sell-off-panic-paper-google</w:t>
+      </w:r>
+    </w:p>
+    <w:p>
+      <w:pPr>
+        <w:spacing w:after="40" w:line="312" w:lineRule="auto"/>
+        <w:ind w:left="312" w:hanging="227"/>
+      </w:pPr>
+      <w:r>
+        <w:rPr>
+          <w:rFonts w:ascii="맑은 고딕" w:hAnsi="맑은 고딕" w:eastAsia="맑은 고딕" w:cs="맑은 고딕"/>
+          <w:b/>
+          <w:color w:val="7F4ACB"/>
+          <w:sz w:val="20"/>
+        </w:rPr>
+        <w:t xml:space="preserve">• </w:t>
+      </w:r>
+      <w:r>
+        <w:rPr>
+          <w:rFonts w:ascii="맑은 고딕" w:hAnsi="맑은 고딕" w:eastAsia="맑은 고딕" w:cs="맑은 고딕"/>
+          <w:b w:val="0"/>
+          <w:sz w:val="20"/>
+        </w:rPr>
+        <w:t>[43] serverpartdeals.com(2026-09-22 접속). Google's TurboQuant Just Shook the Memory Market.. serverpartdeals.com, https://serverpartdeals.com/blogs/blog-posts/googles-turboquant-just-shook-the-memory-market</w:t>
+      </w:r>
+    </w:p>
+    <w:p>
+      <w:pPr>
+        <w:spacing w:after="40" w:line="312" w:lineRule="auto"/>
+        <w:ind w:left="312" w:hanging="227"/>
+      </w:pPr>
+      <w:r>
+        <w:rPr>
+          <w:rFonts w:ascii="맑은 고딕" w:hAnsi="맑은 고딕" w:eastAsia="맑은 고딕" w:cs="맑은 고딕"/>
+          <w:b/>
+          <w:color w:val="7F4ACB"/>
+          <w:sz w:val="20"/>
+        </w:rPr>
+        <w:t xml:space="preserve">• </w:t>
+      </w:r>
+      <w:r>
+        <w:rPr>
+          <w:rFonts w:ascii="맑은 고딕" w:hAnsi="맑은 고딕" w:eastAsia="맑은 고딕" w:cs="맑은 고딕"/>
+          <w:b w:val="0"/>
+          <w:sz w:val="20"/>
+        </w:rPr>
+        <w:t>[44] substack.com(2026-09-22 접속). The memory sector has plummeted ,what is the market panicking .... globalsemiresearch.substack.com, https://globalsemiresearch.substack.com/p/the-memory-sector-has-plummeted-what</w:t>
+      </w:r>
+    </w:p>
+    <w:p>
+      <w:pPr>
+        <w:spacing w:after="40" w:line="312" w:lineRule="auto"/>
+        <w:ind w:left="312" w:hanging="227"/>
+      </w:pPr>
+      <w:r>
+        <w:rPr>
+          <w:rFonts w:ascii="맑은 고딕" w:hAnsi="맑은 고딕" w:eastAsia="맑은 고딕" w:cs="맑은 고딕"/>
+          <w:b/>
+          <w:color w:val="7F4ACB"/>
+          <w:sz w:val="20"/>
+        </w:rPr>
+        <w:t xml:space="preserve">• </w:t>
+      </w:r>
+      <w:r>
+        <w:rPr>
+          <w:rFonts w:ascii="맑은 고딕" w:hAnsi="맑은 고딕" w:eastAsia="맑은 고딕" w:cs="맑은 고딕"/>
+          <w:b w:val="0"/>
+          <w:sz w:val="20"/>
+        </w:rPr>
+        <w:t>[45] THE INVESTOR(2026-09-22 접속). Google TurboQuant: Separating hype from reality. theinvestor.co.kr, https://www.theinvestor.co.kr/article/10716199</w:t>
+      </w:r>
+    </w:p>
+    <w:p>
+      <w:pPr>
+        <w:spacing w:after="40" w:line="312" w:lineRule="auto"/>
+        <w:ind w:left="312" w:hanging="227"/>
+      </w:pPr>
+      <w:r>
+        <w:rPr>
+          <w:rFonts w:ascii="맑은 고딕" w:hAnsi="맑은 고딕" w:eastAsia="맑은 고딕" w:cs="맑은 고딕"/>
+          <w:b/>
+          <w:color w:val="7F4ACB"/>
+          <w:sz w:val="20"/>
+        </w:rPr>
+        <w:t xml:space="preserve">• </w:t>
+      </w:r>
+      <w:r>
+        <w:rPr>
+          <w:rFonts w:ascii="맑은 고딕" w:hAnsi="맑은 고딕" w:eastAsia="맑은 고딕" w:cs="맑은 고딕"/>
+          <w:b w:val="0"/>
+          <w:sz w:val="20"/>
+        </w:rPr>
+        <w:t>[46] lighthouse-canton.com(2026-09-22 접속). TurboQuant: Why It Changes Nothing for Memory. lighthouse-canton.com, https://www.lighthouse-canton.com/insights/turboquant-why-it-changes-nothing-for-the-memory-trade-equity-insights</w:t>
+      </w:r>
+    </w:p>
+    <w:p>
+      <w:pPr>
+        <w:spacing w:after="40" w:line="312" w:lineRule="auto"/>
+        <w:ind w:left="312" w:hanging="227"/>
+      </w:pPr>
+      <w:r>
+        <w:rPr>
+          <w:rFonts w:ascii="맑은 고딕" w:hAnsi="맑은 고딕" w:eastAsia="맑은 고딕" w:cs="맑은 고딕"/>
+          <w:b/>
+          <w:color w:val="7F4ACB"/>
+          <w:sz w:val="20"/>
+        </w:rPr>
+        <w:t xml:space="preserve">• </w:t>
+      </w:r>
+      <w:r>
+        <w:rPr>
+          <w:rFonts w:ascii="맑은 고딕" w:hAnsi="맑은 고딕" w:eastAsia="맑은 고딕" w:cs="맑은 고딕"/>
+          <w:b w:val="0"/>
+          <w:sz w:val="20"/>
+        </w:rPr>
+        <w:t>[47] Seeking Alpha(2026-09-22 접속). SK hynix: The Market Is So Skeptical (NASDAQ:SKHY). seekingalpha.com, https://seekingalpha.com/article/4937711-sk-hynix-the-market-is-so-skeptical</w:t>
+      </w:r>
+    </w:p>
+    <w:p>
+      <w:pPr>
+        <w:spacing w:after="40" w:line="312" w:lineRule="auto"/>
+        <w:ind w:left="312" w:hanging="227"/>
+      </w:pPr>
+      <w:r>
+        <w:rPr>
+          <w:rFonts w:ascii="맑은 고딕" w:hAnsi="맑은 고딕" w:eastAsia="맑은 고딕" w:cs="맑은 고딕"/>
+          <w:b/>
+          <w:color w:val="7F4ACB"/>
+          <w:sz w:val="20"/>
+        </w:rPr>
+        <w:t xml:space="preserve">• </w:t>
+      </w:r>
+      <w:r>
+        <w:rPr>
+          <w:rFonts w:ascii="맑은 고딕" w:hAnsi="맑은 고딕" w:eastAsia="맑은 고딕" w:cs="맑은 고딕"/>
+          <w:b w:val="0"/>
+          <w:sz w:val="20"/>
+        </w:rPr>
+        <w:t>[48] medium.com(2026-09-22 접속). KV Cache: Emerging Challenges and Future Trends. medium.com, https://medium.com/foundation-models-deep-dive/kv-cache-guide-part-5-of-5-the-frontier-advanced-challenges-and-future-trends-e4bc20c3ddcc</w:t>
+      </w:r>
+    </w:p>
+    <w:p>
+      <w:pPr>
+        <w:spacing w:after="40" w:line="312" w:lineRule="auto"/>
+        <w:ind w:left="312" w:hanging="227"/>
+      </w:pPr>
+      <w:r>
+        <w:rPr>
+          <w:rFonts w:ascii="맑은 고딕" w:hAnsi="맑은 고딕" w:eastAsia="맑은 고딕" w:cs="맑은 고딕"/>
+          <w:b/>
+          <w:color w:val="7F4ACB"/>
+          <w:sz w:val="20"/>
+        </w:rPr>
+        <w:t xml:space="preserve">• </w:t>
+      </w:r>
+      <w:r>
+        <w:rPr>
+          <w:rFonts w:ascii="맑은 고딕" w:hAnsi="맑은 고딕" w:eastAsia="맑은 고딕" w:cs="맑은 고딕"/>
+          <w:b w:val="0"/>
+          <w:sz w:val="20"/>
+        </w:rPr>
+        <w:t>[49] GitHub(2026-09-22 접속). GitHub - AceCastro28/turboquant-vllm: TurboQuant KV cache compression (Google ICLR 2026) integrated natively into vLLM — 3-bit KV cache with zero accuracy loss. github.com, https://github.com/AceCastro28/turboquant-vllm</w:t>
+      </w:r>
+    </w:p>
+    <w:p>
+      <w:pPr>
+        <w:spacing w:after="40" w:line="312" w:lineRule="auto"/>
+        <w:ind w:left="312" w:hanging="227"/>
+      </w:pPr>
+      <w:r>
+        <w:rPr>
+          <w:rFonts w:ascii="맑은 고딕" w:hAnsi="맑은 고딕" w:eastAsia="맑은 고딕" w:cs="맑은 고딕"/>
+          <w:b/>
+          <w:color w:val="7F4ACB"/>
+          <w:sz w:val="20"/>
+        </w:rPr>
+        <w:t xml:space="preserve">• </w:t>
+      </w:r>
+      <w:r>
+        <w:rPr>
+          <w:rFonts w:ascii="맑은 고딕" w:hAnsi="맑은 고딕" w:eastAsia="맑은 고딕" w:cs="맑은 고딕"/>
+          <w:b w:val="0"/>
+          <w:sz w:val="20"/>
+        </w:rPr>
+        <w:t>[50] spheron.network(2026-09-22 접속). Google TurboQuant: 6x KV Cache Compression for LLM Inference. spheron.network, https://www.spheron.network/blog/google-turboquant-llm-compression-gpu-cloud</w:t>
+      </w:r>
+    </w:p>
+    <w:p>
+      <w:pPr>
+        <w:spacing w:after="40" w:line="312" w:lineRule="auto"/>
+        <w:ind w:left="312" w:hanging="227"/>
+      </w:pPr>
+      <w:r>
+        <w:rPr>
+          <w:rFonts w:ascii="맑은 고딕" w:hAnsi="맑은 고딕" w:eastAsia="맑은 고딕" w:cs="맑은 고딕"/>
+          <w:b/>
+          <w:color w:val="7F4ACB"/>
+          <w:sz w:val="20"/>
+        </w:rPr>
+        <w:t xml:space="preserve">• </w:t>
+      </w:r>
+      <w:r>
+        <w:rPr>
+          <w:rFonts w:ascii="맑은 고딕" w:hAnsi="맑은 고딕" w:eastAsia="맑은 고딕" w:cs="맑은 고딕"/>
+          <w:b w:val="0"/>
+          <w:sz w:val="20"/>
+        </w:rPr>
+        <w:t>[51] vast.ai(2026-09-22 접속). TurboQuant Explained: How It Reduces LLM Memory by 5x and .... vast.ai, https://vast.ai/article/turboquant-explained-llm-memory-inference</w:t>
+      </w:r>
+    </w:p>
+    <w:p>
+      <w:pPr>
+        <w:spacing w:after="40" w:line="312" w:lineRule="auto"/>
+        <w:ind w:left="312" w:hanging="227"/>
+      </w:pPr>
+      <w:r>
+        <w:rPr>
+          <w:rFonts w:ascii="맑은 고딕" w:hAnsi="맑은 고딕" w:eastAsia="맑은 고딕" w:cs="맑은 고딕"/>
+          <w:b/>
+          <w:color w:val="7F4ACB"/>
+          <w:sz w:val="20"/>
+        </w:rPr>
+        <w:t xml:space="preserve">• </w:t>
+      </w:r>
+      <w:r>
+        <w:rPr>
+          <w:rFonts w:ascii="맑은 고딕" w:hAnsi="맑은 고딕" w:eastAsia="맑은 고딕" w:cs="맑은 고딕"/>
+          <w:b w:val="0"/>
+          <w:sz w:val="20"/>
+        </w:rPr>
+        <w:t>[52] Intel(2026-09-22 접속). Enhancing long-context, high-concurrency LLM serving on a 32 GB .... community.intel.com, https://community.intel.com/t5/Blogs/Tech-Innovation/Data-Center/Enhancing-long-context-high-concurrency-LLM-serving-on-a-32-GB/post/1751209</w:t>
+      </w:r>
+    </w:p>
+    <w:p>
+      <w:pPr>
+        <w:spacing w:after="40" w:line="312" w:lineRule="auto"/>
+        <w:ind w:left="312" w:hanging="227"/>
+      </w:pPr>
+      <w:r>
+        <w:rPr>
+          <w:rFonts w:ascii="맑은 고딕" w:hAnsi="맑은 고딕" w:eastAsia="맑은 고딕" w:cs="맑은 고딕"/>
+          <w:b/>
+          <w:color w:val="7F4ACB"/>
+          <w:sz w:val="20"/>
+        </w:rPr>
+        <w:t xml:space="preserve">• </w:t>
+      </w:r>
+      <w:r>
+        <w:rPr>
+          <w:rFonts w:ascii="맑은 고딕" w:hAnsi="맑은 고딕" w:eastAsia="맑은 고딕" w:cs="맑은 고딕"/>
+          <w:b w:val="0"/>
+          <w:sz w:val="20"/>
+        </w:rPr>
+        <w:t>[53] vLLM(2026-05-11). A First Comprehensive Study of TurboQuant: Accuracy and .... vllm.ai, https://vllm.ai/blog/2026-05-11-turboquant</w:t>
+      </w:r>
+    </w:p>
+    <w:p>
+      <w:pPr>
+        <w:spacing w:after="40" w:line="312" w:lineRule="auto"/>
+        <w:ind w:left="312" w:hanging="227"/>
+      </w:pPr>
+      <w:r>
+        <w:rPr>
+          <w:rFonts w:ascii="맑은 고딕" w:hAnsi="맑은 고딕" w:eastAsia="맑은 고딕" w:cs="맑은 고딕"/>
+          <w:b/>
+          <w:color w:val="7F4ACB"/>
+          <w:sz w:val="20"/>
+        </w:rPr>
+        <w:t xml:space="preserve">• </w:t>
+      </w:r>
+      <w:r>
+        <w:rPr>
+          <w:rFonts w:ascii="맑은 고딕" w:hAnsi="맑은 고딕" w:eastAsia="맑은 고딕" w:cs="맑은 고딕"/>
+          <w:b w:val="0"/>
+          <w:sz w:val="20"/>
+        </w:rPr>
+        <w:t>[54] tether.io(2026-09-22 접속). TurboQuant in QVAC SDK 0.12.0: KV-cache quantization for pr…. qvac.tether.io, https://qvac.tether.io/blog/turboquant-in-qvac-sdk-0-12-0-kv-cache-quantization-for-production-local-ai</w:t>
+      </w:r>
+    </w:p>
+    <w:p>
+      <w:pPr>
+        <w:spacing w:after="40" w:line="312" w:lineRule="auto"/>
+        <w:ind w:left="312" w:hanging="227"/>
+      </w:pPr>
+      <w:r>
+        <w:rPr>
+          <w:rFonts w:ascii="맑은 고딕" w:hAnsi="맑은 고딕" w:eastAsia="맑은 고딕" w:cs="맑은 고딕"/>
+          <w:b/>
+          <w:color w:val="7F4ACB"/>
+          <w:sz w:val="20"/>
+        </w:rPr>
+        <w:t xml:space="preserve">• </w:t>
+      </w:r>
+      <w:r>
+        <w:rPr>
+          <w:rFonts w:ascii="맑은 고딕" w:hAnsi="맑은 고딕" w:eastAsia="맑은 고딕" w:cs="맑은 고딕"/>
+          <w:b w:val="0"/>
+          <w:sz w:val="20"/>
+        </w:rPr>
+        <w:t>[55] github.com(2026-09-22 접속). TurboQuant: Near-optimal KV cache quantization for LLM .... github.com, https://github.com/0xsero/turboquant</w:t>
+      </w:r>
+    </w:p>
+    <w:p>
+      <w:pPr>
+        <w:spacing w:after="40" w:line="312" w:lineRule="auto"/>
+        <w:ind w:left="312" w:hanging="227"/>
+      </w:pPr>
+      <w:r>
+        <w:rPr>
+          <w:rFonts w:ascii="맑은 고딕" w:hAnsi="맑은 고딕" w:eastAsia="맑은 고딕" w:cs="맑은 고딕"/>
+          <w:b/>
+          <w:color w:val="7F4ACB"/>
+          <w:sz w:val="20"/>
+        </w:rPr>
+        <w:t xml:space="preserve">• </w:t>
+      </w:r>
+      <w:r>
+        <w:rPr>
+          <w:rFonts w:ascii="맑은 고딕" w:hAnsi="맑은 고딕" w:eastAsia="맑은 고딕" w:cs="맑은 고딕"/>
+          <w:b w:val="0"/>
+          <w:sz w:val="20"/>
+        </w:rPr>
+        <w:t>[56] futurumgroup.com(2026-09-22 접속). SK Hynix ADR Issuance Strategy. futurumgroup.com, https://futurumgroup.com/insights/will-sk-hynixs-record-265bn-adr-issuance-help-close-its-capex-intensity-gap</w:t>
+      </w:r>
+    </w:p>
+    <w:p>
+      <w:pPr>
+        <w:spacing w:after="40" w:line="312" w:lineRule="auto"/>
+        <w:ind w:left="312" w:hanging="227"/>
+      </w:pPr>
+      <w:r>
+        <w:rPr>
+          <w:rFonts w:ascii="맑은 고딕" w:hAnsi="맑은 고딕" w:eastAsia="맑은 고딕" w:cs="맑은 고딕"/>
+          <w:b/>
+          <w:color w:val="7F4ACB"/>
+          <w:sz w:val="20"/>
+        </w:rPr>
+        <w:t xml:space="preserve">• </w:t>
+      </w:r>
+      <w:r>
+        <w:rPr>
+          <w:rFonts w:ascii="맑은 고딕" w:hAnsi="맑은 고딕" w:eastAsia="맑은 고딕" w:cs="맑은 고딕"/>
+          <w:b w:val="0"/>
+          <w:sz w:val="20"/>
+        </w:rPr>
+        <w:t>[57] everpuredata.com(2026-09-22 접속). TurboQuant Compresses KV Cache by 5X. Does That Mean You .... blog.everpuredata.com, https://blog.everpuredata.com/purely-technical/turboquant-compresses-kv-cache-by-5x-does-that-mean-you-need-less-memory</w:t>
+      </w:r>
+    </w:p>
+    <w:p>
+      <w:pPr>
+        <w:spacing w:after="40" w:line="312" w:lineRule="auto"/>
+        <w:ind w:left="312" w:hanging="227"/>
+      </w:pPr>
+      <w:r>
+        <w:rPr>
+          <w:rFonts w:ascii="맑은 고딕" w:hAnsi="맑은 고딕" w:eastAsia="맑은 고딕" w:cs="맑은 고딕"/>
+          <w:b/>
+          <w:color w:val="7F4ACB"/>
+          <w:sz w:val="20"/>
+        </w:rPr>
+        <w:t xml:space="preserve">• </w:t>
+      </w:r>
+      <w:r>
+        <w:rPr>
+          <w:rFonts w:ascii="맑은 고딕" w:hAnsi="맑은 고딕" w:eastAsia="맑은 고딕" w:cs="맑은 고딕"/>
+          <w:b w:val="0"/>
+          <w:sz w:val="20"/>
+        </w:rPr>
+        <w:t>[58] arxiv.org(2026-09-22 접속). A KV Cache Framework for Multi-Turn LLM Serving with CXL-Hybrid .... arxiv.org, https://arxiv.org/html/2607.18141v1</w:t>
       </w:r>
     </w:p>
     <w:sectPr>

</xml_diff>